<commit_message>
feat: finalize fair qwen comparison and report artifacts
</commit_message>
<xml_diff>
--- a/docs/final_report_pack/LayerForge_X_Final_Report_2026_04_22.docx
+++ b/docs/final_report_pack/LayerForge_X_Final_Report_2026_04_22.docx
@@ -1003,7 +1003,7 @@
               <w:pStyle w:val="Compact"/>
             </w:pPr>
             <w:r>
-              <w:t xml:space="preserve">Qwen raw (4)</w:t>
+              <w:t xml:space="preserve">LayerForge native</w:t>
             </w:r>
           </w:p>
         </w:tc>
@@ -1026,7 +1026,7 @@
               <w:pStyle w:val="Compact"/>
             </w:pPr>
             <w:r>
-              <w:t xml:space="preserve">no</w:t>
+              <w:t xml:space="preserve">yes</w:t>
             </w:r>
           </w:p>
         </w:tc>
@@ -1038,7 +1038,7 @@
               <w:jc w:val="right"/>
             </w:pPr>
             <w:r>
-              <w:t xml:space="preserve">29.0757</w:t>
+              <w:t xml:space="preserve">27.3438</w:t>
             </w:r>
           </w:p>
         </w:tc>
@@ -1050,7 +1050,7 @@
               <w:jc w:val="right"/>
             </w:pPr>
             <w:r>
-              <w:t xml:space="preserve">0.8850</w:t>
+              <w:t xml:space="preserve">0.9464</w:t>
             </w:r>
           </w:p>
         </w:tc>
@@ -1063,7 +1063,7 @@
               <w:pStyle w:val="Compact"/>
             </w:pPr>
             <w:r>
-              <w:t xml:space="preserve">Qwen + LayerForge graph (4)</w:t>
+              <w:t xml:space="preserve">Qwen raw (4)</w:t>
             </w:r>
           </w:p>
         </w:tc>
@@ -1086,6 +1086,66 @@
               <w:pStyle w:val="Compact"/>
             </w:pPr>
             <w:r>
+              <w:t xml:space="preserve">no</w:t>
+            </w:r>
+          </w:p>
+        </w:tc>
+        <w:tc>
+          <w:tcPr/>
+          <w:p>
+            <w:pPr>
+              <w:pStyle w:val="Compact"/>
+              <w:jc w:val="right"/>
+            </w:pPr>
+            <w:r>
+              <w:t xml:space="preserve">29.0757</w:t>
+            </w:r>
+          </w:p>
+        </w:tc>
+        <w:tc>
+          <w:tcPr/>
+          <w:p>
+            <w:pPr>
+              <w:pStyle w:val="Compact"/>
+              <w:jc w:val="right"/>
+            </w:pPr>
+            <w:r>
+              <w:t xml:space="preserve">0.8850</w:t>
+            </w:r>
+          </w:p>
+        </w:tc>
+      </w:tr>
+      <w:tr>
+        <w:tc>
+          <w:tcPr/>
+          <w:p>
+            <w:pPr>
+              <w:pStyle w:val="Compact"/>
+            </w:pPr>
+            <w:r>
+              <w:t xml:space="preserve">Qwen + LayerForge graph preserve (4)</w:t>
+            </w:r>
+          </w:p>
+        </w:tc>
+        <w:tc>
+          <w:tcPr/>
+          <w:p>
+            <w:pPr>
+              <w:pStyle w:val="Compact"/>
+              <w:jc w:val="right"/>
+            </w:pPr>
+            <w:r>
+              <w:t xml:space="preserve">5</w:t>
+            </w:r>
+          </w:p>
+        </w:tc>
+        <w:tc>
+          <w:tcPr/>
+          <w:p>
+            <w:pPr>
+              <w:pStyle w:val="Compact"/>
+            </w:pPr>
+            <w:r>
               <w:t xml:space="preserve">yes</w:t>
             </w:r>
           </w:p>
@@ -1098,7 +1158,67 @@
               <w:jc w:val="right"/>
             </w:pPr>
             <w:r>
-              <w:t xml:space="preserve">28.5408</w:t>
+              <w:t xml:space="preserve">28.5539</w:t>
+            </w:r>
+          </w:p>
+        </w:tc>
+        <w:tc>
+          <w:tcPr/>
+          <w:p>
+            <w:pPr>
+              <w:pStyle w:val="Compact"/>
+              <w:jc w:val="right"/>
+            </w:pPr>
+            <w:r>
+              <w:t xml:space="preserve">0.8638</w:t>
+            </w:r>
+          </w:p>
+        </w:tc>
+      </w:tr>
+      <w:tr>
+        <w:tc>
+          <w:tcPr/>
+          <w:p>
+            <w:pPr>
+              <w:pStyle w:val="Compact"/>
+            </w:pPr>
+            <w:r>
+              <w:t xml:space="preserve">Qwen + LayerForge graph reorder (4)</w:t>
+            </w:r>
+          </w:p>
+        </w:tc>
+        <w:tc>
+          <w:tcPr/>
+          <w:p>
+            <w:pPr>
+              <w:pStyle w:val="Compact"/>
+              <w:jc w:val="right"/>
+            </w:pPr>
+            <w:r>
+              <w:t xml:space="preserve">5</w:t>
+            </w:r>
+          </w:p>
+        </w:tc>
+        <w:tc>
+          <w:tcPr/>
+          <w:p>
+            <w:pPr>
+              <w:pStyle w:val="Compact"/>
+            </w:pPr>
+            <w:r>
+              <w:t xml:space="preserve">yes</w:t>
+            </w:r>
+          </w:p>
+        </w:tc>
+        <w:tc>
+          <w:tcPr/>
+          <w:p>
+            <w:pPr>
+              <w:pStyle w:val="Compact"/>
+              <w:jc w:val="right"/>
+            </w:pPr>
+            <w:r>
+              <w:t xml:space="preserve">28.5397</w:t>
             </w:r>
           </w:p>
         </w:tc>
@@ -1235,7 +1355,7 @@
               <w:jc w:val="right"/>
             </w:pPr>
             <w:r>
-              <w:t xml:space="preserve">411</w:t>
+              <w:t xml:space="preserve">4853</w:t>
             </w:r>
           </w:p>
         </w:tc>
@@ -1259,7 +1379,7 @@
               <w:jc w:val="right"/>
             </w:pPr>
             <w:r>
-              <w:t xml:space="preserve">0.0006</w:t>
+              <w:t xml:space="preserve">0.3529</w:t>
             </w:r>
           </w:p>
         </w:tc>
@@ -1282,7 +1402,7 @@
         </w:numPr>
       </w:pPr>
       <w:r>
-        <w:t xml:space="preserve">raw Qwen remains the stronger pure pixel-fidelity baseline on the measured five-image sweep;</w:t>
+        <w:t xml:space="preserve">raw Qwen remains the stronger compact pure-PSNR baseline on the measured five-image sweep;</w:t>
       </w:r>
     </w:p>
     <w:p>
@@ -1294,7 +1414,7 @@
         </w:numPr>
       </w:pPr>
       <w:r>
-        <w:t xml:space="preserve">the hybrid row should be presented as a structured-representation complement that adds graphs, ordering, and amodal metadata;</w:t>
+        <w:t xml:space="preserve">native LayerForge now has the strongest mean SSIM on the same images, at the cost of a much larger stack;</w:t>
       </w:r>
     </w:p>
     <w:p>
@@ -1306,7 +1426,34 @@
         </w:numPr>
       </w:pPr>
       <w:r>
-        <w:t xml:space="preserve">the associated-effect path now has a real exported demo artifact, but the measured IoU is still weak, so it must be framed as an early heuristic rather than a solved component.</w:t>
+        <w:t xml:space="preserve">the</w:t>
+      </w:r>
+      <w:r>
+        <w:t xml:space="preserve"> </w:t>
+      </w:r>
+      <w:r>
+        <w:rPr>
+          <w:rStyle w:val="VerbatimChar"/>
+        </w:rPr>
+        <w:t xml:space="preserve">Qwen + graph preserve</w:t>
+      </w:r>
+      <w:r>
+        <w:t xml:space="preserve"> </w:t>
+      </w:r>
+      <w:r>
+        <w:t xml:space="preserve">row is the fair metadata-first hybrid comparison because it keeps the interpreted Qwen stack and adds graphs, ordering metadata, amodal masks, and intrinsic artifacts;</w:t>
+      </w:r>
+    </w:p>
+    <w:p>
+      <w:pPr>
+        <w:pStyle w:val="Compact"/>
+        <w:numPr>
+          <w:ilvl w:val="0"/>
+          <w:numId w:val="1003"/>
+        </w:numPr>
+      </w:pPr>
+      <w:r>
+        <w:t xml:space="preserve">the associated-effect path now has a real exported demo artifact with a materially improved clean-reference rerun, but it still must be framed as an early heuristic rather than a solved component.</w:t>
       </w:r>
     </w:p>
     <w:bookmarkEnd w:id="68"/>

</xml_diff>

<commit_message>
feat: harden frontier editability evaluation
</commit_message>
<xml_diff>
--- a/docs/final_report_pack/LayerForge_X_Final_Report_2026_04_22.docx
+++ b/docs/final_report_pack/LayerForge_X_Final_Report_2026_04_22.docx
@@ -1540,19 +1540,19 @@
               <w:jc w:val="right"/>
             </w:pPr>
             <w:r>
-              <w:t xml:space="preserve">0.6597</w:t>
-            </w:r>
-          </w:p>
-        </w:tc>
-        <w:tc>
-          <w:tcPr/>
-          <w:p>
-            <w:pPr>
-              <w:pStyle w:val="Compact"/>
-              <w:jc w:val="right"/>
-            </w:pPr>
-            <w:r>
-              <w:t xml:space="preserve">3</w:t>
+              <w:t xml:space="preserve">0.6283</w:t>
+            </w:r>
+          </w:p>
+        </w:tc>
+        <w:tc>
+          <w:tcPr/>
+          <w:p>
+            <w:pPr>
+              <w:pStyle w:val="Compact"/>
+              <w:jc w:val="right"/>
+            </w:pPr>
+            <w:r>
+              <w:t xml:space="preserve">4</w:t>
             </w:r>
           </w:p>
         </w:tc>
@@ -1613,19 +1613,19 @@
               <w:jc w:val="right"/>
             </w:pPr>
             <w:r>
-              <w:t xml:space="preserve">0.5050</w:t>
-            </w:r>
-          </w:p>
-        </w:tc>
-        <w:tc>
-          <w:tcPr/>
-          <w:p>
-            <w:pPr>
-              <w:pStyle w:val="Compact"/>
-              <w:jc w:val="right"/>
-            </w:pPr>
-            <w:r>
-              <w:t xml:space="preserve">1</w:t>
+              <w:t xml:space="preserve">0.4783</w:t>
+            </w:r>
+          </w:p>
+        </w:tc>
+        <w:tc>
+          <w:tcPr/>
+          <w:p>
+            <w:pPr>
+              <w:pStyle w:val="Compact"/>
+              <w:jc w:val="right"/>
+            </w:pPr>
+            <w:r>
+              <w:t xml:space="preserve">0</w:t>
             </w:r>
           </w:p>
         </w:tc>
@@ -1686,7 +1686,7 @@
               <w:jc w:val="right"/>
             </w:pPr>
             <w:r>
-              <w:t xml:space="preserve">0.2530</w:t>
+              <w:t xml:space="preserve">0.2541</w:t>
             </w:r>
           </w:p>
         </w:tc>
@@ -1759,19 +1759,19 @@
               <w:jc w:val="right"/>
             </w:pPr>
             <w:r>
-              <w:t xml:space="preserve">0.4951</w:t>
-            </w:r>
-          </w:p>
-        </w:tc>
-        <w:tc>
-          <w:tcPr/>
-          <w:p>
-            <w:pPr>
-              <w:pStyle w:val="Compact"/>
-              <w:jc w:val="right"/>
-            </w:pPr>
-            <w:r>
-              <w:t xml:space="preserve">1</w:t>
+              <w:t xml:space="preserve">0.5259</w:t>
+            </w:r>
+          </w:p>
+        </w:tc>
+        <w:tc>
+          <w:tcPr/>
+          <w:p>
+            <w:pPr>
+              <w:pStyle w:val="Compact"/>
+              <w:jc w:val="right"/>
+            </w:pPr>
+            <w:r>
+              <w:t xml:space="preserve">0</w:t>
             </w:r>
           </w:p>
         </w:tc>
@@ -1832,19 +1832,557 @@
               <w:jc w:val="right"/>
             </w:pPr>
             <w:r>
-              <w:t xml:space="preserve">0.4949</w:t>
-            </w:r>
-          </w:p>
-        </w:tc>
-        <w:tc>
-          <w:tcPr/>
-          <w:p>
-            <w:pPr>
-              <w:pStyle w:val="Compact"/>
-              <w:jc w:val="right"/>
-            </w:pPr>
-            <w:r>
-              <w:t xml:space="preserve">0</w:t>
+              <w:t xml:space="preserve">0.5251</w:t>
+            </w:r>
+          </w:p>
+        </w:tc>
+        <w:tc>
+          <w:tcPr/>
+          <w:p>
+            <w:pPr>
+              <w:pStyle w:val="Compact"/>
+              <w:jc w:val="right"/>
+            </w:pPr>
+            <w:r>
+              <w:t xml:space="preserve">1</w:t>
+            </w:r>
+          </w:p>
+        </w:tc>
+      </w:tr>
+    </w:tbl>
+    <w:p>
+      <w:pPr>
+        <w:pStyle w:val="BodyText"/>
+      </w:pPr>
+      <w:r>
+        <w:t xml:space="preserve">Five-image editability suite:</w:t>
+      </w:r>
+    </w:p>
+    <w:tbl>
+      <w:tblPr>
+        <w:tblStyle w:val="Table"/>
+        <w:tblW w:type="pct" w:w="5000"/>
+        <w:tblLayout w:type="fixed"/>
+        <w:tblLook w:firstRow="1" w:lastRow="0" w:firstColumn="0" w:lastColumn="0" w:noHBand="0" w:noVBand="0" w:val="0020"/>
+      </w:tblPr>
+      <w:tblGrid>
+        <w:gridCol w:w="880"/>
+        <w:gridCol w:w="1173"/>
+        <w:gridCol w:w="1173"/>
+        <w:gridCol w:w="1173"/>
+        <w:gridCol w:w="1173"/>
+        <w:gridCol w:w="1173"/>
+        <w:gridCol w:w="1173"/>
+      </w:tblGrid>
+      <w:tr>
+        <w:trPr>
+          <w:tblHeader w:val="on"/>
+        </w:trPr>
+        <w:tc>
+          <w:tcPr/>
+          <w:p>
+            <w:pPr>
+              <w:pStyle w:val="Compact"/>
+            </w:pPr>
+            <w:r>
+              <w:t xml:space="preserve">Method</w:t>
+            </w:r>
+          </w:p>
+        </w:tc>
+        <w:tc>
+          <w:tcPr/>
+          <w:p>
+            <w:pPr>
+              <w:pStyle w:val="Compact"/>
+              <w:jc w:val="right"/>
+            </w:pPr>
+            <w:r>
+              <w:t xml:space="preserve">Remove response</w:t>
+            </w:r>
+          </w:p>
+        </w:tc>
+        <w:tc>
+          <w:tcPr/>
+          <w:p>
+            <w:pPr>
+              <w:pStyle w:val="Compact"/>
+              <w:jc w:val="right"/>
+            </w:pPr>
+            <w:r>
+              <w:t xml:space="preserve">Move response</w:t>
+            </w:r>
+          </w:p>
+        </w:tc>
+        <w:tc>
+          <w:tcPr/>
+          <w:p>
+            <w:pPr>
+              <w:pStyle w:val="Compact"/>
+              <w:jc w:val="right"/>
+            </w:pPr>
+            <w:r>
+              <w:t xml:space="preserve">Recolor response</w:t>
+            </w:r>
+          </w:p>
+        </w:tc>
+        <w:tc>
+          <w:tcPr/>
+          <w:p>
+            <w:pPr>
+              <w:pStyle w:val="Compact"/>
+              <w:jc w:val="right"/>
+            </w:pPr>
+            <w:r>
+              <w:t xml:space="preserve">Edit success</w:t>
+            </w:r>
+          </w:p>
+        </w:tc>
+        <w:tc>
+          <w:tcPr/>
+          <w:p>
+            <w:pPr>
+              <w:pStyle w:val="Compact"/>
+              <w:jc w:val="right"/>
+            </w:pPr>
+            <w:r>
+              <w:t xml:space="preserve">Non-edit preservation</w:t>
+            </w:r>
+          </w:p>
+        </w:tc>
+        <w:tc>
+          <w:tcPr/>
+          <w:p>
+            <w:pPr>
+              <w:pStyle w:val="Compact"/>
+              <w:jc w:val="right"/>
+            </w:pPr>
+            <w:r>
+              <w:t xml:space="preserve">Background hole ratio</w:t>
+            </w:r>
+          </w:p>
+        </w:tc>
+      </w:tr>
+      <w:tr>
+        <w:tc>
+          <w:tcPr/>
+          <w:p>
+            <w:pPr>
+              <w:pStyle w:val="Compact"/>
+            </w:pPr>
+            <w:r>
+              <w:t xml:space="preserve">LayerForge native</w:t>
+            </w:r>
+          </w:p>
+        </w:tc>
+        <w:tc>
+          <w:tcPr/>
+          <w:p>
+            <w:pPr>
+              <w:pStyle w:val="Compact"/>
+              <w:jc w:val="right"/>
+            </w:pPr>
+            <w:r>
+              <w:t xml:space="preserve">0.1097</w:t>
+            </w:r>
+          </w:p>
+        </w:tc>
+        <w:tc>
+          <w:tcPr/>
+          <w:p>
+            <w:pPr>
+              <w:pStyle w:val="Compact"/>
+              <w:jc w:val="right"/>
+            </w:pPr>
+            <w:r>
+              <w:t xml:space="preserve">0.1011</w:t>
+            </w:r>
+          </w:p>
+        </w:tc>
+        <w:tc>
+          <w:tcPr/>
+          <w:p>
+            <w:pPr>
+              <w:pStyle w:val="Compact"/>
+              <w:jc w:val="right"/>
+            </w:pPr>
+            <w:r>
+              <w:t xml:space="preserve">0.1220</w:t>
+            </w:r>
+          </w:p>
+        </w:tc>
+        <w:tc>
+          <w:tcPr/>
+          <w:p>
+            <w:pPr>
+              <w:pStyle w:val="Compact"/>
+              <w:jc w:val="right"/>
+            </w:pPr>
+            <w:r>
+              <w:t xml:space="preserve">0.6695</w:t>
+            </w:r>
+          </w:p>
+        </w:tc>
+        <w:tc>
+          <w:tcPr/>
+          <w:p>
+            <w:pPr>
+              <w:pStyle w:val="Compact"/>
+              <w:jc w:val="right"/>
+            </w:pPr>
+            <w:r>
+              <w:t xml:space="preserve">0.9999</w:t>
+            </w:r>
+          </w:p>
+        </w:tc>
+        <w:tc>
+          <w:tcPr/>
+          <w:p>
+            <w:pPr>
+              <w:pStyle w:val="Compact"/>
+              <w:jc w:val="right"/>
+            </w:pPr>
+            <w:r>
+              <w:t xml:space="preserve">0.4860</w:t>
+            </w:r>
+          </w:p>
+        </w:tc>
+      </w:tr>
+      <w:tr>
+        <w:tc>
+          <w:tcPr/>
+          <w:p>
+            <w:pPr>
+              <w:pStyle w:val="Compact"/>
+            </w:pPr>
+            <w:r>
+              <w:t xml:space="preserve">LayerForge peeling</w:t>
+            </w:r>
+          </w:p>
+        </w:tc>
+        <w:tc>
+          <w:tcPr/>
+          <w:p>
+            <w:pPr>
+              <w:pStyle w:val="Compact"/>
+              <w:jc w:val="right"/>
+            </w:pPr>
+            <w:r>
+              <w:t xml:space="preserve">0.1019</w:t>
+            </w:r>
+          </w:p>
+        </w:tc>
+        <w:tc>
+          <w:tcPr/>
+          <w:p>
+            <w:pPr>
+              <w:pStyle w:val="Compact"/>
+              <w:jc w:val="right"/>
+            </w:pPr>
+            <w:r>
+              <w:t xml:space="preserve">0.0808</w:t>
+            </w:r>
+          </w:p>
+        </w:tc>
+        <w:tc>
+          <w:tcPr/>
+          <w:p>
+            <w:pPr>
+              <w:pStyle w:val="Compact"/>
+              <w:jc w:val="right"/>
+            </w:pPr>
+            <w:r>
+              <w:t xml:space="preserve">0.1082</w:t>
+            </w:r>
+          </w:p>
+        </w:tc>
+        <w:tc>
+          <w:tcPr/>
+          <w:p>
+            <w:pPr>
+              <w:pStyle w:val="Compact"/>
+              <w:jc w:val="right"/>
+            </w:pPr>
+            <w:r>
+              <w:t xml:space="preserve">0.5865</w:t>
+            </w:r>
+          </w:p>
+        </w:tc>
+        <w:tc>
+          <w:tcPr/>
+          <w:p>
+            <w:pPr>
+              <w:pStyle w:val="Compact"/>
+              <w:jc w:val="right"/>
+            </w:pPr>
+            <w:r>
+              <w:t xml:space="preserve">1.0000</w:t>
+            </w:r>
+          </w:p>
+        </w:tc>
+        <w:tc>
+          <w:tcPr/>
+          <w:p>
+            <w:pPr>
+              <w:pStyle w:val="Compact"/>
+              <w:jc w:val="right"/>
+            </w:pPr>
+            <w:r>
+              <w:t xml:space="preserve">0.5433</w:t>
+            </w:r>
+          </w:p>
+        </w:tc>
+      </w:tr>
+      <w:tr>
+        <w:tc>
+          <w:tcPr/>
+          <w:p>
+            <w:pPr>
+              <w:pStyle w:val="Compact"/>
+            </w:pPr>
+            <w:r>
+              <w:t xml:space="preserve">Qwen raw (4)</w:t>
+            </w:r>
+          </w:p>
+        </w:tc>
+        <w:tc>
+          <w:tcPr/>
+          <w:p>
+            <w:pPr>
+              <w:pStyle w:val="Compact"/>
+              <w:jc w:val="right"/>
+            </w:pPr>
+            <w:r>
+              <w:t xml:space="preserve">0.0002</w:t>
+            </w:r>
+          </w:p>
+        </w:tc>
+        <w:tc>
+          <w:tcPr/>
+          <w:p>
+            <w:pPr>
+              <w:pStyle w:val="Compact"/>
+              <w:jc w:val="right"/>
+            </w:pPr>
+            <w:r>
+              <w:t xml:space="preserve">0.0001</w:t>
+            </w:r>
+          </w:p>
+        </w:tc>
+        <w:tc>
+          <w:tcPr/>
+          <w:p>
+            <w:pPr>
+              <w:pStyle w:val="Compact"/>
+              <w:jc w:val="right"/>
+            </w:pPr>
+            <w:r>
+              <w:t xml:space="preserve">0.0001</w:t>
+            </w:r>
+          </w:p>
+        </w:tc>
+        <w:tc>
+          <w:tcPr/>
+          <w:p>
+            <w:pPr>
+              <w:pStyle w:val="Compact"/>
+              <w:jc w:val="right"/>
+            </w:pPr>
+            <w:r>
+              <w:t xml:space="preserve">0.1506</w:t>
+            </w:r>
+          </w:p>
+        </w:tc>
+        <w:tc>
+          <w:tcPr/>
+          <w:p>
+            <w:pPr>
+              <w:pStyle w:val="Compact"/>
+              <w:jc w:val="right"/>
+            </w:pPr>
+            <w:r>
+              <w:t xml:space="preserve">1.0000</w:t>
+            </w:r>
+          </w:p>
+        </w:tc>
+        <w:tc>
+          <w:tcPr/>
+          <w:p>
+            <w:pPr>
+              <w:pStyle w:val="Compact"/>
+              <w:jc w:val="right"/>
+            </w:pPr>
+            <w:r>
+              <w:t xml:space="preserve">1.0000</w:t>
+            </w:r>
+          </w:p>
+        </w:tc>
+      </w:tr>
+      <w:tr>
+        <w:tc>
+          <w:tcPr/>
+          <w:p>
+            <w:pPr>
+              <w:pStyle w:val="Compact"/>
+            </w:pPr>
+            <w:r>
+              <w:t xml:space="preserve">Qwen + graph preserve (4)</w:t>
+            </w:r>
+          </w:p>
+        </w:tc>
+        <w:tc>
+          <w:tcPr/>
+          <w:p>
+            <w:pPr>
+              <w:pStyle w:val="Compact"/>
+              <w:jc w:val="right"/>
+            </w:pPr>
+            <w:r>
+              <w:t xml:space="preserve">0.2083</w:t>
+            </w:r>
+          </w:p>
+        </w:tc>
+        <w:tc>
+          <w:tcPr/>
+          <w:p>
+            <w:pPr>
+              <w:pStyle w:val="Compact"/>
+              <w:jc w:val="right"/>
+            </w:pPr>
+            <w:r>
+              <w:t xml:space="preserve">0.1509</w:t>
+            </w:r>
+          </w:p>
+        </w:tc>
+        <w:tc>
+          <w:tcPr/>
+          <w:p>
+            <w:pPr>
+              <w:pStyle w:val="Compact"/>
+              <w:jc w:val="right"/>
+            </w:pPr>
+            <w:r>
+              <w:t xml:space="preserve">0.1421</w:t>
+            </w:r>
+          </w:p>
+        </w:tc>
+        <w:tc>
+          <w:tcPr/>
+          <w:p>
+            <w:pPr>
+              <w:pStyle w:val="Compact"/>
+              <w:jc w:val="right"/>
+            </w:pPr>
+            <w:r>
+              <w:t xml:space="preserve">0.8633</w:t>
+            </w:r>
+          </w:p>
+        </w:tc>
+        <w:tc>
+          <w:tcPr/>
+          <w:p>
+            <w:pPr>
+              <w:pStyle w:val="Compact"/>
+              <w:jc w:val="right"/>
+            </w:pPr>
+            <w:r>
+              <w:t xml:space="preserve">0.9887</w:t>
+            </w:r>
+          </w:p>
+        </w:tc>
+        <w:tc>
+          <w:tcPr/>
+          <w:p>
+            <w:pPr>
+              <w:pStyle w:val="Compact"/>
+              <w:jc w:val="right"/>
+            </w:pPr>
+            <w:r>
+              <w:t xml:space="preserve">0.1420</w:t>
+            </w:r>
+          </w:p>
+        </w:tc>
+      </w:tr>
+      <w:tr>
+        <w:tc>
+          <w:tcPr/>
+          <w:p>
+            <w:pPr>
+              <w:pStyle w:val="Compact"/>
+            </w:pPr>
+            <w:r>
+              <w:t xml:space="preserve">Qwen + graph reorder (4)</w:t>
+            </w:r>
+          </w:p>
+        </w:tc>
+        <w:tc>
+          <w:tcPr/>
+          <w:p>
+            <w:pPr>
+              <w:pStyle w:val="Compact"/>
+              <w:jc w:val="right"/>
+            </w:pPr>
+            <w:r>
+              <w:t xml:space="preserve">0.2080</w:t>
+            </w:r>
+          </w:p>
+        </w:tc>
+        <w:tc>
+          <w:tcPr/>
+          <w:p>
+            <w:pPr>
+              <w:pStyle w:val="Compact"/>
+              <w:jc w:val="right"/>
+            </w:pPr>
+            <w:r>
+              <w:t xml:space="preserve">0.1491</w:t>
+            </w:r>
+          </w:p>
+        </w:tc>
+        <w:tc>
+          <w:tcPr/>
+          <w:p>
+            <w:pPr>
+              <w:pStyle w:val="Compact"/>
+              <w:jc w:val="right"/>
+            </w:pPr>
+            <w:r>
+              <w:t xml:space="preserve">0.1421</w:t>
+            </w:r>
+          </w:p>
+        </w:tc>
+        <w:tc>
+          <w:tcPr/>
+          <w:p>
+            <w:pPr>
+              <w:pStyle w:val="Compact"/>
+              <w:jc w:val="right"/>
+            </w:pPr>
+            <w:r>
+              <w:t xml:space="preserve">0.8607</w:t>
+            </w:r>
+          </w:p>
+        </w:tc>
+        <w:tc>
+          <w:tcPr/>
+          <w:p>
+            <w:pPr>
+              <w:pStyle w:val="Compact"/>
+              <w:jc w:val="right"/>
+            </w:pPr>
+            <w:r>
+              <w:t xml:space="preserve">0.9886</w:t>
+            </w:r>
+          </w:p>
+        </w:tc>
+        <w:tc>
+          <w:tcPr/>
+          <w:p>
+            <w:pPr>
+              <w:pStyle w:val="Compact"/>
+              <w:jc w:val="right"/>
+            </w:pPr>
+            <w:r>
+              <w:t xml:space="preserve">0.1427</w:t>
             </w:r>
           </w:p>
         </w:tc>
@@ -1915,13 +2453,13 @@
         <w:rPr>
           <w:rStyle w:val="VerbatimChar"/>
         </w:rPr>
-        <w:t xml:space="preserve">3/5</w:t>
+        <w:t xml:space="preserve">4/5</w:t>
       </w:r>
       <w:r>
         <w:t xml:space="preserve"> </w:t>
       </w:r>
       <w:r>
-        <w:t xml:space="preserve">images,</w:t>
+        <w:t xml:space="preserve">images, with</w:t>
       </w:r>
       <w:r>
         <w:t xml:space="preserve"> </w:t>
@@ -1930,28 +2468,13 @@
         <w:rPr>
           <w:rStyle w:val="VerbatimChar"/>
         </w:rPr>
-        <w:t xml:space="preserve">LayerForge peeling</w:t>
+        <w:t xml:space="preserve">Qwen + graph reorder</w:t>
       </w:r>
       <w:r>
         <w:t xml:space="preserve"> </w:t>
       </w:r>
       <w:r>
-        <w:t xml:space="preserve">for the truck scene, and</w:t>
-      </w:r>
-      <w:r>
-        <w:t xml:space="preserve"> </w:t>
-      </w:r>
-      <w:r>
-        <w:rPr>
-          <w:rStyle w:val="VerbatimChar"/>
-        </w:rPr>
-        <w:t xml:space="preserve">Qwen + graph preserve</w:t>
-      </w:r>
-      <w:r>
-        <w:t xml:space="preserve"> </w:t>
-      </w:r>
-      <w:r>
-        <w:t xml:space="preserve">for the synthetic scene;</w:t>
+        <w:t xml:space="preserve">winning the cat scene;</w:t>
       </w:r>
     </w:p>
     <w:p>
@@ -1979,6 +2502,18 @@
       </w:r>
       <w:r>
         <w:t xml:space="preserve">row is the fair metadata-first hybrid comparison because it keeps the interpreted Qwen stack and adds graphs, ordering metadata, amodal masks, and intrinsic artifacts;</w:t>
+      </w:r>
+    </w:p>
+    <w:p>
+      <w:pPr>
+        <w:pStyle w:val="Compact"/>
+        <w:numPr>
+          <w:ilvl w:val="0"/>
+          <w:numId w:val="1003"/>
+        </w:numPr>
+      </w:pPr>
+      <w:r>
+        <w:t xml:space="preserve">the editability suite now acts as the anti-triviality guardrail for the frontier selector, which is why raw Qwen’s object-removal response stays near zero despite reasonable recomposition scores;</w:t>
       </w:r>
     </w:p>
     <w:p>
@@ -12284,7 +12819,7 @@
         <w:pStyle w:val="FirstParagraph"/>
       </w:pPr>
       <w:r>
-        <w:t xml:space="preserve">Each candidate is scored after it actually runs. The current self-evaluation stage is intentionally heuristic and explicit rather than pretending to be a learned black box.</w:t>
+        <w:t xml:space="preserve">Each candidate is scored after it actually runs. The current self-evaluation stage is intentionally explicit rather than pretending to be a learned black box.</w:t>
       </w:r>
     </w:p>
     <w:p>
@@ -12312,7 +12847,7 @@
         <w:rPr>
           <w:rStyle w:val="VerbatimChar"/>
         </w:rPr>
-        <w:t xml:space="preserve">graph / structure availability</w:t>
+        <w:t xml:space="preserve">edit-preservation and anti-trivial copy penalties</w:t>
       </w:r>
       <w:r>
         <w:br/>
@@ -12321,7 +12856,7 @@
         <w:rPr>
           <w:rStyle w:val="VerbatimChar"/>
         </w:rPr>
-        <w:t xml:space="preserve">editability bias toward usable layer counts</w:t>
+        <w:t xml:space="preserve">semantic separation</w:t>
       </w:r>
       <w:r>
         <w:br/>
@@ -12330,6 +12865,24 @@
         <w:rPr>
           <w:rStyle w:val="VerbatimChar"/>
         </w:rPr>
+        <w:t xml:space="preserve">alpha quality</w:t>
+      </w:r>
+      <w:r>
+        <w:br/>
+      </w:r>
+      <w:r>
+        <w:rPr>
+          <w:rStyle w:val="VerbatimChar"/>
+        </w:rPr>
+        <w:t xml:space="preserve">graph confidence</w:t>
+      </w:r>
+      <w:r>
+        <w:br/>
+      </w:r>
+      <w:r>
+        <w:rPr>
+          <w:rStyle w:val="VerbatimChar"/>
+        </w:rPr>
         <w:t xml:space="preserve">runtime</w:t>
       </w:r>
     </w:p>
@@ -12349,7 +12902,7 @@
         <w:rPr>
           <w:rStyle w:val="VerbatimChar"/>
         </w:rPr>
-        <w:t xml:space="preserve">score = 0.40 * fidelity</w:t>
+        <w:t xml:space="preserve">score = 0.20 * recomposition_fidelity</w:t>
       </w:r>
       <w:r>
         <w:br/>
@@ -12358,7 +12911,7 @@
         <w:rPr>
           <w:rStyle w:val="VerbatimChar"/>
         </w:rPr>
-        <w:t xml:space="preserve">      + 0.25 * structure</w:t>
+        <w:t xml:space="preserve">      + 0.25 * edit_preservation</w:t>
       </w:r>
       <w:r>
         <w:br/>
@@ -12367,7 +12920,7 @@
         <w:rPr>
           <w:rStyle w:val="VerbatimChar"/>
         </w:rPr>
-        <w:t xml:space="preserve">      + 0.20 * editability</w:t>
+        <w:t xml:space="preserve">      + 0.20 * semantic_separation</w:t>
       </w:r>
       <w:r>
         <w:br/>
@@ -12376,7 +12929,25 @@
         <w:rPr>
           <w:rStyle w:val="VerbatimChar"/>
         </w:rPr>
-        <w:t xml:space="preserve">      + 0.15 * runtime</w:t>
+        <w:t xml:space="preserve">      + 0.10 * alpha_quality</w:t>
+      </w:r>
+      <w:r>
+        <w:br/>
+      </w:r>
+      <w:r>
+        <w:rPr>
+          <w:rStyle w:val="VerbatimChar"/>
+        </w:rPr>
+        <w:t xml:space="preserve">      + 0.15 * graph_confidence</w:t>
+      </w:r>
+      <w:r>
+        <w:br/>
+      </w:r>
+      <w:r>
+        <w:rPr>
+          <w:rStyle w:val="VerbatimChar"/>
+        </w:rPr>
+        <w:t xml:space="preserve">      + 0.10 * runtime</w:t>
       </w:r>
     </w:p>
     <w:p>
@@ -12399,7 +12970,7 @@
         <w:rPr>
           <w:rStyle w:val="VerbatimChar"/>
         </w:rPr>
-        <w:t xml:space="preserve">fidelity</w:t>
+        <w:t xml:space="preserve">recomposition_fidelity</w:t>
       </w:r>
       <w:r>
         <w:t xml:space="preserve"> </w:t>
@@ -12420,13 +12991,13 @@
         <w:rPr>
           <w:rStyle w:val="VerbatimChar"/>
         </w:rPr>
-        <w:t xml:space="preserve">structure</w:t>
+        <w:t xml:space="preserve">edit_preservation</w:t>
       </w:r>
       <w:r>
         <w:t xml:space="preserve"> </w:t>
       </w:r>
       <w:r>
-        <w:t xml:space="preserve">rewards explicit graph output, ordered layers, and recovered effect layers;</w:t>
+        <w:t xml:space="preserve">rewards remove/move/recolor responses that affect the target layer while preserving the rest of the frame;</w:t>
       </w:r>
     </w:p>
     <w:p>
@@ -12441,13 +13012,13 @@
         <w:rPr>
           <w:rStyle w:val="VerbatimChar"/>
         </w:rPr>
-        <w:t xml:space="preserve">editability</w:t>
+        <w:t xml:space="preserve">semantic_separation</w:t>
       </w:r>
       <w:r>
         <w:t xml:space="preserve"> </w:t>
       </w:r>
       <w:r>
-        <w:t xml:space="preserve">favours candidates with usable layer counts and graph metadata;</w:t>
+        <w:t xml:space="preserve">rewards foreground coverage without collapsing everything into one dominant layer;</w:t>
       </w:r>
     </w:p>
     <w:p>
@@ -12462,6 +13033,48 @@
         <w:rPr>
           <w:rStyle w:val="VerbatimChar"/>
         </w:rPr>
+        <w:t xml:space="preserve">alpha_quality</w:t>
+      </w:r>
+      <w:r>
+        <w:t xml:space="preserve"> </w:t>
+      </w:r>
+      <w:r>
+        <w:t xml:space="preserve">favours soft, non-binary alpha mattes when the data supports them;</w:t>
+      </w:r>
+    </w:p>
+    <w:p>
+      <w:pPr>
+        <w:pStyle w:val="Compact"/>
+        <w:numPr>
+          <w:ilvl w:val="0"/>
+          <w:numId w:val="1020"/>
+        </w:numPr>
+      </w:pPr>
+      <w:r>
+        <w:rPr>
+          <w:rStyle w:val="VerbatimChar"/>
+        </w:rPr>
+        <w:t xml:space="preserve">graph_confidence</w:t>
+      </w:r>
+      <w:r>
+        <w:t xml:space="preserve"> </w:t>
+      </w:r>
+      <w:r>
+        <w:t xml:space="preserve">rewards explicit graph output, ordered layers, and occlusion edges;</w:t>
+      </w:r>
+    </w:p>
+    <w:p>
+      <w:pPr>
+        <w:pStyle w:val="Compact"/>
+        <w:numPr>
+          <w:ilvl w:val="0"/>
+          <w:numId w:val="1020"/>
+        </w:numPr>
+      </w:pPr>
+      <w:r>
+        <w:rPr>
+          <w:rStyle w:val="VerbatimChar"/>
+        </w:rPr>
         <w:t xml:space="preserve">runtime</w:t>
       </w:r>
       <w:r>
@@ -12542,7 +13155,7 @@
         <w:pStyle w:val="BlockText"/>
       </w:pPr>
       <w:r>
-        <w:t xml:space="preserve">We extend LayerForge-X with a frontier candidate bank and a self-evaluation stage that compares native, generative, hybrid, and recursive decompositions, then selects the most useful editable representation per image using measured fidelity, structure, editability, and runtime signals.</w:t>
+        <w:t xml:space="preserve">We extend LayerForge-X with a frontier candidate bank and a self-evaluation stage that compares native, generative, hybrid, and recursive decompositions, then selects the most useful editable representation per image using measured fidelity, editability, semantic separation, graph confidence, alpha quality, and runtime signals.</w:t>
       </w:r>
     </w:p>
     <w:bookmarkEnd w:id="176"/>
@@ -14671,7 +15284,7 @@
     </w:p>
     <w:bookmarkEnd w:id="220"/>
     <w:bookmarkEnd w:id="221"/>
-    <w:bookmarkStart w:id="230" w:name="X51233989dadfb915fbbea335e0f20b83920142b"/>
+    <w:bookmarkStart w:id="231" w:name="X51233989dadfb915fbbea335e0f20b83920142b"/>
     <w:p>
       <w:pPr>
         <w:pStyle w:val="Heading1"/>
@@ -15373,19 +15986,19 @@
               <w:jc w:val="right"/>
             </w:pPr>
             <w:r>
-              <w:t xml:space="preserve">0.6597</w:t>
-            </w:r>
-          </w:p>
-        </w:tc>
-        <w:tc>
-          <w:tcPr/>
-          <w:p>
-            <w:pPr>
-              <w:pStyle w:val="Compact"/>
-              <w:jc w:val="right"/>
-            </w:pPr>
-            <w:r>
-              <w:t xml:space="preserve">3</w:t>
+              <w:t xml:space="preserve">0.6283</w:t>
+            </w:r>
+          </w:p>
+        </w:tc>
+        <w:tc>
+          <w:tcPr/>
+          <w:p>
+            <w:pPr>
+              <w:pStyle w:val="Compact"/>
+              <w:jc w:val="right"/>
+            </w:pPr>
+            <w:r>
+              <w:t xml:space="preserve">4</w:t>
             </w:r>
           </w:p>
         </w:tc>
@@ -15446,19 +16059,19 @@
               <w:jc w:val="right"/>
             </w:pPr>
             <w:r>
-              <w:t xml:space="preserve">0.5050</w:t>
-            </w:r>
-          </w:p>
-        </w:tc>
-        <w:tc>
-          <w:tcPr/>
-          <w:p>
-            <w:pPr>
-              <w:pStyle w:val="Compact"/>
-              <w:jc w:val="right"/>
-            </w:pPr>
-            <w:r>
-              <w:t xml:space="preserve">1</w:t>
+              <w:t xml:space="preserve">0.4783</w:t>
+            </w:r>
+          </w:p>
+        </w:tc>
+        <w:tc>
+          <w:tcPr/>
+          <w:p>
+            <w:pPr>
+              <w:pStyle w:val="Compact"/>
+              <w:jc w:val="right"/>
+            </w:pPr>
+            <w:r>
+              <w:t xml:space="preserve">0</w:t>
             </w:r>
           </w:p>
         </w:tc>
@@ -15519,7 +16132,7 @@
               <w:jc w:val="right"/>
             </w:pPr>
             <w:r>
-              <w:t xml:space="preserve">0.2530</w:t>
+              <w:t xml:space="preserve">0.2541</w:t>
             </w:r>
           </w:p>
         </w:tc>
@@ -15592,19 +16205,19 @@
               <w:jc w:val="right"/>
             </w:pPr>
             <w:r>
-              <w:t xml:space="preserve">0.4951</w:t>
-            </w:r>
-          </w:p>
-        </w:tc>
-        <w:tc>
-          <w:tcPr/>
-          <w:p>
-            <w:pPr>
-              <w:pStyle w:val="Compact"/>
-              <w:jc w:val="right"/>
-            </w:pPr>
-            <w:r>
-              <w:t xml:space="preserve">1</w:t>
+              <w:t xml:space="preserve">0.5259</w:t>
+            </w:r>
+          </w:p>
+        </w:tc>
+        <w:tc>
+          <w:tcPr/>
+          <w:p>
+            <w:pPr>
+              <w:pStyle w:val="Compact"/>
+              <w:jc w:val="right"/>
+            </w:pPr>
+            <w:r>
+              <w:t xml:space="preserve">0</w:t>
             </w:r>
           </w:p>
         </w:tc>
@@ -15665,19 +16278,19 @@
               <w:jc w:val="right"/>
             </w:pPr>
             <w:r>
-              <w:t xml:space="preserve">0.4949</w:t>
-            </w:r>
-          </w:p>
-        </w:tc>
-        <w:tc>
-          <w:tcPr/>
-          <w:p>
-            <w:pPr>
-              <w:pStyle w:val="Compact"/>
-              <w:jc w:val="right"/>
-            </w:pPr>
-            <w:r>
-              <w:t xml:space="preserve">0</w:t>
+              <w:t xml:space="preserve">0.5251</w:t>
+            </w:r>
+          </w:p>
+        </w:tc>
+        <w:tc>
+          <w:tcPr/>
+          <w:p>
+            <w:pPr>
+              <w:pStyle w:val="Compact"/>
+              <w:jc w:val="right"/>
+            </w:pPr>
+            <w:r>
+              <w:t xml:space="preserve">1</w:t>
             </w:r>
           </w:p>
         </w:tc>
@@ -15718,13 +16331,13 @@
         <w:rPr>
           <w:rStyle w:val="VerbatimChar"/>
         </w:rPr>
-        <w:t xml:space="preserve">3/5</w:t>
+        <w:t xml:space="preserve">4/5</w:t>
       </w:r>
       <w:r>
         <w:t xml:space="preserve"> </w:t>
       </w:r>
       <w:r>
-        <w:t xml:space="preserve">measured images;</w:t>
+        <w:t xml:space="preserve">measured images once anti-triviality penalties are enabled;</w:t>
       </w:r>
     </w:p>
     <w:p>
@@ -15736,6 +16349,12 @@
         </w:numPr>
       </w:pPr>
       <w:r>
+        <w:t xml:space="preserve">the hardened selector no longer lets</w:t>
+      </w:r>
+      <w:r>
+        <w:t xml:space="preserve"> </w:t>
+      </w:r>
+      <w:r>
         <w:rPr>
           <w:rStyle w:val="VerbatimChar"/>
         </w:rPr>
@@ -15745,7 +16364,7 @@
         <w:t xml:space="preserve"> </w:t>
       </w:r>
       <w:r>
-        <w:t xml:space="preserve">is a real measured row and wins the truck scene, which is exactly the kind of edit-heavy foreground removal case the recursive path was added for;</w:t>
+        <w:t xml:space="preserve">win the truck image simply because the recursive removal path is visually dramatic;</w:t>
       </w:r>
     </w:p>
     <w:p>
@@ -15760,13 +16379,13 @@
         <w:rPr>
           <w:rStyle w:val="VerbatimChar"/>
         </w:rPr>
-        <w:t xml:space="preserve">Qwen + graph preserve</w:t>
+        <w:t xml:space="preserve">Qwen + graph reorder</w:t>
       </w:r>
       <w:r>
         <w:t xml:space="preserve"> </w:t>
       </w:r>
       <w:r>
-        <w:t xml:space="preserve">wins the synthetic scene and remains the fair metadata-first hybrid row;</w:t>
+        <w:t xml:space="preserve">now wins the cat image, showing that imported generative stacks can still beat the native path on specific compact scenes;</w:t>
       </w:r>
     </w:p>
     <w:p>
@@ -15791,7 +16410,620 @@
       </w:r>
     </w:p>
     <w:bookmarkEnd w:id="223"/>
-    <w:bookmarkStart w:id="224" w:name="main-ablation-matrix"/>
+    <w:bookmarkStart w:id="224" w:name="editability-suite-snapshot"/>
+    <w:p>
+      <w:pPr>
+        <w:pStyle w:val="Heading2"/>
+      </w:pPr>
+      <w:r>
+        <w:t xml:space="preserve">Editability suite snapshot</w:t>
+      </w:r>
+    </w:p>
+    <w:p>
+      <w:pPr>
+        <w:pStyle w:val="FirstParagraph"/>
+      </w:pPr>
+      <w:r>
+        <w:t xml:space="preserve">The frontier review is now paired with an editability suite so recomposition fidelity is not the only score that matters.</w:t>
+      </w:r>
+    </w:p>
+    <w:tbl>
+      <w:tblPr>
+        <w:tblStyle w:val="Table"/>
+        <w:tblW w:type="pct" w:w="5000"/>
+        <w:tblLayout w:type="fixed"/>
+        <w:tblLook w:firstRow="1" w:lastRow="0" w:firstColumn="0" w:lastColumn="0" w:noHBand="0" w:noVBand="0" w:val="0020"/>
+      </w:tblPr>
+      <w:tblGrid>
+        <w:gridCol w:w="880"/>
+        <w:gridCol w:w="1173"/>
+        <w:gridCol w:w="1173"/>
+        <w:gridCol w:w="1173"/>
+        <w:gridCol w:w="1173"/>
+        <w:gridCol w:w="1173"/>
+        <w:gridCol w:w="1173"/>
+      </w:tblGrid>
+      <w:tr>
+        <w:trPr>
+          <w:tblHeader w:val="on"/>
+        </w:trPr>
+        <w:tc>
+          <w:tcPr/>
+          <w:p>
+            <w:pPr>
+              <w:pStyle w:val="Compact"/>
+            </w:pPr>
+            <w:r>
+              <w:t xml:space="preserve">Method</w:t>
+            </w:r>
+          </w:p>
+        </w:tc>
+        <w:tc>
+          <w:tcPr/>
+          <w:p>
+            <w:pPr>
+              <w:pStyle w:val="Compact"/>
+              <w:jc w:val="right"/>
+            </w:pPr>
+            <w:r>
+              <w:t xml:space="preserve">Remove response ↑</w:t>
+            </w:r>
+          </w:p>
+        </w:tc>
+        <w:tc>
+          <w:tcPr/>
+          <w:p>
+            <w:pPr>
+              <w:pStyle w:val="Compact"/>
+              <w:jc w:val="right"/>
+            </w:pPr>
+            <w:r>
+              <w:t xml:space="preserve">Move response ↑</w:t>
+            </w:r>
+          </w:p>
+        </w:tc>
+        <w:tc>
+          <w:tcPr/>
+          <w:p>
+            <w:pPr>
+              <w:pStyle w:val="Compact"/>
+              <w:jc w:val="right"/>
+            </w:pPr>
+            <w:r>
+              <w:t xml:space="preserve">Recolor response ↑</w:t>
+            </w:r>
+          </w:p>
+        </w:tc>
+        <w:tc>
+          <w:tcPr/>
+          <w:p>
+            <w:pPr>
+              <w:pStyle w:val="Compact"/>
+              <w:jc w:val="right"/>
+            </w:pPr>
+            <w:r>
+              <w:t xml:space="preserve">Edit success ↑</w:t>
+            </w:r>
+          </w:p>
+        </w:tc>
+        <w:tc>
+          <w:tcPr/>
+          <w:p>
+            <w:pPr>
+              <w:pStyle w:val="Compact"/>
+              <w:jc w:val="right"/>
+            </w:pPr>
+            <w:r>
+              <w:t xml:space="preserve">Non-edit preservation ↑</w:t>
+            </w:r>
+          </w:p>
+        </w:tc>
+        <w:tc>
+          <w:tcPr/>
+          <w:p>
+            <w:pPr>
+              <w:pStyle w:val="Compact"/>
+              <w:jc w:val="right"/>
+            </w:pPr>
+            <w:r>
+              <w:t xml:space="preserve">Background hole ratio ↓</w:t>
+            </w:r>
+          </w:p>
+        </w:tc>
+      </w:tr>
+      <w:tr>
+        <w:tc>
+          <w:tcPr/>
+          <w:p>
+            <w:pPr>
+              <w:pStyle w:val="Compact"/>
+            </w:pPr>
+            <w:r>
+              <w:t xml:space="preserve">LayerForge native</w:t>
+            </w:r>
+          </w:p>
+        </w:tc>
+        <w:tc>
+          <w:tcPr/>
+          <w:p>
+            <w:pPr>
+              <w:pStyle w:val="Compact"/>
+              <w:jc w:val="right"/>
+            </w:pPr>
+            <w:r>
+              <w:t xml:space="preserve">0.1097</w:t>
+            </w:r>
+          </w:p>
+        </w:tc>
+        <w:tc>
+          <w:tcPr/>
+          <w:p>
+            <w:pPr>
+              <w:pStyle w:val="Compact"/>
+              <w:jc w:val="right"/>
+            </w:pPr>
+            <w:r>
+              <w:t xml:space="preserve">0.1011</w:t>
+            </w:r>
+          </w:p>
+        </w:tc>
+        <w:tc>
+          <w:tcPr/>
+          <w:p>
+            <w:pPr>
+              <w:pStyle w:val="Compact"/>
+              <w:jc w:val="right"/>
+            </w:pPr>
+            <w:r>
+              <w:t xml:space="preserve">0.1220</w:t>
+            </w:r>
+          </w:p>
+        </w:tc>
+        <w:tc>
+          <w:tcPr/>
+          <w:p>
+            <w:pPr>
+              <w:pStyle w:val="Compact"/>
+              <w:jc w:val="right"/>
+            </w:pPr>
+            <w:r>
+              <w:t xml:space="preserve">0.6695</w:t>
+            </w:r>
+          </w:p>
+        </w:tc>
+        <w:tc>
+          <w:tcPr/>
+          <w:p>
+            <w:pPr>
+              <w:pStyle w:val="Compact"/>
+              <w:jc w:val="right"/>
+            </w:pPr>
+            <w:r>
+              <w:t xml:space="preserve">0.9999</w:t>
+            </w:r>
+          </w:p>
+        </w:tc>
+        <w:tc>
+          <w:tcPr/>
+          <w:p>
+            <w:pPr>
+              <w:pStyle w:val="Compact"/>
+              <w:jc w:val="right"/>
+            </w:pPr>
+            <w:r>
+              <w:t xml:space="preserve">0.4860</w:t>
+            </w:r>
+          </w:p>
+        </w:tc>
+      </w:tr>
+      <w:tr>
+        <w:tc>
+          <w:tcPr/>
+          <w:p>
+            <w:pPr>
+              <w:pStyle w:val="Compact"/>
+            </w:pPr>
+            <w:r>
+              <w:t xml:space="preserve">LayerForge peeling</w:t>
+            </w:r>
+          </w:p>
+        </w:tc>
+        <w:tc>
+          <w:tcPr/>
+          <w:p>
+            <w:pPr>
+              <w:pStyle w:val="Compact"/>
+              <w:jc w:val="right"/>
+            </w:pPr>
+            <w:r>
+              <w:t xml:space="preserve">0.1019</w:t>
+            </w:r>
+          </w:p>
+        </w:tc>
+        <w:tc>
+          <w:tcPr/>
+          <w:p>
+            <w:pPr>
+              <w:pStyle w:val="Compact"/>
+              <w:jc w:val="right"/>
+            </w:pPr>
+            <w:r>
+              <w:t xml:space="preserve">0.0808</w:t>
+            </w:r>
+          </w:p>
+        </w:tc>
+        <w:tc>
+          <w:tcPr/>
+          <w:p>
+            <w:pPr>
+              <w:pStyle w:val="Compact"/>
+              <w:jc w:val="right"/>
+            </w:pPr>
+            <w:r>
+              <w:t xml:space="preserve">0.1082</w:t>
+            </w:r>
+          </w:p>
+        </w:tc>
+        <w:tc>
+          <w:tcPr/>
+          <w:p>
+            <w:pPr>
+              <w:pStyle w:val="Compact"/>
+              <w:jc w:val="right"/>
+            </w:pPr>
+            <w:r>
+              <w:t xml:space="preserve">0.5865</w:t>
+            </w:r>
+          </w:p>
+        </w:tc>
+        <w:tc>
+          <w:tcPr/>
+          <w:p>
+            <w:pPr>
+              <w:pStyle w:val="Compact"/>
+              <w:jc w:val="right"/>
+            </w:pPr>
+            <w:r>
+              <w:t xml:space="preserve">1.0000</w:t>
+            </w:r>
+          </w:p>
+        </w:tc>
+        <w:tc>
+          <w:tcPr/>
+          <w:p>
+            <w:pPr>
+              <w:pStyle w:val="Compact"/>
+              <w:jc w:val="right"/>
+            </w:pPr>
+            <w:r>
+              <w:t xml:space="preserve">0.5433</w:t>
+            </w:r>
+          </w:p>
+        </w:tc>
+      </w:tr>
+      <w:tr>
+        <w:tc>
+          <w:tcPr/>
+          <w:p>
+            <w:pPr>
+              <w:pStyle w:val="Compact"/>
+            </w:pPr>
+            <w:r>
+              <w:t xml:space="preserve">Qwen raw (4)</w:t>
+            </w:r>
+          </w:p>
+        </w:tc>
+        <w:tc>
+          <w:tcPr/>
+          <w:p>
+            <w:pPr>
+              <w:pStyle w:val="Compact"/>
+              <w:jc w:val="right"/>
+            </w:pPr>
+            <w:r>
+              <w:t xml:space="preserve">0.0002</w:t>
+            </w:r>
+          </w:p>
+        </w:tc>
+        <w:tc>
+          <w:tcPr/>
+          <w:p>
+            <w:pPr>
+              <w:pStyle w:val="Compact"/>
+              <w:jc w:val="right"/>
+            </w:pPr>
+            <w:r>
+              <w:t xml:space="preserve">0.0001</w:t>
+            </w:r>
+          </w:p>
+        </w:tc>
+        <w:tc>
+          <w:tcPr/>
+          <w:p>
+            <w:pPr>
+              <w:pStyle w:val="Compact"/>
+              <w:jc w:val="right"/>
+            </w:pPr>
+            <w:r>
+              <w:t xml:space="preserve">0.0001</w:t>
+            </w:r>
+          </w:p>
+        </w:tc>
+        <w:tc>
+          <w:tcPr/>
+          <w:p>
+            <w:pPr>
+              <w:pStyle w:val="Compact"/>
+              <w:jc w:val="right"/>
+            </w:pPr>
+            <w:r>
+              <w:t xml:space="preserve">0.1506</w:t>
+            </w:r>
+          </w:p>
+        </w:tc>
+        <w:tc>
+          <w:tcPr/>
+          <w:p>
+            <w:pPr>
+              <w:pStyle w:val="Compact"/>
+              <w:jc w:val="right"/>
+            </w:pPr>
+            <w:r>
+              <w:t xml:space="preserve">1.0000</w:t>
+            </w:r>
+          </w:p>
+        </w:tc>
+        <w:tc>
+          <w:tcPr/>
+          <w:p>
+            <w:pPr>
+              <w:pStyle w:val="Compact"/>
+              <w:jc w:val="right"/>
+            </w:pPr>
+            <w:r>
+              <w:t xml:space="preserve">1.0000</w:t>
+            </w:r>
+          </w:p>
+        </w:tc>
+      </w:tr>
+      <w:tr>
+        <w:tc>
+          <w:tcPr/>
+          <w:p>
+            <w:pPr>
+              <w:pStyle w:val="Compact"/>
+            </w:pPr>
+            <w:r>
+              <w:t xml:space="preserve">Qwen + graph preserve (4)</w:t>
+            </w:r>
+          </w:p>
+        </w:tc>
+        <w:tc>
+          <w:tcPr/>
+          <w:p>
+            <w:pPr>
+              <w:pStyle w:val="Compact"/>
+              <w:jc w:val="right"/>
+            </w:pPr>
+            <w:r>
+              <w:t xml:space="preserve">0.2083</w:t>
+            </w:r>
+          </w:p>
+        </w:tc>
+        <w:tc>
+          <w:tcPr/>
+          <w:p>
+            <w:pPr>
+              <w:pStyle w:val="Compact"/>
+              <w:jc w:val="right"/>
+            </w:pPr>
+            <w:r>
+              <w:t xml:space="preserve">0.1509</w:t>
+            </w:r>
+          </w:p>
+        </w:tc>
+        <w:tc>
+          <w:tcPr/>
+          <w:p>
+            <w:pPr>
+              <w:pStyle w:val="Compact"/>
+              <w:jc w:val="right"/>
+            </w:pPr>
+            <w:r>
+              <w:t xml:space="preserve">0.1421</w:t>
+            </w:r>
+          </w:p>
+        </w:tc>
+        <w:tc>
+          <w:tcPr/>
+          <w:p>
+            <w:pPr>
+              <w:pStyle w:val="Compact"/>
+              <w:jc w:val="right"/>
+            </w:pPr>
+            <w:r>
+              <w:t xml:space="preserve">0.8633</w:t>
+            </w:r>
+          </w:p>
+        </w:tc>
+        <w:tc>
+          <w:tcPr/>
+          <w:p>
+            <w:pPr>
+              <w:pStyle w:val="Compact"/>
+              <w:jc w:val="right"/>
+            </w:pPr>
+            <w:r>
+              <w:t xml:space="preserve">0.9887</w:t>
+            </w:r>
+          </w:p>
+        </w:tc>
+        <w:tc>
+          <w:tcPr/>
+          <w:p>
+            <w:pPr>
+              <w:pStyle w:val="Compact"/>
+              <w:jc w:val="right"/>
+            </w:pPr>
+            <w:r>
+              <w:t xml:space="preserve">0.1420</w:t>
+            </w:r>
+          </w:p>
+        </w:tc>
+      </w:tr>
+      <w:tr>
+        <w:tc>
+          <w:tcPr/>
+          <w:p>
+            <w:pPr>
+              <w:pStyle w:val="Compact"/>
+            </w:pPr>
+            <w:r>
+              <w:t xml:space="preserve">Qwen + graph reorder (4)</w:t>
+            </w:r>
+          </w:p>
+        </w:tc>
+        <w:tc>
+          <w:tcPr/>
+          <w:p>
+            <w:pPr>
+              <w:pStyle w:val="Compact"/>
+              <w:jc w:val="right"/>
+            </w:pPr>
+            <w:r>
+              <w:t xml:space="preserve">0.2080</w:t>
+            </w:r>
+          </w:p>
+        </w:tc>
+        <w:tc>
+          <w:tcPr/>
+          <w:p>
+            <w:pPr>
+              <w:pStyle w:val="Compact"/>
+              <w:jc w:val="right"/>
+            </w:pPr>
+            <w:r>
+              <w:t xml:space="preserve">0.1491</w:t>
+            </w:r>
+          </w:p>
+        </w:tc>
+        <w:tc>
+          <w:tcPr/>
+          <w:p>
+            <w:pPr>
+              <w:pStyle w:val="Compact"/>
+              <w:jc w:val="right"/>
+            </w:pPr>
+            <w:r>
+              <w:t xml:space="preserve">0.1421</w:t>
+            </w:r>
+          </w:p>
+        </w:tc>
+        <w:tc>
+          <w:tcPr/>
+          <w:p>
+            <w:pPr>
+              <w:pStyle w:val="Compact"/>
+              <w:jc w:val="right"/>
+            </w:pPr>
+            <w:r>
+              <w:t xml:space="preserve">0.8607</w:t>
+            </w:r>
+          </w:p>
+        </w:tc>
+        <w:tc>
+          <w:tcPr/>
+          <w:p>
+            <w:pPr>
+              <w:pStyle w:val="Compact"/>
+              <w:jc w:val="right"/>
+            </w:pPr>
+            <w:r>
+              <w:t xml:space="preserve">0.9886</w:t>
+            </w:r>
+          </w:p>
+        </w:tc>
+        <w:tc>
+          <w:tcPr/>
+          <w:p>
+            <w:pPr>
+              <w:pStyle w:val="Compact"/>
+              <w:jc w:val="right"/>
+            </w:pPr>
+            <w:r>
+              <w:t xml:space="preserve">0.1427</w:t>
+            </w:r>
+          </w:p>
+        </w:tc>
+      </w:tr>
+    </w:tbl>
+    <w:p>
+      <w:pPr>
+        <w:pStyle w:val="BodyText"/>
+      </w:pPr>
+      <w:r>
+        <w:t xml:space="preserve">Interpretation:</w:t>
+      </w:r>
+    </w:p>
+    <w:p>
+      <w:pPr>
+        <w:pStyle w:val="Compact"/>
+        <w:numPr>
+          <w:ilvl w:val="0"/>
+          <w:numId w:val="1026"/>
+        </w:numPr>
+      </w:pPr>
+      <w:r>
+        <w:t xml:space="preserve">the editability suite is the anti-triviality guardrail for the frontier selector;</w:t>
+      </w:r>
+    </w:p>
+    <w:p>
+      <w:pPr>
+        <w:pStyle w:val="Compact"/>
+        <w:numPr>
+          <w:ilvl w:val="0"/>
+          <w:numId w:val="1026"/>
+        </w:numPr>
+      </w:pPr>
+      <w:r>
+        <w:rPr>
+          <w:rStyle w:val="VerbatimChar"/>
+        </w:rPr>
+        <w:t xml:space="preserve">Qwen raw (4)</w:t>
+      </w:r>
+      <w:r>
+        <w:t xml:space="preserve"> </w:t>
+      </w:r>
+      <w:r>
+        <w:t xml:space="preserve">is the obvious example of why recomposition alone is insufficient, because its remove/move/recolor responses are almost zero while its background-hole ratio is effectively</w:t>
+      </w:r>
+      <w:r>
+        <w:t xml:space="preserve"> </w:t>
+      </w:r>
+      <w:r>
+        <w:rPr>
+          <w:rStyle w:val="VerbatimChar"/>
+        </w:rPr>
+        <w:t xml:space="preserve">1.0</w:t>
+      </w:r>
+      <w:r>
+        <w:t xml:space="preserve">;</w:t>
+      </w:r>
+    </w:p>
+    <w:p>
+      <w:pPr>
+        <w:pStyle w:val="Compact"/>
+        <w:numPr>
+          <w:ilvl w:val="0"/>
+          <w:numId w:val="1026"/>
+        </w:numPr>
+      </w:pPr>
+      <w:r>
+        <w:t xml:space="preserve">the hybrid rows currently post the strongest edit-success scores because imported generative stacks plus explicit LayerForge graph metadata are still easy to move, recolor, and remove cleanly.</w:t>
+      </w:r>
+    </w:p>
+    <w:bookmarkEnd w:id="224"/>
+    <w:bookmarkStart w:id="225" w:name="main-ablation-matrix"/>
     <w:p>
       <w:pPr>
         <w:pStyle w:val="Heading2"/>
@@ -16847,8 +18079,8 @@
         </w:pict>
       </w:r>
     </w:p>
-    <w:bookmarkEnd w:id="224"/>
-    <w:bookmarkStart w:id="225" w:name="table-1-literature-comparison"/>
+    <w:bookmarkEnd w:id="225"/>
+    <w:bookmarkStart w:id="226" w:name="table-1-literature-comparison"/>
     <w:p>
       <w:pPr>
         <w:pStyle w:val="Heading2"/>
@@ -17989,8 +19221,8 @@
         </w:pict>
       </w:r>
     </w:p>
-    <w:bookmarkEnd w:id="225"/>
-    <w:bookmarkStart w:id="226" w:name="table-2-dataset-plan"/>
+    <w:bookmarkEnd w:id="226"/>
+    <w:bookmarkStart w:id="227" w:name="table-2-dataset-plan"/>
     <w:p>
       <w:pPr>
         <w:pStyle w:val="Heading2"/>
@@ -18445,8 +19677,8 @@
         </w:pict>
       </w:r>
     </w:p>
-    <w:bookmarkEnd w:id="226"/>
-    <w:bookmarkStart w:id="227" w:name="Xfb6947bcd8c2f9aa6af13cb0f14c09ce92d779f"/>
+    <w:bookmarkEnd w:id="227"/>
+    <w:bookmarkStart w:id="228" w:name="Xfb6947bcd8c2f9aa6af13cb0f14c09ce92d779f"/>
     <w:p>
       <w:pPr>
         <w:pStyle w:val="Heading2"/>
@@ -19055,8 +20287,8 @@
         </w:pict>
       </w:r>
     </w:p>
-    <w:bookmarkEnd w:id="227"/>
-    <w:bookmarkStart w:id="228" w:name="table-4-component-ablation-template"/>
+    <w:bookmarkEnd w:id="228"/>
+    <w:bookmarkStart w:id="229" w:name="table-4-component-ablation-template"/>
     <w:p>
       <w:pPr>
         <w:pStyle w:val="Heading2"/>
@@ -19487,8 +20719,8 @@
         </w:pict>
       </w:r>
     </w:p>
-    <w:bookmarkEnd w:id="228"/>
-    <w:bookmarkStart w:id="229" w:name="table-5-failure-analysis-template"/>
+    <w:bookmarkEnd w:id="229"/>
+    <w:bookmarkStart w:id="230" w:name="table-5-failure-analysis-template"/>
     <w:p>
       <w:pPr>
         <w:pStyle w:val="Heading2"/>
@@ -19872,9 +21104,9 @@
         </w:pict>
       </w:r>
     </w:p>
-    <w:bookmarkEnd w:id="229"/>
     <w:bookmarkEnd w:id="230"/>
-    <w:bookmarkStart w:id="238" w:name="required-figures"/>
+    <w:bookmarkEnd w:id="231"/>
+    <w:bookmarkStart w:id="239" w:name="required-figures"/>
     <w:p>
       <w:pPr>
         <w:pStyle w:val="Heading1"/>
@@ -19883,7 +21115,7 @@
         <w:t xml:space="preserve">Required figures</w:t>
       </w:r>
     </w:p>
-    <w:bookmarkStart w:id="231" w:name="figure-1-pipeline-diagram"/>
+    <w:bookmarkStart w:id="232" w:name="figure-1-pipeline-diagram"/>
     <w:p>
       <w:pPr>
         <w:pStyle w:val="Heading2"/>
@@ -19983,8 +21215,8 @@
         <w:t xml:space="preserve">→ RGBA layer stack</w:t>
       </w:r>
     </w:p>
-    <w:bookmarkEnd w:id="231"/>
-    <w:bookmarkStart w:id="232" w:name="figure-2-dalg-representation"/>
+    <w:bookmarkEnd w:id="232"/>
+    <w:bookmarkStart w:id="233" w:name="figure-2-dalg-representation"/>
     <w:p>
       <w:pPr>
         <w:pStyle w:val="Heading2"/>
@@ -20013,8 +21245,8 @@
         <w:t xml:space="preserve">edges. Use colour to distinguish semantic groups.</w:t>
       </w:r>
     </w:p>
-    <w:bookmarkEnd w:id="232"/>
-    <w:bookmarkStart w:id="233" w:name="figure-3-ordered-layer-contact-sheet"/>
+    <w:bookmarkEnd w:id="233"/>
+    <w:bookmarkStart w:id="234" w:name="figure-3-ordered-layer-contact-sheet"/>
     <w:p>
       <w:pPr>
         <w:pStyle w:val="Heading2"/>
@@ -20050,8 +21282,8 @@
         <w:t xml:space="preserve">docs/figures/truck_layer_stack_comparison.png</w:t>
       </w:r>
     </w:p>
-    <w:bookmarkEnd w:id="233"/>
-    <w:bookmarkStart w:id="234" w:name="figure-4-baseline-vs-full"/>
+    <w:bookmarkEnd w:id="234"/>
+    <w:bookmarkStart w:id="235" w:name="figure-4-baseline-vs-full"/>
     <w:p>
       <w:pPr>
         <w:pStyle w:val="Heading2"/>
@@ -20153,8 +21385,8 @@
         <w:t xml:space="preserve">docs/figures/truck_recomposition_comparison.png</w:t>
       </w:r>
     </w:p>
-    <w:bookmarkEnd w:id="234"/>
-    <w:bookmarkStart w:id="235" w:name="figure-5-occlusion-graph-improvement"/>
+    <w:bookmarkEnd w:id="235"/>
+    <w:bookmarkStart w:id="236" w:name="figure-5-occlusion-graph-improvement"/>
     <w:p>
       <w:pPr>
         <w:pStyle w:val="Heading2"/>
@@ -20171,8 +21403,8 @@
         <w:t xml:space="preserve">Pick a single scene where the global-median-depth ordering fails and the boundary graph gets it right. Highlight the contested edge.</w:t>
       </w:r>
     </w:p>
-    <w:bookmarkEnd w:id="235"/>
-    <w:bookmarkStart w:id="236" w:name="figure-6-editing-demo"/>
+    <w:bookmarkEnd w:id="236"/>
+    <w:bookmarkStart w:id="237" w:name="figure-6-editing-demo"/>
     <w:p>
       <w:pPr>
         <w:pStyle w:val="Heading2"/>
@@ -20236,8 +21468,8 @@
         <w:t xml:space="preserve">background blur</w:t>
       </w:r>
     </w:p>
-    <w:bookmarkEnd w:id="236"/>
-    <w:bookmarkStart w:id="237" w:name="figure-7-failure-cases"/>
+    <w:bookmarkEnd w:id="237"/>
+    <w:bookmarkStart w:id="238" w:name="figure-7-failure-cases"/>
     <w:p>
       <w:pPr>
         <w:pStyle w:val="Heading2"/>
@@ -20298,9 +21530,9 @@
         </w:pict>
       </w:r>
     </w:p>
-    <w:bookmarkEnd w:id="237"/>
     <w:bookmarkEnd w:id="238"/>
-    <w:bookmarkStart w:id="239" w:name="presentation-pitch"/>
+    <w:bookmarkEnd w:id="239"/>
+    <w:bookmarkStart w:id="240" w:name="presentation-pitch"/>
     <w:p>
       <w:pPr>
         <w:pStyle w:val="Heading1"/>
@@ -20322,7 +21554,7 @@
         <w:pStyle w:val="Compact"/>
         <w:numPr>
           <w:ilvl w:val="0"/>
-          <w:numId w:val="1026"/>
+          <w:numId w:val="1027"/>
         </w:numPr>
       </w:pPr>
       <w:r>
@@ -20334,7 +21566,7 @@
         <w:pStyle w:val="Compact"/>
         <w:numPr>
           <w:ilvl w:val="0"/>
-          <w:numId w:val="1026"/>
+          <w:numId w:val="1027"/>
         </w:numPr>
       </w:pPr>
       <w:r>
@@ -20346,7 +21578,7 @@
         <w:pStyle w:val="Compact"/>
         <w:numPr>
           <w:ilvl w:val="0"/>
-          <w:numId w:val="1026"/>
+          <w:numId w:val="1027"/>
         </w:numPr>
       </w:pPr>
       <w:r>
@@ -20358,7 +21590,7 @@
         <w:pStyle w:val="Compact"/>
         <w:numPr>
           <w:ilvl w:val="0"/>
-          <w:numId w:val="1026"/>
+          <w:numId w:val="1027"/>
         </w:numPr>
       </w:pPr>
       <w:r>
@@ -20370,7 +21602,7 @@
         <w:pStyle w:val="Compact"/>
         <w:numPr>
           <w:ilvl w:val="0"/>
-          <w:numId w:val="1026"/>
+          <w:numId w:val="1027"/>
         </w:numPr>
       </w:pPr>
       <w:r>
@@ -20382,7 +21614,7 @@
         <w:pStyle w:val="Compact"/>
         <w:numPr>
           <w:ilvl w:val="0"/>
-          <w:numId w:val="1026"/>
+          <w:numId w:val="1027"/>
         </w:numPr>
       </w:pPr>
       <w:r>
@@ -20394,7 +21626,7 @@
         <w:pStyle w:val="Compact"/>
         <w:numPr>
           <w:ilvl w:val="0"/>
-          <w:numId w:val="1026"/>
+          <w:numId w:val="1027"/>
         </w:numPr>
       </w:pPr>
       <w:r>
@@ -20406,7 +21638,7 @@
         <w:pStyle w:val="Compact"/>
         <w:numPr>
           <w:ilvl w:val="0"/>
-          <w:numId w:val="1026"/>
+          <w:numId w:val="1027"/>
         </w:numPr>
       </w:pPr>
       <w:r>
@@ -20418,7 +21650,7 @@
         <w:pStyle w:val="Compact"/>
         <w:numPr>
           <w:ilvl w:val="0"/>
-          <w:numId w:val="1026"/>
+          <w:numId w:val="1027"/>
         </w:numPr>
       </w:pPr>
       <w:r>
@@ -20430,7 +21662,7 @@
         <w:pStyle w:val="Compact"/>
         <w:numPr>
           <w:ilvl w:val="0"/>
-          <w:numId w:val="1026"/>
+          <w:numId w:val="1027"/>
         </w:numPr>
       </w:pPr>
       <w:r>
@@ -20442,7 +21674,7 @@
         <w:pStyle w:val="Compact"/>
         <w:numPr>
           <w:ilvl w:val="0"/>
-          <w:numId w:val="1026"/>
+          <w:numId w:val="1027"/>
         </w:numPr>
       </w:pPr>
       <w:r>
@@ -20454,7 +21686,7 @@
         <w:pStyle w:val="Compact"/>
         <w:numPr>
           <w:ilvl w:val="0"/>
-          <w:numId w:val="1026"/>
+          <w:numId w:val="1027"/>
         </w:numPr>
       </w:pPr>
       <w:r>
@@ -20466,7 +21698,7 @@
         <w:pStyle w:val="Compact"/>
         <w:numPr>
           <w:ilvl w:val="0"/>
-          <w:numId w:val="1026"/>
+          <w:numId w:val="1027"/>
         </w:numPr>
       </w:pPr>
       <w:r>
@@ -20480,8 +21712,8 @@
         </w:pict>
       </w:r>
     </w:p>
-    <w:bookmarkEnd w:id="239"/>
-    <w:bookmarkStart w:id="240" w:name="one-minute-oral-explanation"/>
+    <w:bookmarkEnd w:id="240"/>
+    <w:bookmarkStart w:id="241" w:name="one-minute-oral-explanation"/>
     <w:p>
       <w:pPr>
         <w:pStyle w:val="Heading1"/>
@@ -20518,7 +21750,7 @@
         <w:t xml:space="preserve">Single images are hard to edit because every scene element gets fused into one RGB canvas. My system converts that canvas into a structured layer graph. Each node is a semantic RGBA layer with a visible mask, a soft alpha, depth statistics, an estimated amodal extent, and optional albedo and shading. The edges record which layers occlude which. Instead of sorting masks by average depth, I build a boundary-weighted occlusion graph from local depth evidence near object contacts. That yields a near-to-far stack you can recompose, edit, inpaint, and animate. The evaluation doesn’t stop at segmentation metrics — it also covers layer-order accuracy, recomposition error, amodal completion quality, and actual editing demonstrations.</w:t>
       </w:r>
     </w:p>
-    <w:bookmarkEnd w:id="240"/>
+    <w:bookmarkEnd w:id="241"/>
     <w:sectPr/>
   </w:body>
 </w:document>
@@ -21135,6 +22367,9 @@
     <w:abstractNumId w:val="991"/>
   </w:num>
   <w:num w:numId="1026">
+    <w:abstractNumId w:val="991"/>
+  </w:num>
+  <w:num w:numId="1027">
     <w:abstractNumId w:val="99411"/>
     <w:lvlOverride w:ilvl="0">
       <w:startOverride w:val="1"/>

</xml_diff>

<commit_message>
docs: tighten submission evidence pack
</commit_message>
<xml_diff>
--- a/docs/final_report_pack/LayerForge_X_Final_Report_2026_04_22.docx
+++ b/docs/final_report_pack/LayerForge_X_Final_Report_2026_04_22.docx
@@ -170,7 +170,7 @@
         <w:pStyle w:val="Heading1"/>
       </w:pPr>
       <w:r>
-        <w:t xml:space="preserve">2. Related Work</w:t>
+        <w:t xml:space="preserve">3. Related Work</w:t>
       </w:r>
     </w:p>
     <w:bookmarkStart w:id="24" w:name="project-framing"/>
@@ -1918,7 +1918,7 @@
         <w:pStyle w:val="Heading1"/>
       </w:pPr>
       <w:r>
-        <w:t xml:space="preserve">3. Method</w:t>
+        <w:t xml:space="preserve">4. Method</w:t>
       </w:r>
     </w:p>
     <w:bookmarkStart w:id="39" w:name="core-idea"/>
@@ -6128,7 +6128,7 @@
         <w:pStyle w:val="Heading1"/>
       </w:pPr>
       <w:r>
-        <w:t xml:space="preserve">4. Experiments and Evaluation Protocol</w:t>
+        <w:t xml:space="preserve">5. Experiments and Evaluation Protocol</w:t>
       </w:r>
     </w:p>
     <w:bookmarkStart w:id="110" w:name="goal"/>
@@ -6257,7 +6257,7 @@
         <w:pStyle w:val="BodyText"/>
       </w:pPr>
       <w:r>
-        <w:t xml:space="preserve">For the current repository state, the completed quantitative runs are summarised in</w:t>
+        <w:t xml:space="preserve">For the current repository state, treat</w:t>
       </w:r>
       <w:r>
         <w:t xml:space="preserve"> </w:t>
@@ -6266,10 +6266,52 @@
         <w:rPr>
           <w:rStyle w:val="VerbatimChar"/>
         </w:rPr>
-        <w:t xml:space="preserve">docs/RESULTS_SUMMARY_2026_04_19.md</w:t>
-      </w:r>
-      <w:r>
-        <w:t xml:space="preserve">. That file should be treated as the source of truth for reported numbers.</w:t>
+        <w:t xml:space="preserve">PROJECT_MANIFEST.json</w:t>
+      </w:r>
+      <w:r>
+        <w:t xml:space="preserve">,</w:t>
+      </w:r>
+      <w:r>
+        <w:t xml:space="preserve"> </w:t>
+      </w:r>
+      <w:r>
+        <w:rPr>
+          <w:rStyle w:val="VerbatimChar"/>
+        </w:rPr>
+        <w:t xml:space="preserve">report_artifacts/metrics_snapshots/*.json</w:t>
+      </w:r>
+      <w:r>
+        <w:t xml:space="preserve">, and</w:t>
+      </w:r>
+      <w:r>
+        <w:t xml:space="preserve"> </w:t>
+      </w:r>
+      <w:r>
+        <w:rPr>
+          <w:rStyle w:val="VerbatimChar"/>
+        </w:rPr>
+        <w:t xml:space="preserve">report_artifacts/command_log.md</w:t>
+      </w:r>
+      <w:r>
+        <w:t xml:space="preserve"> </w:t>
+      </w:r>
+      <w:r>
+        <w:t xml:space="preserve">as the source of truth for reported numbers.</w:t>
+      </w:r>
+      <w:r>
+        <w:t xml:space="preserve"> </w:t>
+      </w:r>
+      <w:r>
+        <w:rPr>
+          <w:rStyle w:val="VerbatimChar"/>
+        </w:rPr>
+        <w:t xml:space="preserve">docs/RESULTS_SUMMARY_CURRENT.md</w:t>
+      </w:r>
+      <w:r>
+        <w:t xml:space="preserve"> </w:t>
+      </w:r>
+      <w:r>
+        <w:t xml:space="preserve">is the human-readable bridge to those artifacts.</w:t>
       </w:r>
     </w:p>
     <w:p>
@@ -12708,7 +12750,7 @@
       </w:r>
     </w:p>
     <w:bookmarkEnd w:id="169"/>
-    <w:bookmarkStart w:id="215" w:name="recommended-final-benchmark-narrative"/>
+    <w:bookmarkStart w:id="205" w:name="recommended-final-benchmark-narrative"/>
     <w:p>
       <w:pPr>
         <w:pStyle w:val="Heading1"/>
@@ -12739,7 +12781,7 @@
         <w:pStyle w:val="Heading2"/>
       </w:pPr>
       <w:r>
-        <w:t xml:space="preserve">5. Results</w:t>
+        <w:t xml:space="preserve">6. Results</w:t>
       </w:r>
     </w:p>
     <w:bookmarkStart w:id="190" w:name="hero-figures"/>
@@ -12832,7 +12874,7 @@
       <w:r>
         <w:drawing>
           <wp:inline>
-            <wp:extent cx="5334000" cy="3370384"/>
+            <wp:extent cx="5334000" cy="3165230"/>
             <wp:effectExtent b="0" l="0" r="0" t="0"/>
             <wp:docPr descr="Frontier review" title="" id="175" name="Picture"/>
             <a:graphic>
@@ -12853,7 +12895,7 @@
                   <pic:spPr bwMode="auto">
                     <a:xfrm>
                       <a:off x="0" y="0"/>
-                      <a:ext cx="5334000" cy="3370384"/>
+                      <a:ext cx="5334000" cy="3165230"/>
                     </a:xfrm>
                     <a:prstGeom prst="rect">
                       <a:avLst/>
@@ -13027,7 +13069,7 @@
       <w:r>
         <w:drawing>
           <wp:inline>
-            <wp:extent cx="5334000" cy="894470"/>
+            <wp:extent cx="5334000" cy="2872153"/>
             <wp:effectExtent b="0" l="0" r="0" t="0"/>
             <wp:docPr descr="Associated-effect demo" title="" id="187" name="Picture"/>
             <a:graphic>
@@ -13048,7 +13090,7 @@
                   <pic:spPr bwMode="auto">
                     <a:xfrm>
                       <a:off x="0" y="0"/>
-                      <a:ext cx="5334000" cy="894470"/>
+                      <a:ext cx="5334000" cy="2872153"/>
                     </a:xfrm>
                     <a:prstGeom prst="rect">
                       <a:avLst/>
@@ -15366,7 +15408,7 @@
         <w:pStyle w:val="Heading2"/>
       </w:pPr>
       <w:r>
-        <w:t xml:space="preserve">6. Discussion</w:t>
+        <w:t xml:space="preserve">7. Discussion</w:t>
       </w:r>
     </w:p>
     <w:p>
@@ -15384,7 +15426,7 @@
         <w:pStyle w:val="Heading2"/>
       </w:pPr>
       <w:r>
-        <w:t xml:space="preserve">7. Limitations</w:t>
+        <w:t xml:space="preserve">8. Limitations</w:t>
       </w:r>
     </w:p>
     <w:p>
@@ -15541,7 +15583,7 @@
         <w:pStyle w:val="Heading2"/>
       </w:pPr>
       <w:r>
-        <w:t xml:space="preserve">8. Conclusion</w:t>
+        <w:t xml:space="preserve">9. Conclusion</w:t>
       </w:r>
     </w:p>
     <w:p>
@@ -15553,21 +15595,14 @@
       </w:r>
     </w:p>
     <w:bookmarkEnd w:id="204"/>
-    <w:bookmarkStart w:id="213" w:name="appendix-a-artifact-map"/>
-    <w:p>
-      <w:pPr>
-        <w:pStyle w:val="Heading2"/>
-      </w:pPr>
-      <w:r>
-        <w:t xml:space="preserve">Appendix A: artifact map</w:t>
-      </w:r>
-    </w:p>
-    <w:p>
-      <w:pPr>
-        <w:pStyle w:val="FirstParagraph"/>
-      </w:pPr>
-      <w:r>
-        <w:t xml:space="preserve">Primary source files for the report narrative:</w:t>
+    <w:bookmarkEnd w:id="205"/>
+    <w:bookmarkStart w:id="219" w:name="references"/>
+    <w:p>
+      <w:pPr>
+        <w:pStyle w:val="Heading1"/>
+      </w:pPr>
+      <w:r>
+        <w:t xml:space="preserve">10. References</w:t>
       </w:r>
     </w:p>
     <w:p>
@@ -15578,14 +15613,9 @@
           <w:numId w:val="1023"/>
         </w:numPr>
       </w:pPr>
-      <w:hyperlink r:id="rId205">
-        <w:r>
-          <w:rPr>
-            <w:rStyle w:val="Hyperlink"/>
-          </w:rPr>
-          <w:t xml:space="preserve">../RESULTS_SUMMARY_2026_04_19.md</w:t>
-        </w:r>
-      </w:hyperlink>
+      <w:r>
+        <w:t xml:space="preserve">Shade, J., Gortler, S., He, L., and Szeliski, R. Layered Depth Images. SIGGRAPH 1998.</w:t>
+      </w:r>
     </w:p>
     <w:p>
       <w:pPr>
@@ -15595,7 +15625,306 @@
           <w:numId w:val="1023"/>
         </w:numPr>
       </w:pPr>
+      <w:r>
+        <w:t xml:space="preserve">Shih, M.-L., Su, S.-Y., Kopf, J., and Huang, J.-B. 3D Photography using Context-aware Layered Depth Inpainting. CVPR 2020.</w:t>
+      </w:r>
+    </w:p>
+    <w:p>
+      <w:pPr>
+        <w:pStyle w:val="Compact"/>
+        <w:numPr>
+          <w:ilvl w:val="0"/>
+          <w:numId w:val="1023"/>
+        </w:numPr>
+      </w:pPr>
+      <w:r>
+        <w:t xml:space="preserve">Kirillov, A. et al. Panoptic Segmentation. CVPR 2019.</w:t>
+      </w:r>
+    </w:p>
+    <w:p>
+      <w:pPr>
+        <w:pStyle w:val="Compact"/>
+        <w:numPr>
+          <w:ilvl w:val="0"/>
+          <w:numId w:val="1023"/>
+        </w:numPr>
+      </w:pPr>
+      <w:r>
+        <w:t xml:space="preserve">Cheng, B. et al. Mask2Former for Universal Image Segmentation. CVPR 2022.</w:t>
+      </w:r>
+    </w:p>
+    <w:p>
+      <w:pPr>
+        <w:pStyle w:val="Compact"/>
+        <w:numPr>
+          <w:ilvl w:val="0"/>
+          <w:numId w:val="1023"/>
+        </w:numPr>
+      </w:pPr>
+      <w:r>
+        <w:t xml:space="preserve">Liu, S. et al. Grounding DINO: Marrying DINO with Grounded Pre-Training for Open-Set Object Detection. ECCV 2024 / arXiv 2023.</w:t>
+      </w:r>
+    </w:p>
+    <w:p>
+      <w:pPr>
+        <w:pStyle w:val="Compact"/>
+        <w:numPr>
+          <w:ilvl w:val="0"/>
+          <w:numId w:val="1023"/>
+        </w:numPr>
+      </w:pPr>
+      <w:r>
+        <w:t xml:space="preserve">Ravi, N. et al. SAM 2: Segment Anything in Images and Videos. 2024.</w:t>
+      </w:r>
+    </w:p>
+    <w:p>
+      <w:pPr>
+        <w:pStyle w:val="Compact"/>
+        <w:numPr>
+          <w:ilvl w:val="0"/>
+          <w:numId w:val="1023"/>
+        </w:numPr>
+      </w:pPr>
+      <w:r>
+        <w:t xml:space="preserve">Xiao, B. et al. Florence-2: Advancing a Unified Representation for a Variety of Vision Tasks. CVPR 2024.</w:t>
+      </w:r>
+    </w:p>
+    <w:p>
+      <w:pPr>
+        <w:pStyle w:val="Compact"/>
+        <w:numPr>
+          <w:ilvl w:val="0"/>
+          <w:numId w:val="1023"/>
+        </w:numPr>
+      </w:pPr>
+      <w:r>
+        <w:t xml:space="preserve">Bochkovskiy, A. et al. Depth Pro: Sharp Monocular Metric Depth in Less Than a Second. 2024.</w:t>
+      </w:r>
+    </w:p>
+    <w:p>
+      <w:pPr>
+        <w:pStyle w:val="Compact"/>
+        <w:numPr>
+          <w:ilvl w:val="0"/>
+          <w:numId w:val="1023"/>
+        </w:numPr>
+      </w:pPr>
+      <w:r>
+        <w:t xml:space="preserve">Yang, Y. et al. Generative Image Layer Decomposition with Visual Effects. CVPR 2025.</w:t>
+      </w:r>
+    </w:p>
+    <w:p>
+      <w:pPr>
+        <w:pStyle w:val="Compact"/>
+        <w:numPr>
+          <w:ilvl w:val="0"/>
+          <w:numId w:val="1023"/>
+        </w:numPr>
+      </w:pPr>
+      <w:r>
+        <w:t xml:space="preserve">DiffDecompose: Layer-Wise Decomposition of Alpha-Composited Images via Diffusion Transformers. arXiv 2025.</w:t>
+      </w:r>
+    </w:p>
+    <w:p>
+      <w:pPr>
+        <w:pStyle w:val="Compact"/>
+        <w:numPr>
+          <w:ilvl w:val="0"/>
+          <w:numId w:val="1023"/>
+        </w:numPr>
+      </w:pPr>
+      <w:r>
+        <w:t xml:space="preserve">Referring Layer Decomposition. arXiv 2026.</w:t>
+      </w:r>
+    </w:p>
+    <w:p>
+      <w:pPr>
+        <w:pStyle w:val="Compact"/>
+        <w:numPr>
+          <w:ilvl w:val="0"/>
+          <w:numId w:val="1023"/>
+        </w:numPr>
+      </w:pPr>
+      <w:r>
+        <w:t xml:space="preserve">Qwen-Image-Layered: Towards Inherent Editability via Layer Decomposition. 2025.</w:t>
+      </w:r>
+    </w:p>
+    <w:p>
+      <w:pPr>
+        <w:pStyle w:val="Compact"/>
+        <w:numPr>
+          <w:ilvl w:val="0"/>
+          <w:numId w:val="1023"/>
+        </w:numPr>
+      </w:pPr>
+      <w:r>
+        <w:t xml:space="preserve">Yao, J. et al. Matte Anything. 2024.</w:t>
+      </w:r>
+    </w:p>
+    <w:p>
+      <w:pPr>
+        <w:pStyle w:val="Compact"/>
+        <w:numPr>
+          <w:ilvl w:val="0"/>
+          <w:numId w:val="1023"/>
+        </w:numPr>
+      </w:pPr>
+      <w:r>
+        <w:t xml:space="preserve">Suvorov, R. et al. Resolution-robust Large Mask Inpainting with Fourier Convolutions. WACV 2022.</w:t>
+      </w:r>
+    </w:p>
+    <w:p>
+      <w:pPr>
+        <w:pStyle w:val="Compact"/>
+        <w:numPr>
+          <w:ilvl w:val="0"/>
+          <w:numId w:val="1023"/>
+        </w:numPr>
+      </w:pPr>
+      <w:r>
+        <w:t xml:space="preserve">Bell, S. et al. Intrinsic Images in the Wild. SIGGRAPH 2014.</w:t>
+      </w:r>
+    </w:p>
+    <w:p>
+      <w:pPr>
+        <w:pStyle w:val="Compact"/>
+        <w:numPr>
+          <w:ilvl w:val="0"/>
+          <w:numId w:val="1023"/>
+        </w:numPr>
+      </w:pPr>
+      <w:r>
+        <w:t xml:space="preserve">Tai, Y. et al. Segment Anything, Even Occluded. 2025.</w:t>
+      </w:r>
+    </w:p>
+    <w:bookmarkStart w:id="217" w:name="appendix-a-artifact-map"/>
+    <w:p>
+      <w:pPr>
+        <w:pStyle w:val="Heading2"/>
+      </w:pPr>
+      <w:r>
+        <w:t xml:space="preserve">Appendix A: artifact map</w:t>
+      </w:r>
+    </w:p>
+    <w:p>
+      <w:pPr>
+        <w:pStyle w:val="FirstParagraph"/>
+      </w:pPr>
+      <w:r>
+        <w:t xml:space="preserve">Submission source-of-truth files:</w:t>
+      </w:r>
+    </w:p>
+    <w:p>
+      <w:pPr>
+        <w:pStyle w:val="Compact"/>
+        <w:numPr>
+          <w:ilvl w:val="0"/>
+          <w:numId w:val="1024"/>
+        </w:numPr>
+      </w:pPr>
       <w:hyperlink r:id="rId206">
+        <w:r>
+          <w:rPr>
+            <w:rStyle w:val="Hyperlink"/>
+          </w:rPr>
+          <w:t xml:space="preserve">../../PROJECT_MANIFEST.json</w:t>
+        </w:r>
+      </w:hyperlink>
+    </w:p>
+    <w:p>
+      <w:pPr>
+        <w:pStyle w:val="Compact"/>
+        <w:numPr>
+          <w:ilvl w:val="0"/>
+          <w:numId w:val="1024"/>
+        </w:numPr>
+      </w:pPr>
+      <w:hyperlink r:id="rId207">
+        <w:r>
+          <w:rPr>
+            <w:rStyle w:val="Hyperlink"/>
+          </w:rPr>
+          <w:t xml:space="preserve">../../report_artifacts/README.md</w:t>
+        </w:r>
+      </w:hyperlink>
+    </w:p>
+    <w:p>
+      <w:pPr>
+        <w:pStyle w:val="Compact"/>
+        <w:numPr>
+          <w:ilvl w:val="0"/>
+          <w:numId w:val="1024"/>
+        </w:numPr>
+      </w:pPr>
+      <w:hyperlink r:id="rId208">
+        <w:r>
+          <w:rPr>
+            <w:rStyle w:val="Hyperlink"/>
+          </w:rPr>
+          <w:t xml:space="preserve">../../report_artifacts/metrics_snapshots/</w:t>
+        </w:r>
+      </w:hyperlink>
+    </w:p>
+    <w:p>
+      <w:pPr>
+        <w:pStyle w:val="Compact"/>
+        <w:numPr>
+          <w:ilvl w:val="0"/>
+          <w:numId w:val="1024"/>
+        </w:numPr>
+      </w:pPr>
+      <w:hyperlink r:id="rId209">
+        <w:r>
+          <w:rPr>
+            <w:rStyle w:val="Hyperlink"/>
+          </w:rPr>
+          <w:t xml:space="preserve">../../report_artifacts/figure_sources/figure_manifest.json</w:t>
+        </w:r>
+      </w:hyperlink>
+    </w:p>
+    <w:p>
+      <w:pPr>
+        <w:pStyle w:val="Compact"/>
+        <w:numPr>
+          <w:ilvl w:val="0"/>
+          <w:numId w:val="1024"/>
+        </w:numPr>
+      </w:pPr>
+      <w:hyperlink r:id="rId210">
+        <w:r>
+          <w:rPr>
+            <w:rStyle w:val="Hyperlink"/>
+          </w:rPr>
+          <w:t xml:space="preserve">../../report_artifacts/command_log.md</w:t>
+        </w:r>
+      </w:hyperlink>
+    </w:p>
+    <w:p>
+      <w:pPr>
+        <w:pStyle w:val="Compact"/>
+        <w:numPr>
+          <w:ilvl w:val="0"/>
+          <w:numId w:val="1024"/>
+        </w:numPr>
+      </w:pPr>
+      <w:hyperlink r:id="rId211">
+        <w:r>
+          <w:rPr>
+            <w:rStyle w:val="Hyperlink"/>
+          </w:rPr>
+          <w:t xml:space="preserve">../RESULTS_SUMMARY_CURRENT.md</w:t>
+        </w:r>
+      </w:hyperlink>
+    </w:p>
+    <w:p>
+      <w:pPr>
+        <w:pStyle w:val="Compact"/>
+        <w:numPr>
+          <w:ilvl w:val="0"/>
+          <w:numId w:val="1024"/>
+        </w:numPr>
+      </w:pPr>
+      <w:hyperlink r:id="rId212">
         <w:r>
           <w:rPr>
             <w:rStyle w:val="Hyperlink"/>
@@ -15609,10 +15938,10 @@
         <w:pStyle w:val="Compact"/>
         <w:numPr>
           <w:ilvl w:val="0"/>
-          <w:numId w:val="1023"/>
+          <w:numId w:val="1024"/>
         </w:numPr>
       </w:pPr>
-      <w:hyperlink r:id="rId207">
+      <w:hyperlink r:id="rId213">
         <w:r>
           <w:rPr>
             <w:rStyle w:val="Hyperlink"/>
@@ -15626,10 +15955,10 @@
         <w:pStyle w:val="Compact"/>
         <w:numPr>
           <w:ilvl w:val="0"/>
-          <w:numId w:val="1023"/>
+          <w:numId w:val="1024"/>
         </w:numPr>
       </w:pPr>
-      <w:hyperlink r:id="rId208">
+      <w:hyperlink r:id="rId214">
         <w:r>
           <w:rPr>
             <w:rStyle w:val="Hyperlink"/>
@@ -15643,27 +15972,10 @@
         <w:pStyle w:val="Compact"/>
         <w:numPr>
           <w:ilvl w:val="0"/>
-          <w:numId w:val="1023"/>
+          <w:numId w:val="1024"/>
         </w:numPr>
       </w:pPr>
-      <w:hyperlink r:id="rId209">
-        <w:r>
-          <w:rPr>
-            <w:rStyle w:val="Hyperlink"/>
-          </w:rPr>
-          <w:t xml:space="preserve">../NEXT_REVIEW_CHECKLIST_2026_04_22.md</w:t>
-        </w:r>
-      </w:hyperlink>
-    </w:p>
-    <w:p>
-      <w:pPr>
-        <w:pStyle w:val="Compact"/>
-        <w:numPr>
-          <w:ilvl w:val="0"/>
-          <w:numId w:val="1023"/>
-        </w:numPr>
-      </w:pPr>
-      <w:hyperlink r:id="rId210">
+      <w:hyperlink r:id="rId215">
         <w:r>
           <w:rPr>
             <w:rStyle w:val="Hyperlink"/>
@@ -15677,10 +15989,10 @@
         <w:pStyle w:val="Compact"/>
         <w:numPr>
           <w:ilvl w:val="0"/>
-          <w:numId w:val="1023"/>
+          <w:numId w:val="1024"/>
         </w:numPr>
       </w:pPr>
-      <w:hyperlink r:id="rId211">
+      <w:hyperlink r:id="rId216">
         <w:r>
           <w:rPr>
             <w:rStyle w:val="Hyperlink"/>
@@ -15689,25 +16001,8 @@
         </w:r>
       </w:hyperlink>
     </w:p>
-    <w:p>
-      <w:pPr>
-        <w:pStyle w:val="Compact"/>
-        <w:numPr>
-          <w:ilvl w:val="0"/>
-          <w:numId w:val="1023"/>
-        </w:numPr>
-      </w:pPr>
-      <w:hyperlink r:id="rId212">
-        <w:r>
-          <w:rPr>
-            <w:rStyle w:val="Hyperlink"/>
-          </w:rPr>
-          <w:t xml:space="preserve">../../report_artifacts/command_log.md</w:t>
-        </w:r>
-      </w:hyperlink>
-    </w:p>
-    <w:bookmarkEnd w:id="213"/>
-    <w:bookmarkStart w:id="214" w:name="appendix-b-extended-tables-and-ablations"/>
+    <w:bookmarkEnd w:id="217"/>
+    <w:bookmarkStart w:id="218" w:name="appendix-b-extended-tables-and-ablations"/>
     <w:p>
       <w:pPr>
         <w:pStyle w:val="Heading2"/>
@@ -15716,9 +16011,9 @@
         <w:t xml:space="preserve">Appendix B: extended tables and ablations</w:t>
       </w:r>
     </w:p>
-    <w:bookmarkEnd w:id="214"/>
-    <w:bookmarkEnd w:id="215"/>
-    <w:bookmarkStart w:id="227" w:name="X45208ce828bed5a4ae76192024806b0334f8216"/>
+    <w:bookmarkEnd w:id="218"/>
+    <w:bookmarkEnd w:id="219"/>
+    <w:bookmarkStart w:id="235" w:name="X45208ce828bed5a4ae76192024806b0334f8216"/>
     <w:p>
       <w:pPr>
         <w:pStyle w:val="Heading1"/>
@@ -15732,10 +16027,10 @@
         <w:pStyle w:val="FirstParagraph"/>
       </w:pPr>
       <w:r>
-        <w:t xml:space="preserve">This document collects every planned ablation, every table the report needs, every figure the report needs, and the slide sequence for the presentation. It is the working document — fill values in as runs complete.</w:t>
-      </w:r>
-    </w:p>
-    <w:bookmarkStart w:id="216" w:name="completed-runs-snapshot"/>
+        <w:t xml:space="preserve">This appendix collects the extended quantitative tables, ablation templates, and failure-analysis material that support the main report.</w:t>
+      </w:r>
+    </w:p>
+    <w:bookmarkStart w:id="220" w:name="completed-runs-snapshot"/>
     <w:p>
       <w:pPr>
         <w:pStyle w:val="Heading2"/>
@@ -16158,7 +16453,7 @@
         <w:pStyle w:val="Compact"/>
         <w:numPr>
           <w:ilvl w:val="0"/>
-          <w:numId w:val="1024"/>
+          <w:numId w:val="1025"/>
         </w:numPr>
       </w:pPr>
       <w:r>
@@ -16179,7 +16474,7 @@
         <w:pStyle w:val="Compact"/>
         <w:numPr>
           <w:ilvl w:val="0"/>
-          <w:numId w:val="1024"/>
+          <w:numId w:val="1025"/>
         </w:numPr>
       </w:pPr>
       <w:r>
@@ -16221,7 +16516,7 @@
         <w:pStyle w:val="Compact"/>
         <w:numPr>
           <w:ilvl w:val="0"/>
-          <w:numId w:val="1024"/>
+          <w:numId w:val="1025"/>
         </w:numPr>
       </w:pPr>
       <w:r>
@@ -16243,8 +16538,8 @@
         <w:t xml:space="preserve">system, not more tuning on the classical baseline.</w:t>
       </w:r>
     </w:p>
-    <w:bookmarkEnd w:id="216"/>
-    <w:bookmarkStart w:id="217" w:name="frontier-candidate-bank-review"/>
+    <w:bookmarkEnd w:id="220"/>
+    <w:bookmarkStart w:id="221" w:name="frontier-candidate-bank-review"/>
     <w:p>
       <w:pPr>
         <w:pStyle w:val="Heading2"/>
@@ -16743,7 +17038,7 @@
         <w:pStyle w:val="Compact"/>
         <w:numPr>
           <w:ilvl w:val="0"/>
-          <w:numId w:val="1025"/>
+          <w:numId w:val="1026"/>
         </w:numPr>
       </w:pPr>
       <w:r>
@@ -16779,7 +17074,7 @@
         <w:pStyle w:val="Compact"/>
         <w:numPr>
           <w:ilvl w:val="0"/>
-          <w:numId w:val="1025"/>
+          <w:numId w:val="1026"/>
         </w:numPr>
       </w:pPr>
       <w:r>
@@ -16806,7 +17101,7 @@
         <w:pStyle w:val="Compact"/>
         <w:numPr>
           <w:ilvl w:val="0"/>
-          <w:numId w:val="1025"/>
+          <w:numId w:val="1026"/>
         </w:numPr>
       </w:pPr>
       <w:r>
@@ -16827,7 +17122,7 @@
         <w:pStyle w:val="Compact"/>
         <w:numPr>
           <w:ilvl w:val="0"/>
-          <w:numId w:val="1025"/>
+          <w:numId w:val="1026"/>
         </w:numPr>
       </w:pPr>
       <w:r>
@@ -16843,8 +17138,8 @@
         <w:t xml:space="preserve">remains the compact frontier generative baseline, but it is no longer the best overall editable representation once structure and editability are scored explicitly.</w:t>
       </w:r>
     </w:p>
-    <w:bookmarkEnd w:id="217"/>
-    <w:bookmarkStart w:id="218" w:name="editability-suite-snapshot"/>
+    <w:bookmarkEnd w:id="221"/>
+    <w:bookmarkStart w:id="222" w:name="editability-suite-snapshot"/>
     <w:p>
       <w:pPr>
         <w:pStyle w:val="Heading2"/>
@@ -17404,7 +17699,7 @@
         <w:pStyle w:val="Compact"/>
         <w:numPr>
           <w:ilvl w:val="0"/>
-          <w:numId w:val="1026"/>
+          <w:numId w:val="1027"/>
         </w:numPr>
       </w:pPr>
       <w:r>
@@ -17416,7 +17711,7 @@
         <w:pStyle w:val="Compact"/>
         <w:numPr>
           <w:ilvl w:val="0"/>
-          <w:numId w:val="1026"/>
+          <w:numId w:val="1027"/>
         </w:numPr>
       </w:pPr>
       <w:r>
@@ -17449,15 +17744,15 @@
         <w:pStyle w:val="Compact"/>
         <w:numPr>
           <w:ilvl w:val="0"/>
-          <w:numId w:val="1026"/>
+          <w:numId w:val="1027"/>
         </w:numPr>
       </w:pPr>
       <w:r>
         <w:t xml:space="preserve">the hybrid rows currently post the strongest edit-success scores because imported generative stacks plus explicit LayerForge graph metadata are still easy to move, recolor, and remove cleanly.</w:t>
       </w:r>
     </w:p>
-    <w:bookmarkEnd w:id="218"/>
-    <w:bookmarkStart w:id="219" w:name="promptable-extraction-benchmark-snapshot"/>
+    <w:bookmarkEnd w:id="222"/>
+    <w:bookmarkStart w:id="223" w:name="promptable-extraction-benchmark-snapshot"/>
     <w:p>
       <w:pPr>
         <w:pStyle w:val="Heading2"/>
@@ -17871,7 +18166,7 @@
         <w:pStyle w:val="Compact"/>
         <w:numPr>
           <w:ilvl w:val="0"/>
-          <w:numId w:val="1027"/>
+          <w:numId w:val="1028"/>
         </w:numPr>
       </w:pPr>
       <w:r>
@@ -17883,7 +18178,7 @@
         <w:pStyle w:val="Compact"/>
         <w:numPr>
           <w:ilvl w:val="0"/>
-          <w:numId w:val="1027"/>
+          <w:numId w:val="1028"/>
         </w:numPr>
       </w:pPr>
       <w:r>
@@ -17895,15 +18190,15 @@
         <w:pStyle w:val="Compact"/>
         <w:numPr>
           <w:ilvl w:val="0"/>
-          <w:numId w:val="1027"/>
+          <w:numId w:val="1028"/>
         </w:numPr>
       </w:pPr>
       <w:r>
         <w:t xml:space="preserve">the benchmark is therefore useful because it distinguishes semantic hit rate from overlap and alpha quality.</w:t>
       </w:r>
     </w:p>
-    <w:bookmarkEnd w:id="219"/>
-    <w:bookmarkStart w:id="220" w:name="transparent-benchmark-snapshot"/>
+    <w:bookmarkEnd w:id="223"/>
+    <w:bookmarkStart w:id="224" w:name="transparent-benchmark-snapshot"/>
     <w:p>
       <w:pPr>
         <w:pStyle w:val="Heading2"/>
@@ -18097,7 +18392,7 @@
         <w:pStyle w:val="Compact"/>
         <w:numPr>
           <w:ilvl w:val="0"/>
-          <w:numId w:val="1028"/>
+          <w:numId w:val="1029"/>
         </w:numPr>
       </w:pPr>
       <w:r>
@@ -18109,7 +18404,7 @@
         <w:pStyle w:val="Compact"/>
         <w:numPr>
           <w:ilvl w:val="0"/>
-          <w:numId w:val="1028"/>
+          <w:numId w:val="1029"/>
         </w:numPr>
       </w:pPr>
       <w:r>
@@ -18121,7 +18416,7 @@
         <w:pStyle w:val="Compact"/>
         <w:numPr>
           <w:ilvl w:val="0"/>
-          <w:numId w:val="1028"/>
+          <w:numId w:val="1029"/>
         </w:numPr>
       </w:pPr>
       <w:r>
@@ -18133,15 +18428,15 @@
         <w:pStyle w:val="Compact"/>
         <w:numPr>
           <w:ilvl w:val="0"/>
-          <w:numId w:val="1028"/>
+          <w:numId w:val="1029"/>
         </w:numPr>
       </w:pPr>
       <w:r>
         <w:t xml:space="preserve">despite that, it is now a measured component and belongs in the report as a frontier-aligned extension.</w:t>
       </w:r>
     </w:p>
-    <w:bookmarkEnd w:id="220"/>
-    <w:bookmarkStart w:id="221" w:name="main-ablation-matrix"/>
+    <w:bookmarkEnd w:id="224"/>
+    <w:bookmarkStart w:id="225" w:name="main-ablation-matrix"/>
     <w:p>
       <w:pPr>
         <w:pStyle w:val="Heading2"/>
@@ -19197,8 +19492,8 @@
         </w:pict>
       </w:r>
     </w:p>
-    <w:bookmarkEnd w:id="221"/>
-    <w:bookmarkStart w:id="222" w:name="table-1-literature-comparison"/>
+    <w:bookmarkEnd w:id="225"/>
+    <w:bookmarkStart w:id="226" w:name="table-1-literature-comparison"/>
     <w:p>
       <w:pPr>
         <w:pStyle w:val="Heading2"/>
@@ -20339,8 +20634,8 @@
         </w:pict>
       </w:r>
     </w:p>
-    <w:bookmarkEnd w:id="222"/>
-    <w:bookmarkStart w:id="223" w:name="table-2-dataset-plan"/>
+    <w:bookmarkEnd w:id="226"/>
+    <w:bookmarkStart w:id="227" w:name="table-2-dataset-plan"/>
     <w:p>
       <w:pPr>
         <w:pStyle w:val="Heading2"/>
@@ -20795,8 +21090,8 @@
         </w:pict>
       </w:r>
     </w:p>
-    <w:bookmarkEnd w:id="223"/>
-    <w:bookmarkStart w:id="224" w:name="Xfb6947bcd8c2f9aa6af13cb0f14c09ce92d779f"/>
+    <w:bookmarkEnd w:id="227"/>
+    <w:bookmarkStart w:id="228" w:name="Xfb6947bcd8c2f9aa6af13cb0f14c09ce92d779f"/>
     <w:p>
       <w:pPr>
         <w:pStyle w:val="Heading2"/>
@@ -21405,8 +21700,8 @@
         </w:pict>
       </w:r>
     </w:p>
-    <w:bookmarkEnd w:id="224"/>
-    <w:bookmarkStart w:id="225" w:name="table-4-component-ablation-template"/>
+    <w:bookmarkEnd w:id="228"/>
+    <w:bookmarkStart w:id="229" w:name="table-4-component-ablation-template"/>
     <w:p>
       <w:pPr>
         <w:pStyle w:val="Heading2"/>
@@ -21837,8 +22132,8 @@
         </w:pict>
       </w:r>
     </w:p>
-    <w:bookmarkEnd w:id="225"/>
-    <w:bookmarkStart w:id="226" w:name="table-5-failure-analysis-template"/>
+    <w:bookmarkEnd w:id="229"/>
+    <w:bookmarkStart w:id="230" w:name="table-5-failure-analysis-template"/>
     <w:p>
       <w:pPr>
         <w:pStyle w:val="Heading2"/>
@@ -22222,449 +22517,14 @@
         </w:pict>
       </w:r>
     </w:p>
-    <w:bookmarkEnd w:id="226"/>
-    <w:bookmarkEnd w:id="227"/>
-    <w:bookmarkStart w:id="235" w:name="required-figures"/>
-    <w:p>
-      <w:pPr>
-        <w:pStyle w:val="Heading1"/>
-      </w:pPr>
-      <w:r>
-        <w:t xml:space="preserve">Required figures</w:t>
-      </w:r>
-    </w:p>
-    <w:bookmarkStart w:id="228" w:name="figure-1-pipeline-diagram"/>
+    <w:bookmarkEnd w:id="230"/>
+    <w:bookmarkStart w:id="231" w:name="appendix-c-command-log"/>
     <w:p>
       <w:pPr>
         <w:pStyle w:val="Heading2"/>
       </w:pPr>
       <w:r>
-        <w:t xml:space="preserve">Figure 1: Pipeline diagram</w:t>
-      </w:r>
-    </w:p>
-    <w:p>
-      <w:pPr>
-        <w:pStyle w:val="FirstParagraph"/>
-      </w:pPr>
-      <w:r>
-        <w:t xml:space="preserve">A flow diagram in the order the pipeline runs:</w:t>
-      </w:r>
-    </w:p>
-    <w:p>
-      <w:pPr>
-        <w:pStyle w:val="SourceCode"/>
-      </w:pPr>
-      <w:r>
-        <w:rPr>
-          <w:rStyle w:val="VerbatimChar"/>
-        </w:rPr>
-        <w:t xml:space="preserve">RGB input</w:t>
-      </w:r>
-      <w:r>
-        <w:br/>
-      </w:r>
-      <w:r>
-        <w:rPr>
-          <w:rStyle w:val="VerbatimChar"/>
-        </w:rPr>
-        <w:t xml:space="preserve">→ semantic proposals</w:t>
-      </w:r>
-      <w:r>
-        <w:br/>
-      </w:r>
-      <w:r>
-        <w:rPr>
-          <w:rStyle w:val="VerbatimChar"/>
-        </w:rPr>
-        <w:t xml:space="preserve">→ monocular depth</w:t>
-      </w:r>
-      <w:r>
-        <w:br/>
-      </w:r>
-      <w:r>
-        <w:rPr>
-          <w:rStyle w:val="VerbatimChar"/>
-        </w:rPr>
-        <w:t xml:space="preserve">→ soft alpha</w:t>
-      </w:r>
-      <w:r>
-        <w:br/>
-      </w:r>
-      <w:r>
-        <w:rPr>
-          <w:rStyle w:val="VerbatimChar"/>
-        </w:rPr>
-        <w:t xml:space="preserve">→ amodal masks</w:t>
-      </w:r>
-      <w:r>
-        <w:br/>
-      </w:r>
-      <w:r>
-        <w:rPr>
-          <w:rStyle w:val="VerbatimChar"/>
-        </w:rPr>
-        <w:t xml:space="preserve">→ occlusion graph</w:t>
-      </w:r>
-      <w:r>
-        <w:br/>
-      </w:r>
-      <w:r>
-        <w:rPr>
-          <w:rStyle w:val="VerbatimChar"/>
-        </w:rPr>
-        <w:t xml:space="preserve">→ completion</w:t>
-      </w:r>
-      <w:r>
-        <w:br/>
-      </w:r>
-      <w:r>
-        <w:rPr>
-          <w:rStyle w:val="VerbatimChar"/>
-        </w:rPr>
-        <w:t xml:space="preserve">→ intrinsic split</w:t>
-      </w:r>
-      <w:r>
-        <w:br/>
-      </w:r>
-      <w:r>
-        <w:rPr>
-          <w:rStyle w:val="VerbatimChar"/>
-        </w:rPr>
-        <w:t xml:space="preserve">→ RGBA layer stack</w:t>
-      </w:r>
-    </w:p>
-    <w:bookmarkEnd w:id="228"/>
-    <w:bookmarkStart w:id="229" w:name="figure-2-dalg-representation"/>
-    <w:p>
-      <w:pPr>
-        <w:pStyle w:val="Heading2"/>
-      </w:pPr>
-      <w:r>
-        <w:t xml:space="preserve">Figure 2: DALG representation</w:t>
-      </w:r>
-    </w:p>
-    <w:p>
-      <w:pPr>
-        <w:pStyle w:val="FirstParagraph"/>
-      </w:pPr>
-      <w:r>
-        <w:t xml:space="preserve">A graph drawing. Nodes are layers; arrows are</w:t>
-      </w:r>
-      <w:r>
-        <w:t xml:space="preserve"> </w:t>
-      </w:r>
-      <w:r>
-        <w:t xml:space="preserve">“occludes”</w:t>
-      </w:r>
-      <w:r>
-        <w:t xml:space="preserve"> </w:t>
-      </w:r>
-      <w:r>
-        <w:t xml:space="preserve">edges. Use colour to distinguish semantic groups.</w:t>
-      </w:r>
-    </w:p>
-    <w:bookmarkEnd w:id="229"/>
-    <w:bookmarkStart w:id="230" w:name="figure-3-ordered-layer-contact-sheet"/>
-    <w:p>
-      <w:pPr>
-        <w:pStyle w:val="Heading2"/>
-      </w:pPr>
-      <w:r>
-        <w:t xml:space="preserve">Figure 3: Ordered layer contact sheet</w:t>
-      </w:r>
-    </w:p>
-    <w:p>
-      <w:pPr>
-        <w:pStyle w:val="FirstParagraph"/>
-      </w:pPr>
-      <w:r>
-        <w:t xml:space="preserve">All layers for a single scene, laid out near → far. This one sells the project visually better than any table.</w:t>
-      </w:r>
-    </w:p>
-    <w:p>
-      <w:pPr>
-        <w:pStyle w:val="BodyText"/>
-      </w:pPr>
-      <w:r>
-        <w:t xml:space="preserve">Measured file available now:</w:t>
-      </w:r>
-    </w:p>
-    <w:p>
-      <w:pPr>
-        <w:pStyle w:val="SourceCode"/>
-      </w:pPr>
-      <w:r>
-        <w:rPr>
-          <w:rStyle w:val="VerbatimChar"/>
-        </w:rPr>
-        <w:t xml:space="preserve">docs/figures/truck_layer_stack_comparison.png</w:t>
-      </w:r>
-    </w:p>
-    <w:bookmarkEnd w:id="230"/>
-    <w:bookmarkStart w:id="231" w:name="figure-4-baseline-vs-full"/>
-    <w:p>
-      <w:pPr>
-        <w:pStyle w:val="Heading2"/>
-      </w:pPr>
-      <w:r>
-        <w:t xml:space="preserve">Figure 4: Baseline vs full</w:t>
-      </w:r>
-    </w:p>
-    <w:p>
-      <w:pPr>
-        <w:pStyle w:val="FirstParagraph"/>
-      </w:pPr>
-      <w:r>
-        <w:t xml:space="preserve">A comparison grid. Columns step through the key ablations:</w:t>
-      </w:r>
-    </w:p>
-    <w:p>
-      <w:pPr>
-        <w:pStyle w:val="SourceCode"/>
-      </w:pPr>
-      <w:r>
-        <w:rPr>
-          <w:rStyle w:val="VerbatimChar"/>
-        </w:rPr>
-        <w:t xml:space="preserve">Input | hard masks | semantic only | depth-aware | full LayerForge-X</w:t>
-      </w:r>
-    </w:p>
-    <w:p>
-      <w:pPr>
-        <w:pStyle w:val="FirstParagraph"/>
-      </w:pPr>
-      <w:r>
-        <w:t xml:space="preserve">Rows cover a mix of domains so no single content type dominates:</w:t>
-      </w:r>
-    </w:p>
-    <w:p>
-      <w:pPr>
-        <w:pStyle w:val="SourceCode"/>
-      </w:pPr>
-      <w:r>
-        <w:rPr>
-          <w:rStyle w:val="VerbatimChar"/>
-        </w:rPr>
-        <w:t xml:space="preserve">person street</w:t>
-      </w:r>
-      <w:r>
-        <w:br/>
-      </w:r>
-      <w:r>
-        <w:rPr>
-          <w:rStyle w:val="VerbatimChar"/>
-        </w:rPr>
-        <w:t xml:space="preserve">indoor furniture</w:t>
-      </w:r>
-      <w:r>
-        <w:br/>
-      </w:r>
-      <w:r>
-        <w:rPr>
-          <w:rStyle w:val="VerbatimChar"/>
-        </w:rPr>
-        <w:t xml:space="preserve">vehicle scene</w:t>
-      </w:r>
-      <w:r>
-        <w:br/>
-      </w:r>
-      <w:r>
-        <w:rPr>
-          <w:rStyle w:val="VerbatimChar"/>
-        </w:rPr>
-        <w:t xml:space="preserve">animal scene</w:t>
-      </w:r>
-      <w:r>
-        <w:br/>
-      </w:r>
-      <w:r>
-        <w:rPr>
-          <w:rStyle w:val="VerbatimChar"/>
-        </w:rPr>
-        <w:t xml:space="preserve">anime/vector scene</w:t>
-      </w:r>
-    </w:p>
-    <w:p>
-      <w:pPr>
-        <w:pStyle w:val="FirstParagraph"/>
-      </w:pPr>
-      <w:r>
-        <w:t xml:space="preserve">Measured file available now:</w:t>
-      </w:r>
-    </w:p>
-    <w:p>
-      <w:pPr>
-        <w:pStyle w:val="SourceCode"/>
-      </w:pPr>
-      <w:r>
-        <w:rPr>
-          <w:rStyle w:val="VerbatimChar"/>
-        </w:rPr>
-        <w:t xml:space="preserve">docs/figures/truck_recomposition_comparison.png</w:t>
-      </w:r>
-    </w:p>
-    <w:bookmarkEnd w:id="231"/>
-    <w:bookmarkStart w:id="232" w:name="figure-5-occlusion-graph-improvement"/>
-    <w:p>
-      <w:pPr>
-        <w:pStyle w:val="Heading2"/>
-      </w:pPr>
-      <w:r>
-        <w:t xml:space="preserve">Figure 5: Occlusion graph improvement</w:t>
-      </w:r>
-    </w:p>
-    <w:p>
-      <w:pPr>
-        <w:pStyle w:val="FirstParagraph"/>
-      </w:pPr>
-      <w:r>
-        <w:t xml:space="preserve">Pick a single scene where the global-median-depth ordering fails and the boundary graph gets it right. Highlight the contested edge.</w:t>
-      </w:r>
-    </w:p>
-    <w:bookmarkEnd w:id="232"/>
-    <w:bookmarkStart w:id="233" w:name="figure-6-editing-demo"/>
-    <w:p>
-      <w:pPr>
-        <w:pStyle w:val="Heading2"/>
-      </w:pPr>
-      <w:r>
-        <w:t xml:space="preserve">Figure 6: Editing demo</w:t>
-      </w:r>
-    </w:p>
-    <w:p>
-      <w:pPr>
-        <w:pStyle w:val="FirstParagraph"/>
-      </w:pPr>
-      <w:r>
-        <w:t xml:space="preserve">Rows:</w:t>
-      </w:r>
-    </w:p>
-    <w:p>
-      <w:pPr>
-        <w:pStyle w:val="SourceCode"/>
-      </w:pPr>
-      <w:r>
-        <w:rPr>
-          <w:rStyle w:val="VerbatimChar"/>
-        </w:rPr>
-        <w:t xml:space="preserve">object removal</w:t>
-      </w:r>
-      <w:r>
-        <w:br/>
-      </w:r>
-      <w:r>
-        <w:rPr>
-          <w:rStyle w:val="VerbatimChar"/>
-        </w:rPr>
-        <w:t xml:space="preserve">object movement</w:t>
-      </w:r>
-      <w:r>
-        <w:br/>
-      </w:r>
-      <w:r>
-        <w:rPr>
-          <w:rStyle w:val="VerbatimChar"/>
-        </w:rPr>
-        <w:t xml:space="preserve">parallax</w:t>
-      </w:r>
-      <w:r>
-        <w:br/>
-      </w:r>
-      <w:r>
-        <w:rPr>
-          <w:rStyle w:val="VerbatimChar"/>
-        </w:rPr>
-        <w:t xml:space="preserve">albedo recolor</w:t>
-      </w:r>
-      <w:r>
-        <w:br/>
-      </w:r>
-      <w:r>
-        <w:rPr>
-          <w:rStyle w:val="VerbatimChar"/>
-        </w:rPr>
-        <w:t xml:space="preserve">background blur</w:t>
-      </w:r>
-    </w:p>
-    <w:bookmarkEnd w:id="233"/>
-    <w:bookmarkStart w:id="234" w:name="figure-7-failure-cases"/>
-    <w:p>
-      <w:pPr>
-        <w:pStyle w:val="Heading2"/>
-      </w:pPr>
-      <w:r>
-        <w:t xml:space="preserve">Figure 7: Failure cases</w:t>
-      </w:r>
-    </w:p>
-    <w:p>
-      <w:pPr>
-        <w:pStyle w:val="FirstParagraph"/>
-      </w:pPr>
-      <w:r>
-        <w:t xml:space="preserve">Do not skip this. A report without a failure-cases figure looks like the author hid the hard examples.</w:t>
-      </w:r>
-    </w:p>
-    <w:p>
-      <w:pPr>
-        <w:pStyle w:val="BodyText"/>
-      </w:pPr>
-      <w:r>
-        <w:t xml:space="preserve">Additional measured figure files already generated:</w:t>
-      </w:r>
-    </w:p>
-    <w:p>
-      <w:pPr>
-        <w:pStyle w:val="SourceCode"/>
-      </w:pPr>
-      <w:r>
-        <w:rPr>
-          <w:rStyle w:val="VerbatimChar"/>
-        </w:rPr>
-        <w:t xml:space="preserve">docs/figures/truck_metrics_comparison.png</w:t>
-      </w:r>
-      <w:r>
-        <w:br/>
-      </w:r>
-      <w:r>
-        <w:rPr>
-          <w:rStyle w:val="VerbatimChar"/>
-        </w:rPr>
-        <w:t xml:space="preserve">docs/figures/synthetic_ordering_ablation.png</w:t>
-      </w:r>
-      <w:r>
-        <w:br/>
-      </w:r>
-      <w:r>
-        <w:rPr>
-          <w:rStyle w:val="VerbatimChar"/>
-        </w:rPr>
-        <w:t xml:space="preserve">docs/figures/qualitative_gallery.png</w:t>
-      </w:r>
-    </w:p>
-    <w:p>
-      <w:r>
-        <w:pict>
-          <v:rect style="width:0;height:1.5pt" o:hralign="center" o:hrstd="t" o:hr="t"/>
-        </w:pict>
-      </w:r>
-    </w:p>
-    <w:bookmarkEnd w:id="234"/>
-    <w:bookmarkEnd w:id="235"/>
-    <w:bookmarkStart w:id="236" w:name="presentation-pitch"/>
-    <w:p>
-      <w:pPr>
-        <w:pStyle w:val="Heading1"/>
-      </w:pPr>
-      <w:r>
-        <w:t xml:space="preserve">Presentation pitch</w:t>
-      </w:r>
-    </w:p>
-    <w:p>
-      <w:pPr>
-        <w:pStyle w:val="FirstParagraph"/>
-      </w:pPr>
-      <w:r>
-        <w:t xml:space="preserve">Slide sequence for the talk:</w:t>
+        <w:t xml:space="preserve">Appendix C: command log</w:t>
       </w:r>
     </w:p>
     <w:p>
@@ -22672,11 +22532,26 @@
         <w:pStyle w:val="Compact"/>
         <w:numPr>
           <w:ilvl w:val="0"/>
-          <w:numId w:val="1029"/>
+          <w:numId w:val="1030"/>
         </w:numPr>
       </w:pPr>
-      <w:r>
-        <w:t xml:space="preserve">Problem — raster images are entangled.</w:t>
+      <w:hyperlink r:id="rId210">
+        <w:r>
+          <w:rPr>
+            <w:rStyle w:val="Hyperlink"/>
+          </w:rPr>
+          <w:t xml:space="preserve">../../report_artifacts/command_log.md</w:t>
+        </w:r>
+      </w:hyperlink>
+    </w:p>
+    <w:bookmarkEnd w:id="231"/>
+    <w:bookmarkStart w:id="234" w:name="appendix-d-extra-literature-notes"/>
+    <w:p>
+      <w:pPr>
+        <w:pStyle w:val="Heading2"/>
+      </w:pPr>
+      <w:r>
+        <w:t xml:space="preserve">Appendix D: extra literature notes</w:t>
       </w:r>
     </w:p>
     <w:p>
@@ -22684,191 +22559,37 @@
         <w:pStyle w:val="Compact"/>
         <w:numPr>
           <w:ilvl w:val="0"/>
-          <w:numId w:val="1029"/>
+          <w:numId w:val="1031"/>
         </w:numPr>
       </w:pPr>
-      <w:r>
-        <w:t xml:space="preserve">Motivation — editing needs layers.</w:t>
-      </w:r>
+      <w:hyperlink r:id="rId232">
+        <w:r>
+          <w:rPr>
+            <w:rStyle w:val="Hyperlink"/>
+          </w:rPr>
+          <w:t xml:space="preserve">../LITERATURE_REVIEW.md</w:t>
+        </w:r>
+      </w:hyperlink>
     </w:p>
     <w:p>
       <w:pPr>
         <w:pStyle w:val="Compact"/>
         <w:numPr>
           <w:ilvl w:val="0"/>
-          <w:numId w:val="1029"/>
+          <w:numId w:val="1031"/>
         </w:numPr>
       </w:pPr>
-      <w:r>
-        <w:t xml:space="preserve">Related work map — LDI → 3D photo → panoptic / open-vocab → modern layer decomposition.</w:t>
-      </w:r>
-    </w:p>
-    <w:p>
-      <w:pPr>
-        <w:pStyle w:val="Compact"/>
-        <w:numPr>
-          <w:ilvl w:val="0"/>
-          <w:numId w:val="1029"/>
-        </w:numPr>
-      </w:pPr>
-      <w:r>
-        <w:t xml:space="preserve">Key idea — Depth-Aware Amodal Layer Graph.</w:t>
-      </w:r>
-    </w:p>
-    <w:p>
-      <w:pPr>
-        <w:pStyle w:val="Compact"/>
-        <w:numPr>
-          <w:ilvl w:val="0"/>
-          <w:numId w:val="1029"/>
-        </w:numPr>
-      </w:pPr>
-      <w:r>
-        <w:t xml:space="preserve">Pipeline.</w:t>
-      </w:r>
-    </w:p>
-    <w:p>
-      <w:pPr>
-        <w:pStyle w:val="Compact"/>
-        <w:numPr>
-          <w:ilvl w:val="0"/>
-          <w:numId w:val="1029"/>
-        </w:numPr>
-      </w:pPr>
-      <w:r>
-        <w:t xml:space="preserve">Boundary-weighted occlusion graph (the algorithmic contribution slide).</w:t>
-      </w:r>
-    </w:p>
-    <w:p>
-      <w:pPr>
-        <w:pStyle w:val="Compact"/>
-        <w:numPr>
-          <w:ilvl w:val="0"/>
-          <w:numId w:val="1029"/>
-        </w:numPr>
-      </w:pPr>
-      <w:r>
-        <w:t xml:space="preserve">Outputs.</w:t>
-      </w:r>
-    </w:p>
-    <w:p>
-      <w:pPr>
-        <w:pStyle w:val="Compact"/>
-        <w:numPr>
-          <w:ilvl w:val="0"/>
-          <w:numId w:val="1029"/>
-        </w:numPr>
-      </w:pPr>
-      <w:r>
-        <w:t xml:space="preserve">Benchmark tracks.</w:t>
-      </w:r>
-    </w:p>
-    <w:p>
-      <w:pPr>
-        <w:pStyle w:val="Compact"/>
-        <w:numPr>
-          <w:ilvl w:val="0"/>
-          <w:numId w:val="1029"/>
-        </w:numPr>
-      </w:pPr>
-      <w:r>
-        <w:t xml:space="preserve">Quantitative results.</w:t>
-      </w:r>
-    </w:p>
-    <w:p>
-      <w:pPr>
-        <w:pStyle w:val="Compact"/>
-        <w:numPr>
-          <w:ilvl w:val="0"/>
-          <w:numId w:val="1029"/>
-        </w:numPr>
-      </w:pPr>
-      <w:r>
-        <w:t xml:space="preserve">Qualitative edits.</w:t>
-      </w:r>
-    </w:p>
-    <w:p>
-      <w:pPr>
-        <w:pStyle w:val="Compact"/>
-        <w:numPr>
-          <w:ilvl w:val="0"/>
-          <w:numId w:val="1029"/>
-        </w:numPr>
-      </w:pPr>
-      <w:r>
-        <w:t xml:space="preserve">Ablations.</w:t>
-      </w:r>
-    </w:p>
-    <w:p>
-      <w:pPr>
-        <w:pStyle w:val="Compact"/>
-        <w:numPr>
-          <w:ilvl w:val="0"/>
-          <w:numId w:val="1029"/>
-        </w:numPr>
-      </w:pPr>
-      <w:r>
-        <w:t xml:space="preserve">Failure cases.</w:t>
-      </w:r>
-    </w:p>
-    <w:p>
-      <w:pPr>
-        <w:pStyle w:val="Compact"/>
-        <w:numPr>
-          <w:ilvl w:val="0"/>
-          <w:numId w:val="1029"/>
-        </w:numPr>
-      </w:pPr>
-      <w:r>
-        <w:t xml:space="preserve">Conclusion.</w:t>
-      </w:r>
-    </w:p>
-    <w:p>
-      <w:r>
-        <w:pict>
-          <v:rect style="width:0;height:1.5pt" o:hralign="center" o:hrstd="t" o:hr="t"/>
-        </w:pict>
-      </w:r>
-    </w:p>
-    <w:bookmarkEnd w:id="236"/>
-    <w:bookmarkStart w:id="237" w:name="one-minute-oral-explanation"/>
-    <w:p>
-      <w:pPr>
-        <w:pStyle w:val="Heading1"/>
-      </w:pPr>
-      <w:r>
-        <w:t xml:space="preserve">One-minute oral explanation</w:t>
-      </w:r>
-    </w:p>
-    <w:p>
-      <w:pPr>
-        <w:pStyle w:val="FirstParagraph"/>
-      </w:pPr>
-      <w:r>
-        <w:t xml:space="preserve">The short script if someone asks</w:t>
-      </w:r>
-      <w:r>
-        <w:t xml:space="preserve"> </w:t>
-      </w:r>
-      <w:r>
-        <w:t xml:space="preserve">“what’s your project?”</w:t>
-      </w:r>
-      <w:r>
-        <w:t xml:space="preserve"> </w:t>
-      </w:r>
-      <w:r>
-        <w:t xml:space="preserve">at a poster session:</w:t>
-      </w:r>
-    </w:p>
-    <w:p>
-      <w:pPr>
-        <w:pStyle w:val="BodyText"/>
-      </w:pPr>
-      <w:r>
-        <w:t xml:space="preserve">Single images are hard to edit because every scene element gets fused into one RGB canvas. My system converts that canvas into a structured layer graph. Each node is a semantic RGBA layer with a visible mask, a soft alpha, depth statistics, an estimated amodal extent, and optional albedo and shading. The edges record which layers occlude which. Instead of sorting masks by average depth, I build a boundary-weighted occlusion graph from local depth evidence near object contacts. That yields a near-to-far stack you can recompose, edit, inpaint, and animate. The evaluation doesn’t stop at segmentation metrics — it also covers layer-order accuracy, recomposition error, amodal completion quality, and actual editing demonstrations.</w:t>
-      </w:r>
-    </w:p>
-    <w:bookmarkEnd w:id="237"/>
+      <w:hyperlink r:id="rId233">
+        <w:r>
+          <w:rPr>
+            <w:rStyle w:val="Hyperlink"/>
+          </w:rPr>
+          <w:t xml:space="preserve">../REFERENCES.md</w:t>
+        </w:r>
+      </w:hyperlink>
+    </w:p>
+    <w:bookmarkEnd w:id="234"/>
+    <w:bookmarkEnd w:id="235"/>
     <w:sectPr/>
   </w:body>
 </w:document>
@@ -23503,24 +23224,6 @@
     <w:abstractNumId w:val="991"/>
   </w:num>
   <w:num w:numId="1023">
-    <w:abstractNumId w:val="991"/>
-  </w:num>
-  <w:num w:numId="1024">
-    <w:abstractNumId w:val="991"/>
-  </w:num>
-  <w:num w:numId="1025">
-    <w:abstractNumId w:val="991"/>
-  </w:num>
-  <w:num w:numId="1026">
-    <w:abstractNumId w:val="991"/>
-  </w:num>
-  <w:num w:numId="1027">
-    <w:abstractNumId w:val="991"/>
-  </w:num>
-  <w:num w:numId="1028">
-    <w:abstractNumId w:val="991"/>
-  </w:num>
-  <w:num w:numId="1029">
     <w:abstractNumId w:val="99411"/>
     <w:lvlOverride w:ilvl="0">
       <w:startOverride w:val="1"/>
@@ -23549,6 +23252,30 @@
     <w:lvlOverride w:ilvl="8">
       <w:startOverride w:val="1"/>
     </w:lvlOverride>
+  </w:num>
+  <w:num w:numId="1024">
+    <w:abstractNumId w:val="991"/>
+  </w:num>
+  <w:num w:numId="1025">
+    <w:abstractNumId w:val="991"/>
+  </w:num>
+  <w:num w:numId="1026">
+    <w:abstractNumId w:val="991"/>
+  </w:num>
+  <w:num w:numId="1027">
+    <w:abstractNumId w:val="991"/>
+  </w:num>
+  <w:num w:numId="1028">
+    <w:abstractNumId w:val="991"/>
+  </w:num>
+  <w:num w:numId="1029">
+    <w:abstractNumId w:val="991"/>
+  </w:num>
+  <w:num w:numId="1030">
+    <w:abstractNumId w:val="991"/>
+  </w:num>
+  <w:num w:numId="1031">
+    <w:abstractNumId w:val="991"/>
   </w:num>
 </w:numbering>
 </file>

</xml_diff>

<commit_message>
docs: refresh formal report docx
</commit_message>
<xml_diff>
--- a/docs/final_report_pack/LayerForge_X_Final_Report_2026_04_22.docx
+++ b/docs/final_report_pack/LayerForge_X_Final_Report_2026_04_22.docx
@@ -3965,7 +3965,7 @@
         <w:pStyle w:val="FirstParagraph"/>
       </w:pPr>
       <w:r>
-        <w:t xml:space="preserve">The project is evaluated across multiple measurable properties rather than through a single qualitative comparison. A layered representation can fail in several ways:</w:t>
+        <w:t xml:space="preserve">The project is evaluated across multiple measurable properties rather than through a single qualitative comparison. A layered representation can fail in several distinct ways:</w:t>
       </w:r>
     </w:p>
     <w:p>
@@ -5296,7 +5296,7 @@
         <w:pStyle w:val="FirstParagraph"/>
       </w:pPr>
       <w:r>
-        <w:t xml:space="preserve">For images with a total ground-truth layer order, also report Kendall tau or the normalised inversion count — it’s a cleaner single number than PLOA when the order is fully defined.</w:t>
+        <w:t xml:space="preserve">For images with a total ground-truth layer order, also report Kendall tau or the normalised inversion count, which provides a compact summary when the order is fully defined.</w:t>
       </w:r>
     </w:p>
     <w:bookmarkEnd w:id="78"/>
@@ -5901,7 +5901,7 @@
         <w:pStyle w:val="FirstParagraph"/>
       </w:pPr>
       <w:r>
-        <w:t xml:space="preserve">LPIPS if it’s available. Lower is better.</w:t>
+        <w:t xml:space="preserve">LPIPS, when available. Lower values are better.</w:t>
       </w:r>
     </w:p>
     <w:bookmarkEnd w:id="86"/>

</xml_diff>

<commit_message>
docs: surface intrinsic export evidence
</commit_message>
<xml_diff>
--- a/docs/final_report_pack/LayerForge_X_Final_Report_2026_04_22.docx
+++ b/docs/final_report_pack/LayerForge_X_Final_Report_2026_04_22.docx
@@ -10558,7 +10558,7 @@
       </w:r>
     </w:p>
     <w:bookmarkEnd w:id="122"/>
-    <w:bookmarkStart w:id="158" w:name="recommended-final-benchmark-narrative"/>
+    <w:bookmarkStart w:id="162" w:name="recommended-final-benchmark-narrative"/>
     <w:p>
       <w:pPr>
         <w:pStyle w:val="Heading1"/>
@@ -10583,7 +10583,7 @@
         <w:t xml:space="preserve">We evaluate LayerForge-X across four axes: segmentation quality, layer-order correctness, recomposition fidelity, and editability. Standard panoptic metrics measure visible semantic grouping, while a synthetic layer benchmark and RGB-D datasets measure pairwise depth-order accuracy. Recomposition metrics verify that the exported RGBA stack preserves the original image. Finally, object removal, object movement, parallax, and intrinsic recolouring demonstrate that the representation is genuinely useful for editing rather than being a segmentation visualisation in disguise.</w:t>
       </w:r>
     </w:p>
-    <w:bookmarkStart w:id="152" w:name="results"/>
+    <w:bookmarkStart w:id="156" w:name="results"/>
     <w:p>
       <w:pPr>
         <w:pStyle w:val="Heading2"/>
@@ -10592,7 +10592,7 @@
         <w:t xml:space="preserve">6. Results</w:t>
       </w:r>
     </w:p>
-    <w:bookmarkStart w:id="143" w:name="hero-figures"/>
+    <w:bookmarkStart w:id="147" w:name="hero-figures"/>
     <w:p>
       <w:pPr>
         <w:pStyle w:val="Heading3"/>
@@ -10926,8 +10926,73 @@
       </w:r>
     </w:p>
     <w:bookmarkEnd w:id="142"/>
-    <w:bookmarkEnd w:id="143"/>
-    <w:bookmarkStart w:id="150" w:name="main-measured-summary"/>
+    <w:bookmarkStart w:id="146" w:name="intrinsic-export-demo"/>
+    <w:p>
+      <w:pPr>
+        <w:pStyle w:val="Heading4"/>
+      </w:pPr>
+      <w:r>
+        <w:t xml:space="preserve">Intrinsic export demo</w:t>
+      </w:r>
+    </w:p>
+    <w:p>
+      <w:pPr>
+        <w:pStyle w:val="CaptionedFigure"/>
+      </w:pPr>
+      <w:r>
+        <w:drawing>
+          <wp:inline>
+            <wp:extent cx="5334000" cy="3719763"/>
+            <wp:effectExtent b="0" l="0" r="0" t="0"/>
+            <wp:docPr descr="Intrinsic layer demo" title="" id="144" name="Picture"/>
+            <a:graphic>
+              <a:graphicData uri="http://schemas.openxmlformats.org/drawingml/2006/picture">
+                <pic:pic>
+                  <pic:nvPicPr>
+                    <pic:cNvPr descr="../figures/intrinsic_layer_demo.png" id="145" name="Picture"/>
+                    <pic:cNvPicPr>
+                      <a:picLocks noChangeArrowheads="1" noChangeAspect="1"/>
+                    </pic:cNvPicPr>
+                  </pic:nvPicPr>
+                  <pic:blipFill>
+                    <a:blip r:embed="rId143"/>
+                    <a:stretch>
+                      <a:fillRect/>
+                    </a:stretch>
+                  </pic:blipFill>
+                  <pic:spPr bwMode="auto">
+                    <a:xfrm>
+                      <a:off x="0" y="0"/>
+                      <a:ext cx="5334000" cy="3719763"/>
+                    </a:xfrm>
+                    <a:prstGeom prst="rect">
+                      <a:avLst/>
+                    </a:prstGeom>
+                    <a:noFill/>
+                    <a:ln w="9525">
+                      <a:noFill/>
+                      <a:headEnd/>
+                      <a:tailEnd/>
+                    </a:ln>
+                  </pic:spPr>
+                </pic:pic>
+              </a:graphicData>
+            </a:graphic>
+          </wp:inline>
+        </w:drawing>
+      </w:r>
+    </w:p>
+    <w:p>
+      <w:pPr>
+        <w:pStyle w:val="ImageCaption"/>
+      </w:pPr>
+      <w:r>
+        <w:t xml:space="preserve">Intrinsic layer demo</w:t>
+      </w:r>
+    </w:p>
+    <w:bookmarkEnd w:id="146"/>
+    <w:bookmarkEnd w:id="147"/>
+    <w:bookmarkStart w:id="154" w:name="main-measured-summary"/>
     <w:p>
       <w:pPr>
         <w:pStyle w:val="Heading3"/>
@@ -10974,7 +11039,7 @@
         <w:t xml:space="preserve">= Qwen plus LayerForge graph enrichment.</w:t>
       </w:r>
     </w:p>
-    <w:bookmarkStart w:id="144" w:name="five-image-qwen-raw-versus-hybrid-review"/>
+    <w:bookmarkStart w:id="148" w:name="five-image-qwen-raw-versus-hybrid-review"/>
     <w:p>
       <w:pPr>
         <w:pStyle w:val="Heading4"/>
@@ -11300,8 +11365,8 @@
         </w:tc>
       </w:tr>
     </w:tbl>
-    <w:bookmarkEnd w:id="144"/>
-    <w:bookmarkStart w:id="145" w:name="associated-effect-demo"/>
+    <w:bookmarkEnd w:id="148"/>
+    <w:bookmarkStart w:id="149" w:name="associated-effect-demo"/>
     <w:p>
       <w:pPr>
         <w:pStyle w:val="Heading4"/>
@@ -11451,8 +11516,8 @@
         </w:tc>
       </w:tr>
     </w:tbl>
-    <w:bookmarkEnd w:id="145"/>
-    <w:bookmarkStart w:id="146" w:name="X0e9e3f984752b954aaab98655e513f4cd780034"/>
+    <w:bookmarkEnd w:id="149"/>
+    <w:bookmarkStart w:id="150" w:name="X0e9e3f984752b954aaab98655e513f4cd780034"/>
     <w:p>
       <w:pPr>
         <w:pStyle w:val="Heading4"/>
@@ -11918,8 +11983,8 @@
         </w:tc>
       </w:tr>
     </w:tbl>
-    <w:bookmarkEnd w:id="146"/>
-    <w:bookmarkStart w:id="147" w:name="five-image-editability-suite"/>
+    <w:bookmarkEnd w:id="150"/>
+    <w:bookmarkStart w:id="151" w:name="five-image-editability-suite"/>
     <w:p>
       <w:pPr>
         <w:pStyle w:val="Heading4"/>
@@ -12458,8 +12523,8 @@
         </w:tc>
       </w:tr>
     </w:tbl>
-    <w:bookmarkEnd w:id="147"/>
-    <w:bookmarkStart w:id="148" w:name="promptable-extraction-benchmark-1"/>
+    <w:bookmarkEnd w:id="151"/>
+    <w:bookmarkStart w:id="152" w:name="promptable-extraction-benchmark-1"/>
     <w:p>
       <w:pPr>
         <w:pStyle w:val="Heading4"/>
@@ -12851,8 +12916,8 @@
         </w:tc>
       </w:tr>
     </w:tbl>
-    <w:bookmarkEnd w:id="148"/>
-    <w:bookmarkStart w:id="149" w:name="transparent-benchmark"/>
+    <w:bookmarkEnd w:id="152"/>
+    <w:bookmarkStart w:id="153" w:name="transparent-benchmark"/>
     <w:p>
       <w:pPr>
         <w:pStyle w:val="Heading4"/>
@@ -13025,9 +13090,9 @@
         </w:tc>
       </w:tr>
     </w:tbl>
-    <w:bookmarkEnd w:id="149"/>
-    <w:bookmarkEnd w:id="150"/>
-    <w:bookmarkStart w:id="151" w:name="interpretation"/>
+    <w:bookmarkEnd w:id="153"/>
+    <w:bookmarkEnd w:id="154"/>
+    <w:bookmarkStart w:id="155" w:name="interpretation"/>
     <w:p>
       <w:pPr>
         <w:pStyle w:val="Heading3"/>
@@ -13208,9 +13273,21 @@
         <w:t xml:space="preserve">The associated-effect path now has a real exported demo artifact with a materially improved clean-reference rerun, but it must still be framed as an early heuristic rather than a solved component.</w:t>
       </w:r>
     </w:p>
-    <w:bookmarkEnd w:id="151"/>
-    <w:bookmarkEnd w:id="152"/>
-    <w:bookmarkStart w:id="153" w:name="discussion"/>
+    <w:p>
+      <w:pPr>
+        <w:pStyle w:val="Compact"/>
+        <w:numPr>
+          <w:ilvl w:val="0"/>
+          <w:numId w:val="1016"/>
+        </w:numPr>
+      </w:pPr>
+      <w:r>
+        <w:t xml:space="preserve">The intrinsic export path is present as a Retinex-style stretch module. The new intrinsic demo figure should be read as evidence of exported appearance factors for recolouring-style edits, not as a state-of-the-art intrinsic benchmark.</w:t>
+      </w:r>
+    </w:p>
+    <w:bookmarkEnd w:id="155"/>
+    <w:bookmarkEnd w:id="156"/>
+    <w:bookmarkStart w:id="157" w:name="discussion"/>
     <w:p>
       <w:pPr>
         <w:pStyle w:val="Heading2"/>
@@ -13227,8 +13304,8 @@
         <w:t xml:space="preserve">The strongest reading of the current results is not that LayerForge-X universally beats generative decomposers on raw pixels. The stronger claim is that it turns native, generative, and recursive decompositions into one explicit editable graph representation with auditable metrics and exportable structure. Qwen remains the right generative RGBA baseline. LayerForge-X remains strongest when framed as a graph-aware, benchmarkable, editability-oriented complement to that frontier.</w:t>
       </w:r>
     </w:p>
-    <w:bookmarkEnd w:id="153"/>
-    <w:bookmarkStart w:id="156" w:name="limitations"/>
+    <w:bookmarkEnd w:id="157"/>
+    <w:bookmarkStart w:id="160" w:name="limitations"/>
     <w:p>
       <w:pPr>
         <w:pStyle w:val="Heading2"/>
@@ -13247,7 +13324,7 @@
       <w:r>
         <w:t xml:space="preserve"> </w:t>
       </w:r>
-      <w:hyperlink r:id="rId154">
+      <w:hyperlink r:id="rId158">
         <w:r>
           <w:rPr>
             <w:rStyle w:val="Hyperlink"/>
@@ -13264,7 +13341,7 @@
       <w:r>
         <w:t xml:space="preserve"> </w:t>
       </w:r>
-      <w:hyperlink r:id="rId155">
+      <w:hyperlink r:id="rId159">
         <w:r>
           <w:rPr>
             <w:rStyle w:val="Hyperlink"/>
@@ -13384,8 +13461,8 @@
         <w:t xml:space="preserve">transparent-layer recovery that is still approximate rather than generative.</w:t>
       </w:r>
     </w:p>
-    <w:bookmarkEnd w:id="156"/>
-    <w:bookmarkStart w:id="157" w:name="conclusion"/>
+    <w:bookmarkEnd w:id="160"/>
+    <w:bookmarkStart w:id="161" w:name="conclusion"/>
     <w:p>
       <w:pPr>
         <w:pStyle w:val="Heading2"/>
@@ -13402,9 +13479,9 @@
         <w:t xml:space="preserve">LayerForge-X is now best understood as a self-evaluating layer-representation system rather than a simple decomposition script. It can produce native graph layers, enrich frontier RGBA layers, run recursive peeling, measure editability, benchmark prompt extraction, approximate transparent recovery, and export a canonical DALG manifest. That combination is the core project contribution.</w:t>
       </w:r>
     </w:p>
-    <w:bookmarkEnd w:id="157"/>
-    <w:bookmarkEnd w:id="158"/>
-    <w:bookmarkStart w:id="172" w:name="references"/>
+    <w:bookmarkEnd w:id="161"/>
+    <w:bookmarkEnd w:id="162"/>
+    <w:bookmarkStart w:id="176" w:name="references"/>
     <w:p>
       <w:pPr>
         <w:pStyle w:val="Heading1"/>
@@ -13605,7 +13682,7 @@
         <w:t xml:space="preserve">Tai, Y. et al. Segment Anything, Even Occluded. 2025.</w:t>
       </w:r>
     </w:p>
-    <w:bookmarkStart w:id="170" w:name="appendix-a-artifact-map"/>
+    <w:bookmarkStart w:id="174" w:name="appendix-a-artifact-map"/>
     <w:p>
       <w:pPr>
         <w:pStyle w:val="Heading2"/>
@@ -13630,7 +13707,7 @@
           <w:numId w:val="1019"/>
         </w:numPr>
       </w:pPr>
-      <w:hyperlink r:id="rId159">
+      <w:hyperlink r:id="rId163">
         <w:r>
           <w:rPr>
             <w:rStyle w:val="Hyperlink"/>
@@ -13647,7 +13724,7 @@
           <w:numId w:val="1019"/>
         </w:numPr>
       </w:pPr>
-      <w:hyperlink r:id="rId160">
+      <w:hyperlink r:id="rId164">
         <w:r>
           <w:rPr>
             <w:rStyle w:val="Hyperlink"/>
@@ -13664,7 +13741,7 @@
           <w:numId w:val="1019"/>
         </w:numPr>
       </w:pPr>
-      <w:hyperlink r:id="rId161">
+      <w:hyperlink r:id="rId165">
         <w:r>
           <w:rPr>
             <w:rStyle w:val="Hyperlink"/>
@@ -13681,7 +13758,7 @@
           <w:numId w:val="1019"/>
         </w:numPr>
       </w:pPr>
-      <w:hyperlink r:id="rId162">
+      <w:hyperlink r:id="rId166">
         <w:r>
           <w:rPr>
             <w:rStyle w:val="Hyperlink"/>
@@ -13698,7 +13775,7 @@
           <w:numId w:val="1019"/>
         </w:numPr>
       </w:pPr>
-      <w:hyperlink r:id="rId163">
+      <w:hyperlink r:id="rId167">
         <w:r>
           <w:rPr>
             <w:rStyle w:val="Hyperlink"/>
@@ -13715,7 +13792,7 @@
           <w:numId w:val="1019"/>
         </w:numPr>
       </w:pPr>
-      <w:hyperlink r:id="rId164">
+      <w:hyperlink r:id="rId168">
         <w:r>
           <w:rPr>
             <w:rStyle w:val="Hyperlink"/>
@@ -13732,7 +13809,7 @@
           <w:numId w:val="1019"/>
         </w:numPr>
       </w:pPr>
-      <w:hyperlink r:id="rId165">
+      <w:hyperlink r:id="rId169">
         <w:r>
           <w:rPr>
             <w:rStyle w:val="Hyperlink"/>
@@ -13749,7 +13826,7 @@
           <w:numId w:val="1019"/>
         </w:numPr>
       </w:pPr>
-      <w:hyperlink r:id="rId166">
+      <w:hyperlink r:id="rId170">
         <w:r>
           <w:rPr>
             <w:rStyle w:val="Hyperlink"/>
@@ -13766,7 +13843,7 @@
           <w:numId w:val="1019"/>
         </w:numPr>
       </w:pPr>
-      <w:hyperlink r:id="rId167">
+      <w:hyperlink r:id="rId171">
         <w:r>
           <w:rPr>
             <w:rStyle w:val="Hyperlink"/>
@@ -13783,7 +13860,7 @@
           <w:numId w:val="1019"/>
         </w:numPr>
       </w:pPr>
-      <w:hyperlink r:id="rId168">
+      <w:hyperlink r:id="rId172">
         <w:r>
           <w:rPr>
             <w:rStyle w:val="Hyperlink"/>
@@ -13800,7 +13877,7 @@
           <w:numId w:val="1019"/>
         </w:numPr>
       </w:pPr>
-      <w:hyperlink r:id="rId169">
+      <w:hyperlink r:id="rId173">
         <w:r>
           <w:rPr>
             <w:rStyle w:val="Hyperlink"/>
@@ -13809,8 +13886,8 @@
         </w:r>
       </w:hyperlink>
     </w:p>
-    <w:bookmarkEnd w:id="170"/>
-    <w:bookmarkStart w:id="171" w:name="appendix-b-extended-tables-and-ablations"/>
+    <w:bookmarkEnd w:id="174"/>
+    <w:bookmarkStart w:id="175" w:name="appendix-b-extended-tables-and-ablations"/>
     <w:p>
       <w:pPr>
         <w:pStyle w:val="Heading2"/>
@@ -13819,9 +13896,9 @@
         <w:t xml:space="preserve">Appendix B: extended tables and ablations</w:t>
       </w:r>
     </w:p>
-    <w:bookmarkEnd w:id="171"/>
-    <w:bookmarkEnd w:id="172"/>
-    <w:bookmarkStart w:id="186" w:name="X45208ce828bed5a4ae76192024806b0334f8216"/>
+    <w:bookmarkEnd w:id="175"/>
+    <w:bookmarkEnd w:id="176"/>
+    <w:bookmarkStart w:id="191" w:name="X45208ce828bed5a4ae76192024806b0334f8216"/>
     <w:p>
       <w:pPr>
         <w:pStyle w:val="Heading1"/>
@@ -13838,7 +13915,7 @@
         <w:t xml:space="preserve">This appendix collects the extended quantitative tables, measured ablations, and failure-taxonomy material that support the main report.</w:t>
       </w:r>
     </w:p>
-    <w:bookmarkStart w:id="173" w:name="b.1-completed-runs-snapshot"/>
+    <w:bookmarkStart w:id="177" w:name="b.1-completed-runs-snapshot"/>
     <w:p>
       <w:pPr>
         <w:pStyle w:val="Heading2"/>
@@ -14346,8 +14423,8 @@
         <w:t xml:space="preserve">system rather than further tuning of the deterministic baseline.</w:t>
       </w:r>
     </w:p>
-    <w:bookmarkEnd w:id="173"/>
-    <w:bookmarkStart w:id="174" w:name="b.2-frontier-candidate-bank-review"/>
+    <w:bookmarkEnd w:id="177"/>
+    <w:bookmarkStart w:id="178" w:name="b.2-frontier-candidate-bank-review"/>
     <w:p>
       <w:pPr>
         <w:pStyle w:val="Heading2"/>
@@ -14919,8 +14996,8 @@
         <w:t xml:space="preserve">remains the compact generative baseline, but it is no longer the strongest editable representation once structure and editability are scored explicitly.</w:t>
       </w:r>
     </w:p>
-    <w:bookmarkEnd w:id="174"/>
-    <w:bookmarkStart w:id="175" w:name="b.3-editability-suite"/>
+    <w:bookmarkEnd w:id="178"/>
+    <w:bookmarkStart w:id="179" w:name="b.3-editability-suite"/>
     <w:p>
       <w:pPr>
         <w:pStyle w:val="Heading2"/>
@@ -15532,8 +15609,8 @@
         <w:t xml:space="preserve">the hybrid rows currently post the strongest edit-success scores because imported generative stacks combined with explicit LayerForge graph metadata remain easy to move, recolor, and remove cleanly.</w:t>
       </w:r>
     </w:p>
-    <w:bookmarkEnd w:id="175"/>
-    <w:bookmarkStart w:id="176" w:name="b.4-promptable-extraction-benchmark"/>
+    <w:bookmarkEnd w:id="179"/>
+    <w:bookmarkStart w:id="180" w:name="b.4-promptable-extraction-benchmark"/>
     <w:p>
       <w:pPr>
         <w:pStyle w:val="Heading2"/>
@@ -15978,8 +16055,8 @@
         <w:t xml:space="preserve">the present bottleneck is semantic routing rather than matte stability.</w:t>
       </w:r>
     </w:p>
-    <w:bookmarkEnd w:id="176"/>
-    <w:bookmarkStart w:id="177" w:name="b.5-transparent-benchmark"/>
+    <w:bookmarkEnd w:id="180"/>
+    <w:bookmarkStart w:id="181" w:name="b.5-transparent-benchmark"/>
     <w:p>
       <w:pPr>
         <w:pStyle w:val="Heading2"/>
@@ -16204,8 +16281,8 @@
         <w:t xml:space="preserve">the prototype is strongest on flare-like overlays and weakest on the semi-transparent panel variant.</w:t>
       </w:r>
     </w:p>
-    <w:bookmarkEnd w:id="177"/>
-    <w:bookmarkStart w:id="178" w:name="b.6-main-ablation-matrix"/>
+    <w:bookmarkEnd w:id="181"/>
+    <w:bookmarkStart w:id="182" w:name="b.6-main-ablation-matrix"/>
     <w:p>
       <w:pPr>
         <w:pStyle w:val="Heading2"/>
@@ -17246,8 +17323,8 @@
         </w:tc>
       </w:tr>
     </w:tbl>
-    <w:bookmarkEnd w:id="178"/>
-    <w:bookmarkStart w:id="179" w:name="b.7-literature-comparison"/>
+    <w:bookmarkEnd w:id="182"/>
+    <w:bookmarkStart w:id="183" w:name="b.7-literature-comparison"/>
     <w:p>
       <w:pPr>
         <w:pStyle w:val="Heading2"/>
@@ -18358,8 +18435,8 @@
         </w:tc>
       </w:tr>
     </w:tbl>
-    <w:bookmarkEnd w:id="179"/>
-    <w:bookmarkStart w:id="180" w:name="b.8-dataset-coverage"/>
+    <w:bookmarkEnd w:id="183"/>
+    <w:bookmarkStart w:id="184" w:name="b.8-dataset-coverage"/>
     <w:p>
       <w:pPr>
         <w:pStyle w:val="Heading2"/>
@@ -18799,8 +18876,8 @@
         </w:tc>
       </w:tr>
     </w:tbl>
-    <w:bookmarkEnd w:id="180"/>
-    <w:bookmarkStart w:id="181" w:name="b.9-failure-taxonomy"/>
+    <w:bookmarkEnd w:id="184"/>
+    <w:bookmarkStart w:id="185" w:name="b.9-failure-taxonomy"/>
     <w:p>
       <w:pPr>
         <w:pStyle w:val="Heading2"/>
@@ -19286,14 +19363,221 @@
         </w:tc>
       </w:tr>
     </w:tbl>
-    <w:bookmarkEnd w:id="181"/>
-    <w:bookmarkStart w:id="182" w:name="appendix-c-command-log"/>
+    <w:bookmarkEnd w:id="185"/>
+    <w:bookmarkStart w:id="186" w:name="b.10-intrinsic-export-snapshot"/>
     <w:p>
       <w:pPr>
         <w:pStyle w:val="Heading2"/>
       </w:pPr>
       <w:r>
-        <w:t xml:space="preserve">Appendix C: command log</w:t>
+        <w:t xml:space="preserve">B.10 Intrinsic export snapshot</w:t>
+      </w:r>
+    </w:p>
+    <w:p>
+      <w:pPr>
+        <w:pStyle w:val="FirstParagraph"/>
+      </w:pPr>
+      <w:r>
+        <w:t xml:space="preserve">The optional intrinsic path is implemented as an approximate appearance-factor export rather than as a standalone intrinsic-image benchmark. The measured truck winner currently provides both global and per-layer albedo/shading artifacts.</w:t>
+      </w:r>
+    </w:p>
+    <w:tbl>
+      <w:tblPr>
+        <w:tblStyle w:val="Table"/>
+        <w:tblW w:type="pct" w:w="5000"/>
+        <w:tblLayout w:type="fixed"/>
+        <w:tblLook w:firstRow="1" w:lastRow="0" w:firstColumn="0" w:lastColumn="0" w:noHBand="0" w:noVBand="0" w:val="0020"/>
+      </w:tblPr>
+      <w:tblGrid>
+        <w:gridCol w:w="1033"/>
+        <w:gridCol w:w="1033"/>
+        <w:gridCol w:w="1033"/>
+        <w:gridCol w:w="1033"/>
+        <w:gridCol w:w="1377"/>
+        <w:gridCol w:w="1377"/>
+        <w:gridCol w:w="1033"/>
+      </w:tblGrid>
+      <w:tr>
+        <w:trPr>
+          <w:tblHeader w:val="on"/>
+        </w:trPr>
+        <w:tc>
+          <w:tcPr/>
+          <w:p>
+            <w:pPr>
+              <w:pStyle w:val="Compact"/>
+            </w:pPr>
+            <w:r>
+              <w:t xml:space="preserve">Run</w:t>
+            </w:r>
+          </w:p>
+        </w:tc>
+        <w:tc>
+          <w:tcPr/>
+          <w:p>
+            <w:pPr>
+              <w:pStyle w:val="Compact"/>
+            </w:pPr>
+            <w:r>
+              <w:t xml:space="preserve">Intrinsic method</w:t>
+            </w:r>
+          </w:p>
+        </w:tc>
+        <w:tc>
+          <w:tcPr/>
+          <w:p>
+            <w:pPr>
+              <w:pStyle w:val="Compact"/>
+            </w:pPr>
+            <w:r>
+              <w:t xml:space="preserve">Global albedo</w:t>
+            </w:r>
+          </w:p>
+        </w:tc>
+        <w:tc>
+          <w:tcPr/>
+          <w:p>
+            <w:pPr>
+              <w:pStyle w:val="Compact"/>
+            </w:pPr>
+            <w:r>
+              <w:t xml:space="preserve">Global shading</w:t>
+            </w:r>
+          </w:p>
+        </w:tc>
+        <w:tc>
+          <w:tcPr/>
+          <w:p>
+            <w:pPr>
+              <w:pStyle w:val="Compact"/>
+              <w:jc w:val="right"/>
+            </w:pPr>
+            <w:r>
+              <w:t xml:space="preserve">Per-layer albedo exports</w:t>
+            </w:r>
+          </w:p>
+        </w:tc>
+        <w:tc>
+          <w:tcPr/>
+          <w:p>
+            <w:pPr>
+              <w:pStyle w:val="Compact"/>
+              <w:jc w:val="right"/>
+            </w:pPr>
+            <w:r>
+              <w:t xml:space="preserve">Per-layer shading exports</w:t>
+            </w:r>
+          </w:p>
+        </w:tc>
+        <w:tc>
+          <w:tcPr/>
+          <w:p>
+            <w:pPr>
+              <w:pStyle w:val="Compact"/>
+            </w:pPr>
+            <w:r>
+              <w:t xml:space="preserve">Representative layer</w:t>
+            </w:r>
+          </w:p>
+        </w:tc>
+      </w:tr>
+      <w:tr>
+        <w:tc>
+          <w:tcPr/>
+          <w:p>
+            <w:pPr>
+              <w:pStyle w:val="Compact"/>
+            </w:pPr>
+            <w:r>
+              <w:rPr>
+                <w:rStyle w:val="VerbatimChar"/>
+              </w:rPr>
+              <w:t xml:space="preserve">truck_candidate_search_v2/best</w:t>
+            </w:r>
+          </w:p>
+        </w:tc>
+        <w:tc>
+          <w:tcPr/>
+          <w:p>
+            <w:pPr>
+              <w:pStyle w:val="Compact"/>
+            </w:pPr>
+            <w:r>
+              <w:rPr>
+                <w:rStyle w:val="VerbatimChar"/>
+              </w:rPr>
+              <w:t xml:space="preserve">retinex</w:t>
+            </w:r>
+          </w:p>
+        </w:tc>
+        <w:tc>
+          <w:tcPr/>
+          <w:p>
+            <w:pPr>
+              <w:pStyle w:val="Compact"/>
+            </w:pPr>
+            <w:r>
+              <w:t xml:space="preserve">yes</w:t>
+            </w:r>
+          </w:p>
+        </w:tc>
+        <w:tc>
+          <w:tcPr/>
+          <w:p>
+            <w:pPr>
+              <w:pStyle w:val="Compact"/>
+            </w:pPr>
+            <w:r>
+              <w:t xml:space="preserve">yes</w:t>
+            </w:r>
+          </w:p>
+        </w:tc>
+        <w:tc>
+          <w:tcPr/>
+          <w:p>
+            <w:pPr>
+              <w:pStyle w:val="Compact"/>
+              <w:jc w:val="right"/>
+            </w:pPr>
+            <w:r>
+              <w:t xml:space="preserve">20</w:t>
+            </w:r>
+          </w:p>
+        </w:tc>
+        <w:tc>
+          <w:tcPr/>
+          <w:p>
+            <w:pPr>
+              <w:pStyle w:val="Compact"/>
+              <w:jc w:val="right"/>
+            </w:pPr>
+            <w:r>
+              <w:t xml:space="preserve">20</w:t>
+            </w:r>
+          </w:p>
+        </w:tc>
+        <w:tc>
+          <w:tcPr/>
+          <w:p>
+            <w:pPr>
+              <w:pStyle w:val="Compact"/>
+            </w:pPr>
+            <w:r>
+              <w:rPr>
+                <w:rStyle w:val="VerbatimChar"/>
+              </w:rPr>
+              <w:t xml:space="preserve">007_vehicle_car</w:t>
+            </w:r>
+          </w:p>
+        </w:tc>
+      </w:tr>
+    </w:tbl>
+    <w:p>
+      <w:pPr>
+        <w:pStyle w:val="BodyText"/>
+      </w:pPr>
+      <w:r>
+        <w:t xml:space="preserve">Interpretation:</w:t>
       </w:r>
     </w:p>
     <w:p>
@@ -19304,7 +19588,65 @@
           <w:numId w:val="1025"/>
         </w:numPr>
       </w:pPr>
-      <w:hyperlink r:id="rId163">
+      <w:r>
+        <w:t xml:space="preserve">the exported albedo and shading layers support recolouring-style demonstrations and inspection of appearance factors on top of the primary layer graph;</w:t>
+      </w:r>
+    </w:p>
+    <w:p>
+      <w:pPr>
+        <w:pStyle w:val="Compact"/>
+        <w:numPr>
+          <w:ilvl w:val="0"/>
+          <w:numId w:val="1025"/>
+        </w:numPr>
+      </w:pPr>
+      <w:r>
+        <w:t xml:space="preserve">the factorization remains approximate and is therefore treated as a stretch component rather than as a headline benchmark claim;</w:t>
+      </w:r>
+    </w:p>
+    <w:p>
+      <w:pPr>
+        <w:pStyle w:val="Compact"/>
+        <w:numPr>
+          <w:ilvl w:val="0"/>
+          <w:numId w:val="1025"/>
+        </w:numPr>
+      </w:pPr>
+      <w:r>
+        <w:t xml:space="preserve">the corresponding visual evidence is documented in</w:t>
+      </w:r>
+      <w:r>
+        <w:t xml:space="preserve"> </w:t>
+      </w:r>
+      <w:r>
+        <w:rPr>
+          <w:rStyle w:val="VerbatimChar"/>
+        </w:rPr>
+        <w:t xml:space="preserve">docs/figures/intrinsic_layer_demo.png</w:t>
+      </w:r>
+      <w:r>
+        <w:t xml:space="preserve">.</w:t>
+      </w:r>
+    </w:p>
+    <w:bookmarkEnd w:id="186"/>
+    <w:bookmarkStart w:id="187" w:name="appendix-c-command-log"/>
+    <w:p>
+      <w:pPr>
+        <w:pStyle w:val="Heading2"/>
+      </w:pPr>
+      <w:r>
+        <w:t xml:space="preserve">Appendix C: command log</w:t>
+      </w:r>
+    </w:p>
+    <w:p>
+      <w:pPr>
+        <w:pStyle w:val="Compact"/>
+        <w:numPr>
+          <w:ilvl w:val="0"/>
+          <w:numId w:val="1026"/>
+        </w:numPr>
+      </w:pPr>
+      <w:hyperlink r:id="rId167">
         <w:r>
           <w:rPr>
             <w:rStyle w:val="Hyperlink"/>
@@ -19313,8 +19655,8 @@
         </w:r>
       </w:hyperlink>
     </w:p>
-    <w:bookmarkEnd w:id="182"/>
-    <w:bookmarkStart w:id="185" w:name="appendix-d-extra-literature-notes"/>
+    <w:bookmarkEnd w:id="187"/>
+    <w:bookmarkStart w:id="190" w:name="appendix-d-extra-literature-notes"/>
     <w:p>
       <w:pPr>
         <w:pStyle w:val="Heading2"/>
@@ -19328,10 +19670,10 @@
         <w:pStyle w:val="Compact"/>
         <w:numPr>
           <w:ilvl w:val="0"/>
-          <w:numId w:val="1026"/>
+          <w:numId w:val="1027"/>
         </w:numPr>
       </w:pPr>
-      <w:hyperlink r:id="rId183">
+      <w:hyperlink r:id="rId188">
         <w:r>
           <w:rPr>
             <w:rStyle w:val="Hyperlink"/>
@@ -19345,10 +19687,10 @@
         <w:pStyle w:val="Compact"/>
         <w:numPr>
           <w:ilvl w:val="0"/>
-          <w:numId w:val="1026"/>
+          <w:numId w:val="1027"/>
         </w:numPr>
       </w:pPr>
-      <w:hyperlink r:id="rId184">
+      <w:hyperlink r:id="rId189">
         <w:r>
           <w:rPr>
             <w:rStyle w:val="Hyperlink"/>
@@ -19357,8 +19699,8 @@
         </w:r>
       </w:hyperlink>
     </w:p>
-    <w:bookmarkEnd w:id="185"/>
-    <w:bookmarkEnd w:id="186"/>
+    <w:bookmarkEnd w:id="190"/>
+    <w:bookmarkEnd w:id="191"/>
     <w:sectPr/>
   </w:body>
 </w:document>
@@ -19948,6 +20290,9 @@
     <w:abstractNumId w:val="991"/>
   </w:num>
   <w:num w:numId="1026">
+    <w:abstractNumId w:val="991"/>
+  </w:num>
+  <w:num w:numId="1027">
     <w:abstractNumId w:val="991"/>
   </w:num>
 </w:numbering>

</xml_diff>

<commit_message>
docs: formalize report pack language
</commit_message>
<xml_diff>
--- a/docs/final_report_pack/LayerForge_X_Final_Report_2026_04_22.docx
+++ b/docs/final_report_pack/LayerForge_X_Final_Report_2026_04_22.docx
@@ -3068,7 +3068,7 @@
         <w:pStyle w:val="FirstParagraph"/>
       </w:pPr>
       <w:r>
-        <w:t xml:space="preserve">A simple heuristic is used in the current repository:</w:t>
+        <w:t xml:space="preserve">The current repository uses a lightweight heuristic:</w:t>
       </w:r>
     </w:p>
     <w:p>
@@ -4065,7 +4065,7 @@
         <w:pStyle w:val="BodyText"/>
       </w:pPr>
       <w:r>
-        <w:t xml:space="preserve">For the current repository state, treat</w:t>
+        <w:t xml:space="preserve">For the present repository state, treat</w:t>
       </w:r>
       <w:r>
         <w:t xml:space="preserve"> </w:t>
@@ -4119,7 +4119,7 @@
         <w:t xml:space="preserve"> </w:t>
       </w:r>
       <w:r>
-        <w:t xml:space="preserve">is the human-readable bridge to those artifacts.</w:t>
+        <w:t xml:space="preserve">provides a prose summary of those artifacts.</w:t>
       </w:r>
     </w:p>
     <w:p>
@@ -4880,7 +4880,7 @@
         <w:pStyle w:val="BodyText"/>
       </w:pPr>
       <w:r>
-        <w:t xml:space="preserve">For the current repo state, note the distinction clearly:</w:t>
+        <w:t xml:space="preserve">For the present repository state, note the distinction clearly:</w:t>
       </w:r>
     </w:p>
     <w:p>
@@ -7461,7 +7461,7 @@
         <w:pStyle w:val="FirstParagraph"/>
       </w:pPr>
       <w:r>
-        <w:t xml:space="preserve">The whole point of layers is editing. The most compelling final section should demonstrate that the representation supports practical operations, not just that it scores well on segmentation benchmarks.</w:t>
+        <w:t xml:space="preserve">The principal motivation for layered representations is editing. The evaluation should therefore demonstrate that the representation supports practical operations rather than only scoring well on segmentation benchmarks.</w:t>
       </w:r>
     </w:p>
     <w:bookmarkEnd w:id="106"/>
@@ -8495,7 +8495,7 @@
         <w:pStyle w:val="FirstParagraph"/>
       </w:pPr>
       <w:r>
-        <w:t xml:space="preserve">The repo now supports:</w:t>
+        <w:t xml:space="preserve">The repository currently supports:</w:t>
       </w:r>
     </w:p>
     <w:p>
@@ -8781,7 +8781,7 @@
         <w:pStyle w:val="FirstParagraph"/>
       </w:pPr>
       <w:r>
-        <w:t xml:space="preserve">Run a controlled set where one component changes at a time. The reason to do this rather than one giant comparison is simple: only this kind of diff can attribute credit to an individual component.</w:t>
+        <w:t xml:space="preserve">Run a controlled set in which one component changes at a time. Only this type of comparison can attribute gains to a specific component.</w:t>
       </w:r>
     </w:p>
     <w:tbl>
@@ -13206,7 +13206,7 @@
         <w:t xml:space="preserve"> </w:t>
       </w:r>
       <w:r>
-        <w:t xml:space="preserve">row is the fair metadata-first hybrid comparison because it keeps the</w:t>
+        <w:t xml:space="preserve">row is the most direct metadata-first hybrid comparison because it keeps the</w:t>
       </w:r>
       <w:r>
         <w:t xml:space="preserve"> </w:t>
@@ -13301,7 +13301,7 @@
         <w:pStyle w:val="FirstParagraph"/>
       </w:pPr>
       <w:r>
-        <w:t xml:space="preserve">The strongest reading of the current results is not that LayerForge-X universally beats generative decomposers on raw pixels. The stronger claim is that it turns native, generative, and recursive decompositions into one explicit editable graph representation with auditable metrics and exportable structure. Qwen remains the right generative RGBA baseline. LayerForge-X remains strongest when framed as a graph-aware, benchmarkable, editability-oriented complement to that frontier.</w:t>
+        <w:t xml:space="preserve">The current results do not support the claim that LayerForge-X universally exceeds generative decomposers on raw pixel fidelity. The defensible claim is narrower and more important: native, generative, and recursive decompositions are normalized into a single editable graph representation with auditable metrics and exportable structure. Qwen remains the appropriate generative RGBA baseline, while LayerForge-X is most compelling as a graph-aware, benchmarkable, editability-oriented complement to that frontier.</w:t>
       </w:r>
     </w:p>
     <w:bookmarkEnd w:id="157"/>
@@ -13476,7 +13476,7 @@
         <w:pStyle w:val="FirstParagraph"/>
       </w:pPr>
       <w:r>
-        <w:t xml:space="preserve">LayerForge-X is now best understood as a self-evaluating layer-representation system rather than a simple decomposition script. It can produce native graph layers, enrich frontier RGBA layers, run recursive peeling, measure editability, benchmark prompt extraction, approximate transparent recovery, and export a canonical DALG manifest. That combination is the core project contribution.</w:t>
+        <w:t xml:space="preserve">LayerForge-X is best interpreted as a self-evaluating layer-representation system rather than a simple decomposition script. It produces native graph layers, enriches frontier RGBA layers, runs recursive peeling, measures editability, benchmarks prompt extraction, approximates transparent recovery, and exports a canonical DALG manifest. That combination defines the central project contribution.</w:t>
       </w:r>
     </w:p>
     <w:bookmarkEnd w:id="161"/>
@@ -14405,7 +14405,7 @@
         </w:numPr>
       </w:pPr>
       <w:r>
-        <w:t xml:space="preserve">the strongest qualitative path is therefore the real-image</w:t>
+        <w:t xml:space="preserve">the most credible qualitative path is therefore the real-image</w:t>
       </w:r>
       <w:r>
         <w:t xml:space="preserve"> </w:t>
@@ -14936,7 +14936,7 @@
         <w:t xml:space="preserve"> </w:t>
       </w:r>
       <w:r>
-        <w:t xml:space="preserve">is the strongest overall candidate-bank row under the explicit self-evaluation score and wins</w:t>
+        <w:t xml:space="preserve">is the highest-scoring candidate-bank row under the explicit self-evaluation score and wins</w:t>
       </w:r>
       <w:r>
         <w:t xml:space="preserve"> </w:t>

</xml_diff>

<commit_message>
docs: restitch formal report and figure pack
</commit_message>
<xml_diff>
--- a/docs/final_report_pack/LayerForge_X_Final_Report_2026_04_22.docx
+++ b/docs/final_report_pack/LayerForge_X_Final_Report_2026_04_22.docx
@@ -2,7 +2,7 @@
 <file path=word/document.xml><?xml version="1.0" encoding="utf-8"?>
 <w:document xmlns:w="http://schemas.openxmlformats.org/wordprocessingml/2006/main" xmlns:m="http://schemas.openxmlformats.org/officeDocument/2006/math" xmlns:r="http://schemas.openxmlformats.org/officeDocument/2006/relationships" xmlns:o="urn:schemas-microsoft-com:office:office" xmlns:v="urn:schemas-microsoft-com:vml" xmlns:w10="urn:schemas-microsoft-com:office:word" xmlns:a="http://schemas.openxmlformats.org/drawingml/2006/main" xmlns:pic="http://schemas.openxmlformats.org/drawingml/2006/picture" xmlns:wp="http://schemas.openxmlformats.org/drawingml/2006/wordprocessingDrawing">
   <w:body>
-    <w:bookmarkStart w:id="23" w:name="layerforge-x-final-report"/>
+    <w:bookmarkStart w:id="20" w:name="layerforge-x-final-report"/>
     <w:p>
       <w:pPr>
         <w:pStyle w:val="Heading1"/>
@@ -11,10 +11,11 @@
         <w:t xml:space="preserve">LayerForge-X Final Report</w:t>
       </w:r>
     </w:p>
-    <w:bookmarkStart w:id="20" w:name="abstract"/>
-    <w:p>
-      <w:pPr>
-        <w:pStyle w:val="Heading2"/>
+    <w:bookmarkEnd w:id="20"/>
+    <w:bookmarkStart w:id="21" w:name="abstract"/>
+    <w:p>
+      <w:pPr>
+        <w:pStyle w:val="Heading1"/>
       </w:pPr>
       <w:r>
         <w:t xml:space="preserve">Abstract</w:t>
@@ -41,11 +42,11 @@
         <w:t xml:space="preserve">: ordered RGBA layers with semantic grouping, soft alpha, occlusion metadata, optional amodal support, background completion, intrinsic appearance factors, and editability-oriented diagnostics. The system combines native decomposition, Qwen/external RGBA enrichment, recursive peeling, promptable extraction, transparent-layer recovery, and explicit self-evaluation so different candidate representations can be compared under one graph contract. This report focuses on the measured behavior of those components, the benchmark protocol used to evaluate them, and the practical limits that still separate the current implementation from fully generative layered scene understanding.</w:t>
       </w:r>
     </w:p>
-    <w:bookmarkEnd w:id="20"/>
-    <w:bookmarkStart w:id="21" w:name="introduction"/>
-    <w:p>
-      <w:pPr>
-        <w:pStyle w:val="Heading2"/>
+    <w:bookmarkEnd w:id="21"/>
+    <w:bookmarkStart w:id="22" w:name="introduction"/>
+    <w:p>
+      <w:pPr>
+        <w:pStyle w:val="Heading1"/>
       </w:pPr>
       <w:r>
         <w:t xml:space="preserve">1. Introduction</w:t>
@@ -72,11 +73,11 @@
         <w:t xml:space="preserve">. That requires more than segmentation. A useful representation needs explicit near-to-far ordering, soft alpha boundaries, at least heuristic amodal support, some notion of hidden/background completion, and export surfaces that support real editing workflows. LayerForge-X therefore treats the scene graph as the canonical object and regards PNG stacks, debug artifacts, and design-manifest exports as projections of that graph.</w:t>
       </w:r>
     </w:p>
-    <w:bookmarkEnd w:id="21"/>
-    <w:bookmarkStart w:id="22" w:name="contributions"/>
-    <w:p>
-      <w:pPr>
-        <w:pStyle w:val="Heading2"/>
+    <w:bookmarkEnd w:id="22"/>
+    <w:bookmarkStart w:id="23" w:name="contributions"/>
+    <w:p>
+      <w:pPr>
+        <w:pStyle w:val="Heading1"/>
       </w:pPr>
       <w:r>
         <w:t xml:space="preserve">2. Contributions</w:t>
@@ -162,7 +163,6 @@
         <w:t xml:space="preserve">The system exports a canonical DALG manifest and a product-facing design-manifest projection suitable for future API/editor integration.</w:t>
       </w:r>
     </w:p>
-    <w:bookmarkEnd w:id="22"/>
     <w:bookmarkEnd w:id="23"/>
     <w:bookmarkStart w:id="38" w:name="related-work"/>
     <w:p>
@@ -2794,6 +2794,25 @@
         </w:rPr>
         <w:t xml:space="preserve">graph confidence</w:t>
       </w:r>
+    </w:p>
+    <w:p>
+      <w:pPr>
+        <w:pStyle w:val="FirstParagraph"/>
+      </w:pPr>
+      <w:r>
+        <w:t xml:space="preserve">In the archived five-image evidence pack, the active weighted score is</w:t>
+      </w:r>
+    </w:p>
+    <w:p>
+      <w:pPr>
+        <w:pStyle w:val="SourceCode"/>
+      </w:pPr>
+      <w:r>
+        <w:rPr>
+          <w:rStyle w:val="VerbatimChar"/>
+        </w:rPr>
+        <w:t xml:space="preserve">score = 0.20 * recomposition_fidelity</w:t>
+      </w:r>
       <w:r>
         <w:br/>
       </w:r>
@@ -2801,7 +2820,34 @@
         <w:rPr>
           <w:rStyle w:val="VerbatimChar"/>
         </w:rPr>
-        <w:t xml:space="preserve">runtime</w:t>
+        <w:t xml:space="preserve">      + 0.25 * edit_preservation</w:t>
+      </w:r>
+      <w:r>
+        <w:br/>
+      </w:r>
+      <w:r>
+        <w:rPr>
+          <w:rStyle w:val="VerbatimChar"/>
+        </w:rPr>
+        <w:t xml:space="preserve">      + 0.20 * semantic_separation</w:t>
+      </w:r>
+      <w:r>
+        <w:br/>
+      </w:r>
+      <w:r>
+        <w:rPr>
+          <w:rStyle w:val="VerbatimChar"/>
+        </w:rPr>
+        <w:t xml:space="preserve">      + 0.10 * alpha_quality</w:t>
+      </w:r>
+      <w:r>
+        <w:br/>
+      </w:r>
+      <w:r>
+        <w:rPr>
+          <w:rStyle w:val="VerbatimChar"/>
+        </w:rPr>
+        <w:t xml:space="preserve">      + 0.15 * graph_confidence</w:t>
       </w:r>
     </w:p>
     <w:p>
@@ -2809,71 +2855,7 @@
         <w:pStyle w:val="FirstParagraph"/>
       </w:pPr>
       <w:r>
-        <w:t xml:space="preserve">The current weighted score is</w:t>
-      </w:r>
-    </w:p>
-    <w:p>
-      <w:pPr>
-        <w:pStyle w:val="SourceCode"/>
-      </w:pPr>
-      <w:r>
-        <w:rPr>
-          <w:rStyle w:val="VerbatimChar"/>
-        </w:rPr>
-        <w:t xml:space="preserve">score = 0.20 * recomposition_fidelity</w:t>
-      </w:r>
-      <w:r>
-        <w:br/>
-      </w:r>
-      <w:r>
-        <w:rPr>
-          <w:rStyle w:val="VerbatimChar"/>
-        </w:rPr>
-        <w:t xml:space="preserve">      + 0.25 * edit_preservation</w:t>
-      </w:r>
-      <w:r>
-        <w:br/>
-      </w:r>
-      <w:r>
-        <w:rPr>
-          <w:rStyle w:val="VerbatimChar"/>
-        </w:rPr>
-        <w:t xml:space="preserve">      + 0.20 * semantic_separation</w:t>
-      </w:r>
-      <w:r>
-        <w:br/>
-      </w:r>
-      <w:r>
-        <w:rPr>
-          <w:rStyle w:val="VerbatimChar"/>
-        </w:rPr>
-        <w:t xml:space="preserve">      + 0.10 * alpha_quality</w:t>
-      </w:r>
-      <w:r>
-        <w:br/>
-      </w:r>
-      <w:r>
-        <w:rPr>
-          <w:rStyle w:val="VerbatimChar"/>
-        </w:rPr>
-        <w:t xml:space="preserve">      + 0.15 * graph_confidence</w:t>
-      </w:r>
-      <w:r>
-        <w:br/>
-      </w:r>
-      <w:r>
-        <w:rPr>
-          <w:rStyle w:val="VerbatimChar"/>
-        </w:rPr>
-        <w:t xml:space="preserve">      + 0.10 * runtime</w:t>
-      </w:r>
-    </w:p>
-    <w:p>
-      <w:pPr>
-        <w:pStyle w:val="FirstParagraph"/>
-      </w:pPr>
-      <w:r>
-        <w:t xml:space="preserve">This formulation turns the repository into a self-evaluating layer-representation system rather than a single fixed pipeline.</w:t>
+        <w:t xml:space="preserve">The implementation still supports an optional runtime term for future reruns with fresh timings, but the shipped frontier summary was rescored from cached runs and therefore keeps runtime inactive. This formulation still turns the repository into a self-evaluating layer-representation system rather than a single fixed pipeline.</w:t>
       </w:r>
     </w:p>
     <w:bookmarkEnd w:id="47"/>
@@ -3942,7 +3924,7 @@
     </w:p>
     <w:bookmarkEnd w:id="61"/>
     <w:bookmarkEnd w:id="62"/>
-    <w:bookmarkStart w:id="64" w:name="experiments-and-evaluation-protocol"/>
+    <w:bookmarkStart w:id="123" w:name="experiments-and-evaluation-protocol"/>
     <w:p>
       <w:pPr>
         <w:pStyle w:val="Heading1"/>
@@ -4130,16 +4112,16 @@
       </w:r>
     </w:p>
     <w:bookmarkEnd w:id="63"/>
+    <w:bookmarkStart w:id="64" w:name="modal-semantic-and-panoptic-segmentation"/>
+    <w:p>
+      <w:pPr>
+        <w:pStyle w:val="Heading2"/>
+      </w:pPr>
+      <w:r>
+        <w:t xml:space="preserve">5.1 Modal semantic and panoptic segmentation</w:t>
+      </w:r>
+    </w:p>
     <w:bookmarkEnd w:id="64"/>
-    <w:bookmarkStart w:id="71" w:name="X7a87aa1dde06681bd6d7c1618e0fa5e1bc532e2"/>
-    <w:p>
-      <w:pPr>
-        <w:pStyle w:val="Heading1"/>
-      </w:pPr>
-      <w:r>
-        <w:t xml:space="preserve">Track A: Modal semantic / panoptic segmentation</w:t>
-      </w:r>
-    </w:p>
     <w:bookmarkStart w:id="65" w:name="datasets"/>
     <w:p>
       <w:pPr>
@@ -4943,16 +4925,16 @@
       </w:r>
     </w:p>
     <w:bookmarkEnd w:id="70"/>
+    <w:bookmarkStart w:id="71" w:name="depth-order-and-occlusion-graph-quality"/>
+    <w:p>
+      <w:pPr>
+        <w:pStyle w:val="Heading2"/>
+      </w:pPr>
+      <w:r>
+        <w:t xml:space="preserve">5.2 Depth-order and occlusion-graph quality</w:t>
+      </w:r>
+    </w:p>
     <w:bookmarkEnd w:id="71"/>
-    <w:bookmarkStart w:id="81" w:name="X9611b6e4d697ea7334b585b246db2fe47091bb5"/>
-    <w:p>
-      <w:pPr>
-        <w:pStyle w:val="Heading1"/>
-      </w:pPr>
-      <w:r>
-        <w:t xml:space="preserve">Track B: Depth-order and occlusion-graph quality</w:t>
-      </w:r>
-    </w:p>
     <w:bookmarkStart w:id="72" w:name="why-this-matters"/>
     <w:p>
       <w:pPr>
@@ -5756,16 +5738,16 @@
       </w:r>
     </w:p>
     <w:bookmarkEnd w:id="80"/>
+    <w:bookmarkStart w:id="81" w:name="rgba-recomposition-fidelity"/>
+    <w:p>
+      <w:pPr>
+        <w:pStyle w:val="Heading2"/>
+      </w:pPr>
+      <w:r>
+        <w:t xml:space="preserve">5.3 RGBA recomposition fidelity</w:t>
+      </w:r>
+    </w:p>
     <w:bookmarkEnd w:id="81"/>
-    <w:bookmarkStart w:id="90" w:name="track-c-rgba-recomposition-fidelity"/>
-    <w:p>
-      <w:pPr>
-        <w:pStyle w:val="Heading1"/>
-      </w:pPr>
-      <w:r>
-        <w:t xml:space="preserve">Track C: RGBA recomposition fidelity</w:t>
-      </w:r>
-    </w:p>
     <w:bookmarkStart w:id="82" w:name="why-this-matters-1"/>
     <w:p>
       <w:pPr>
@@ -6312,16 +6294,16 @@
       </w:r>
     </w:p>
     <w:bookmarkEnd w:id="89"/>
+    <w:bookmarkStart w:id="90" w:name="Xe1a9d897ee24f294c85f4d7938585d53a12899b"/>
+    <w:p>
+      <w:pPr>
+        <w:pStyle w:val="Heading2"/>
+      </w:pPr>
+      <w:r>
+        <w:t xml:space="preserve">5.4 Amodal masks and hidden-region completion</w:t>
+      </w:r>
+    </w:p>
     <w:bookmarkEnd w:id="90"/>
-    <w:bookmarkStart w:id="98" w:name="Xea7f79f5580e95207963157529789df046a2153"/>
-    <w:p>
-      <w:pPr>
-        <w:pStyle w:val="Heading1"/>
-      </w:pPr>
-      <w:r>
-        <w:t xml:space="preserve">Track D: Amodal mask and hidden-region completion</w:t>
-      </w:r>
-    </w:p>
     <w:bookmarkStart w:id="91" w:name="datasets-2"/>
     <w:p>
       <w:pPr>
@@ -6923,16 +6905,16 @@
       </w:r>
     </w:p>
     <w:bookmarkEnd w:id="97"/>
+    <w:bookmarkStart w:id="98" w:name="intrinsic-albedo-and-shading-split"/>
+    <w:p>
+      <w:pPr>
+        <w:pStyle w:val="Heading2"/>
+      </w:pPr>
+      <w:r>
+        <w:t xml:space="preserve">5.5 Intrinsic albedo and shading split</w:t>
+      </w:r>
+    </w:p>
     <w:bookmarkEnd w:id="98"/>
-    <w:bookmarkStart w:id="105" w:name="track-e-intrinsic-albedoshading-split"/>
-    <w:p>
-      <w:pPr>
-        <w:pStyle w:val="Heading1"/>
-      </w:pPr>
-      <w:r>
-        <w:t xml:space="preserve">Track E: Intrinsic albedo/shading split</w:t>
-      </w:r>
-    </w:p>
     <w:bookmarkStart w:id="99" w:name="datasets-3"/>
     <w:p>
       <w:pPr>
@@ -7437,16 +7419,16 @@
       </w:r>
     </w:p>
     <w:bookmarkEnd w:id="104"/>
+    <w:bookmarkStart w:id="105" w:name="editability-evaluation"/>
+    <w:p>
+      <w:pPr>
+        <w:pStyle w:val="Heading2"/>
+      </w:pPr>
+      <w:r>
+        <w:t xml:space="preserve">5.6 Editability evaluation</w:t>
+      </w:r>
+    </w:p>
     <w:bookmarkEnd w:id="105"/>
-    <w:bookmarkStart w:id="113" w:name="track-f-editability-evaluation"/>
-    <w:p>
-      <w:pPr>
-        <w:pStyle w:val="Heading1"/>
-      </w:pPr>
-      <w:r>
-        <w:t xml:space="preserve">Track F: Editability evaluation</w:t>
-      </w:r>
-    </w:p>
     <w:bookmarkStart w:id="106" w:name="why-this-matters-2"/>
     <w:p>
       <w:pPr>
@@ -8087,24 +8069,24 @@
       </w:r>
     </w:p>
     <w:bookmarkEnd w:id="112"/>
+    <w:bookmarkStart w:id="113" w:name="synthetic-layerbench-design"/>
+    <w:p>
+      <w:pPr>
+        <w:pStyle w:val="Heading2"/>
+      </w:pPr>
+      <w:r>
+        <w:t xml:space="preserve">5.7 Synthetic-LayerBench design</w:t>
+      </w:r>
+    </w:p>
+    <w:p>
+      <w:pPr>
+        <w:pStyle w:val="FirstParagraph"/>
+      </w:pPr>
+      <w:r>
+        <w:t xml:space="preserve">This is the easiest path to strong, defensible numbers, precisely because ground truth is known by construction.</w:t>
+      </w:r>
+    </w:p>
     <w:bookmarkEnd w:id="113"/>
-    <w:bookmarkStart w:id="118" w:name="synthetic-layerbench-design"/>
-    <w:p>
-      <w:pPr>
-        <w:pStyle w:val="Heading1"/>
-      </w:pPr>
-      <w:r>
-        <w:t xml:space="preserve">Synthetic-LayerBench design</w:t>
-      </w:r>
-    </w:p>
-    <w:p>
-      <w:pPr>
-        <w:pStyle w:val="FirstParagraph"/>
-      </w:pPr>
-      <w:r>
-        <w:t xml:space="preserve">This is the easiest path to strong, defensible numbers, precisely because ground truth is known by construction.</w:t>
-      </w:r>
-    </w:p>
     <w:bookmarkStart w:id="114" w:name="data-generation"/>
     <w:p>
       <w:pPr>
@@ -8766,14 +8748,13 @@
       </w:r>
     </w:p>
     <w:bookmarkEnd w:id="117"/>
-    <w:bookmarkEnd w:id="118"/>
-    <w:bookmarkStart w:id="120" w:name="ablation-protocol"/>
-    <w:p>
-      <w:pPr>
-        <w:pStyle w:val="Heading1"/>
-      </w:pPr>
-      <w:r>
-        <w:t xml:space="preserve">Ablation protocol</w:t>
+    <w:bookmarkStart w:id="118" w:name="ablation-protocol"/>
+    <w:p>
+      <w:pPr>
+        <w:pStyle w:val="Heading2"/>
+      </w:pPr>
+      <w:r>
+        <w:t xml:space="preserve">5.8 Ablation protocol</w:t>
       </w:r>
     </w:p>
     <w:p>
@@ -9705,6 +9686,7 @@
         </w:tc>
       </w:tr>
     </w:tbl>
+    <w:bookmarkEnd w:id="118"/>
     <w:bookmarkStart w:id="119" w:name="expected-interpretation"/>
     <w:p>
       <w:pPr>
@@ -9806,14 +9788,13 @@
       </w:r>
     </w:p>
     <w:bookmarkEnd w:id="119"/>
-    <w:bookmarkEnd w:id="120"/>
-    <w:bookmarkStart w:id="121" w:name="visual-evidence-set"/>
-    <w:p>
-      <w:pPr>
-        <w:pStyle w:val="Heading1"/>
-      </w:pPr>
-      <w:r>
-        <w:t xml:space="preserve">Visual evidence set</w:t>
+    <w:bookmarkStart w:id="120" w:name="visual-evidence-set"/>
+    <w:p>
+      <w:pPr>
+        <w:pStyle w:val="Heading2"/>
+      </w:pPr>
+      <w:r>
+        <w:t xml:space="preserve">5.9 Visual evidence set</w:t>
       </w:r>
     </w:p>
     <w:p>
@@ -10055,14 +10036,14 @@
         </w:pict>
       </w:r>
     </w:p>
-    <w:bookmarkEnd w:id="121"/>
-    <w:bookmarkStart w:id="122" w:name="failure-case-taxonomy"/>
-    <w:p>
-      <w:pPr>
-        <w:pStyle w:val="Heading1"/>
-      </w:pPr>
-      <w:r>
-        <w:t xml:space="preserve">Failure-case taxonomy</w:t>
+    <w:bookmarkEnd w:id="120"/>
+    <w:bookmarkStart w:id="121" w:name="failure-case-taxonomy"/>
+    <w:p>
+      <w:pPr>
+        <w:pStyle w:val="Heading2"/>
+      </w:pPr>
+      <w:r>
+        <w:t xml:space="preserve">5.10 Failure-case taxonomy</w:t>
       </w:r>
     </w:p>
     <w:p>
@@ -10557,42 +10538,44 @@
         </w:pict>
       </w:r>
     </w:p>
+    <w:bookmarkEnd w:id="121"/>
+    <w:bookmarkStart w:id="122" w:name="benchmark-narrative"/>
+    <w:p>
+      <w:pPr>
+        <w:pStyle w:val="Heading2"/>
+      </w:pPr>
+      <w:r>
+        <w:t xml:space="preserve">5.11 Benchmark narrative</w:t>
+      </w:r>
+    </w:p>
+    <w:p>
+      <w:pPr>
+        <w:pStyle w:val="FirstParagraph"/>
+      </w:pPr>
+      <w:r>
+        <w:t xml:space="preserve">If the report needs one paragraph summarising the whole evaluation, this is the one:</w:t>
+      </w:r>
+    </w:p>
+    <w:p>
+      <w:pPr>
+        <w:pStyle w:val="BlockText"/>
+      </w:pPr>
+      <w:r>
+        <w:t xml:space="preserve">We evaluate LayerForge-X across four axes: segmentation quality, layer-order correctness, recomposition fidelity, and editability. Standard panoptic metrics measure visible semantic grouping, while a synthetic layer benchmark and RGB-D datasets measure pairwise depth-order accuracy. Recomposition metrics verify that the exported RGBA stack preserves the original image. Finally, object removal, object movement, parallax, and intrinsic recolouring demonstrate that the representation is genuinely useful for editing rather than being a segmentation visualisation in disguise.</w:t>
+      </w:r>
+    </w:p>
     <w:bookmarkEnd w:id="122"/>
-    <w:bookmarkStart w:id="162" w:name="recommended-final-benchmark-narrative"/>
+    <w:bookmarkEnd w:id="123"/>
+    <w:bookmarkStart w:id="157" w:name="results"/>
     <w:p>
       <w:pPr>
         <w:pStyle w:val="Heading1"/>
       </w:pPr>
       <w:r>
-        <w:t xml:space="preserve">Recommended final benchmark narrative</w:t>
-      </w:r>
-    </w:p>
-    <w:p>
-      <w:pPr>
-        <w:pStyle w:val="FirstParagraph"/>
-      </w:pPr>
-      <w:r>
-        <w:t xml:space="preserve">If the report needs one paragraph summarising the whole evaluation, this is the one:</w:t>
-      </w:r>
-    </w:p>
-    <w:p>
-      <w:pPr>
-        <w:pStyle w:val="BlockText"/>
-      </w:pPr>
-      <w:r>
-        <w:t xml:space="preserve">We evaluate LayerForge-X across four axes: segmentation quality, layer-order correctness, recomposition fidelity, and editability. Standard panoptic metrics measure visible semantic grouping, while a synthetic layer benchmark and RGB-D datasets measure pairwise depth-order accuracy. Recomposition metrics verify that the exported RGBA stack preserves the original image. Finally, object removal, object movement, parallax, and intrinsic recolouring demonstrate that the representation is genuinely useful for editing rather than being a segmentation visualisation in disguise.</w:t>
-      </w:r>
-    </w:p>
-    <w:bookmarkStart w:id="156" w:name="results"/>
-    <w:p>
-      <w:pPr>
-        <w:pStyle w:val="Heading2"/>
-      </w:pPr>
-      <w:r>
         <w:t xml:space="preserve">6. Results</w:t>
       </w:r>
     </w:p>
-    <w:bookmarkStart w:id="147" w:name="hero-figures"/>
+    <w:bookmarkStart w:id="148" w:name="hero-figures"/>
     <w:p>
       <w:pPr>
         <w:pStyle w:val="Heading3"/>
@@ -10601,7 +10584,7 @@
         <w:t xml:space="preserve">Hero figures</w:t>
       </w:r>
     </w:p>
-    <w:bookmarkStart w:id="126" w:name="X3ef32b23a4dafc03f028eca74c44b0dc17d127e"/>
+    <w:bookmarkStart w:id="127" w:name="X3ef32b23a4dafc03f028eca74c44b0dc17d127e"/>
     <w:p>
       <w:pPr>
         <w:pStyle w:val="Heading4"/>
@@ -10619,18 +10602,18 @@
           <wp:inline>
             <wp:extent cx="5334000" cy="3361531"/>
             <wp:effectExtent b="0" l="0" r="0" t="0"/>
-            <wp:docPr descr="Truck recomposition comparison" title="" id="124" name="Picture"/>
+            <wp:docPr descr="Truck recomposition comparison" title="" id="125" name="Picture"/>
             <a:graphic>
               <a:graphicData uri="http://schemas.openxmlformats.org/drawingml/2006/picture">
                 <pic:pic>
                   <pic:nvPicPr>
-                    <pic:cNvPr descr="../figures/truck_recomposition_comparison.png" id="125" name="Picture"/>
+                    <pic:cNvPr descr="../figures/truck_recomposition_comparison.png" id="126" name="Picture"/>
                     <pic:cNvPicPr>
                       <a:picLocks noChangeArrowheads="1" noChangeAspect="1"/>
                     </pic:cNvPicPr>
                   </pic:nvPicPr>
                   <pic:blipFill>
-                    <a:blip r:embed="rId123"/>
+                    <a:blip r:embed="rId124"/>
                     <a:stretch>
                       <a:fillRect/>
                     </a:stretch>
@@ -10665,8 +10648,8 @@
         <w:t xml:space="preserve">Truck recomposition comparison</w:t>
       </w:r>
     </w:p>
-    <w:bookmarkEnd w:id="126"/>
-    <w:bookmarkStart w:id="130" w:name="frontier-candidate-bank-selection"/>
+    <w:bookmarkEnd w:id="127"/>
+    <w:bookmarkStart w:id="131" w:name="frontier-candidate-bank-selection"/>
     <w:p>
       <w:pPr>
         <w:pStyle w:val="Heading4"/>
@@ -10682,20 +10665,20 @@
       <w:r>
         <w:drawing>
           <wp:inline>
-            <wp:extent cx="5334000" cy="3165230"/>
+            <wp:extent cx="5334000" cy="2637692"/>
             <wp:effectExtent b="0" l="0" r="0" t="0"/>
-            <wp:docPr descr="Frontier review" title="" id="128" name="Picture"/>
+            <wp:docPr descr="Frontier review" title="" id="129" name="Picture"/>
             <a:graphic>
               <a:graphicData uri="http://schemas.openxmlformats.org/drawingml/2006/picture">
                 <pic:pic>
                   <pic:nvPicPr>
-                    <pic:cNvPr descr="../figures/frontier_review.png" id="129" name="Picture"/>
+                    <pic:cNvPr descr="../figures/frontier_review.png" id="130" name="Picture"/>
                     <pic:cNvPicPr>
                       <a:picLocks noChangeArrowheads="1" noChangeAspect="1"/>
                     </pic:cNvPicPr>
                   </pic:nvPicPr>
                   <pic:blipFill>
-                    <a:blip r:embed="rId127"/>
+                    <a:blip r:embed="rId128"/>
                     <a:stretch>
                       <a:fillRect/>
                     </a:stretch>
@@ -10703,7 +10686,7 @@
                   <pic:spPr bwMode="auto">
                     <a:xfrm>
                       <a:off x="0" y="0"/>
-                      <a:ext cx="5334000" cy="3165230"/>
+                      <a:ext cx="5334000" cy="2637692"/>
                     </a:xfrm>
                     <a:prstGeom prst="rect">
                       <a:avLst/>
@@ -10730,8 +10713,8 @@
         <w:t xml:space="preserve">Frontier review</w:t>
       </w:r>
     </w:p>
-    <w:bookmarkEnd w:id="130"/>
-    <w:bookmarkStart w:id="134" w:name="promptable-extraction-benchmark"/>
+    <w:bookmarkEnd w:id="131"/>
+    <w:bookmarkStart w:id="135" w:name="promptable-extraction-benchmark"/>
     <w:p>
       <w:pPr>
         <w:pStyle w:val="Heading4"/>
@@ -10747,20 +10730,20 @@
       <w:r>
         <w:drawing>
           <wp:inline>
-            <wp:extent cx="5334000" cy="2227384"/>
+            <wp:extent cx="5334000" cy="1875692"/>
             <wp:effectExtent b="0" l="0" r="0" t="0"/>
-            <wp:docPr descr="Prompt extraction benchmark" title="" id="132" name="Picture"/>
+            <wp:docPr descr="Prompt extraction benchmark" title="" id="133" name="Picture"/>
             <a:graphic>
               <a:graphicData uri="http://schemas.openxmlformats.org/drawingml/2006/picture">
                 <pic:pic>
                   <pic:nvPicPr>
-                    <pic:cNvPr descr="../figures/prompt_extract_benchmark.png" id="133" name="Picture"/>
+                    <pic:cNvPr descr="../figures/prompt_extract_benchmark.png" id="134" name="Picture"/>
                     <pic:cNvPicPr>
                       <a:picLocks noChangeArrowheads="1" noChangeAspect="1"/>
                     </pic:cNvPicPr>
                   </pic:nvPicPr>
                   <pic:blipFill>
-                    <a:blip r:embed="rId131"/>
+                    <a:blip r:embed="rId132"/>
                     <a:stretch>
                       <a:fillRect/>
                     </a:stretch>
@@ -10768,7 +10751,7 @@
                   <pic:spPr bwMode="auto">
                     <a:xfrm>
                       <a:off x="0" y="0"/>
-                      <a:ext cx="5334000" cy="2227384"/>
+                      <a:ext cx="5334000" cy="1875692"/>
                     </a:xfrm>
                     <a:prstGeom prst="rect">
                       <a:avLst/>
@@ -10795,8 +10778,8 @@
         <w:t xml:space="preserve">Prompt extraction benchmark</w:t>
       </w:r>
     </w:p>
-    <w:bookmarkEnd w:id="134"/>
-    <w:bookmarkStart w:id="138" w:name="transparent-decomposition-benchmark"/>
+    <w:bookmarkEnd w:id="135"/>
+    <w:bookmarkStart w:id="139" w:name="transparent-decomposition-benchmark"/>
     <w:p>
       <w:pPr>
         <w:pStyle w:val="Heading4"/>
@@ -10812,20 +10795,20 @@
       <w:r>
         <w:drawing>
           <wp:inline>
-            <wp:extent cx="5334000" cy="2227384"/>
+            <wp:extent cx="5334000" cy="1875692"/>
             <wp:effectExtent b="0" l="0" r="0" t="0"/>
-            <wp:docPr descr="Transparent benchmark" title="" id="136" name="Picture"/>
+            <wp:docPr descr="Transparent benchmark" title="" id="137" name="Picture"/>
             <a:graphic>
               <a:graphicData uri="http://schemas.openxmlformats.org/drawingml/2006/picture">
                 <pic:pic>
                   <pic:nvPicPr>
-                    <pic:cNvPr descr="../figures/transparent_benchmark.png" id="137" name="Picture"/>
+                    <pic:cNvPr descr="../figures/transparent_benchmark.png" id="138" name="Picture"/>
                     <pic:cNvPicPr>
                       <a:picLocks noChangeArrowheads="1" noChangeAspect="1"/>
                     </pic:cNvPicPr>
                   </pic:nvPicPr>
                   <pic:blipFill>
-                    <a:blip r:embed="rId135"/>
+                    <a:blip r:embed="rId136"/>
                     <a:stretch>
                       <a:fillRect/>
                     </a:stretch>
@@ -10833,7 +10816,7 @@
                   <pic:spPr bwMode="auto">
                     <a:xfrm>
                       <a:off x="0" y="0"/>
-                      <a:ext cx="5334000" cy="2227384"/>
+                      <a:ext cx="5334000" cy="1875692"/>
                     </a:xfrm>
                     <a:prstGeom prst="rect">
                       <a:avLst/>
@@ -10860,8 +10843,8 @@
         <w:t xml:space="preserve">Transparent benchmark</w:t>
       </w:r>
     </w:p>
-    <w:bookmarkEnd w:id="138"/>
-    <w:bookmarkStart w:id="142" w:name="associated-effect-prototype"/>
+    <w:bookmarkEnd w:id="139"/>
+    <w:bookmarkStart w:id="143" w:name="associated-effect-prototype"/>
     <w:p>
       <w:pPr>
         <w:pStyle w:val="Heading4"/>
@@ -10877,20 +10860,20 @@
       <w:r>
         <w:drawing>
           <wp:inline>
-            <wp:extent cx="5334000" cy="2872153"/>
+            <wp:extent cx="5334000" cy="2520461"/>
             <wp:effectExtent b="0" l="0" r="0" t="0"/>
-            <wp:docPr descr="Associated-effect demo" title="" id="140" name="Picture"/>
+            <wp:docPr descr="Associated-effect demo" title="" id="141" name="Picture"/>
             <a:graphic>
               <a:graphicData uri="http://schemas.openxmlformats.org/drawingml/2006/picture">
                 <pic:pic>
                   <pic:nvPicPr>
-                    <pic:cNvPr descr="../figures/effects_layer_demo.png" id="141" name="Picture"/>
+                    <pic:cNvPr descr="../figures/effects_layer_demo.png" id="142" name="Picture"/>
                     <pic:cNvPicPr>
                       <a:picLocks noChangeArrowheads="1" noChangeAspect="1"/>
                     </pic:cNvPicPr>
                   </pic:nvPicPr>
                   <pic:blipFill>
-                    <a:blip r:embed="rId139"/>
+                    <a:blip r:embed="rId140"/>
                     <a:stretch>
                       <a:fillRect/>
                     </a:stretch>
@@ -10898,7 +10881,7 @@
                   <pic:spPr bwMode="auto">
                     <a:xfrm>
                       <a:off x="0" y="0"/>
-                      <a:ext cx="5334000" cy="2872153"/>
+                      <a:ext cx="5334000" cy="2520461"/>
                     </a:xfrm>
                     <a:prstGeom prst="rect">
                       <a:avLst/>
@@ -10925,8 +10908,8 @@
         <w:t xml:space="preserve">Associated-effect demo</w:t>
       </w:r>
     </w:p>
-    <w:bookmarkEnd w:id="142"/>
-    <w:bookmarkStart w:id="146" w:name="intrinsic-export-demo"/>
+    <w:bookmarkEnd w:id="143"/>
+    <w:bookmarkStart w:id="147" w:name="intrinsic-export-demo"/>
     <w:p>
       <w:pPr>
         <w:pStyle w:val="Heading4"/>
@@ -10944,18 +10927,18 @@
           <wp:inline>
             <wp:extent cx="5334000" cy="3719763"/>
             <wp:effectExtent b="0" l="0" r="0" t="0"/>
-            <wp:docPr descr="Intrinsic layer demo" title="" id="144" name="Picture"/>
+            <wp:docPr descr="Intrinsic layer demo" title="" id="145" name="Picture"/>
             <a:graphic>
               <a:graphicData uri="http://schemas.openxmlformats.org/drawingml/2006/picture">
                 <pic:pic>
                   <pic:nvPicPr>
-                    <pic:cNvPr descr="../figures/intrinsic_layer_demo.png" id="145" name="Picture"/>
+                    <pic:cNvPr descr="../figures/intrinsic_layer_demo.png" id="146" name="Picture"/>
                     <pic:cNvPicPr>
                       <a:picLocks noChangeArrowheads="1" noChangeAspect="1"/>
                     </pic:cNvPicPr>
                   </pic:nvPicPr>
                   <pic:blipFill>
-                    <a:blip r:embed="rId143"/>
+                    <a:blip r:embed="rId144"/>
                     <a:stretch>
                       <a:fillRect/>
                     </a:stretch>
@@ -10990,9 +10973,9 @@
         <w:t xml:space="preserve">Intrinsic layer demo</w:t>
       </w:r>
     </w:p>
-    <w:bookmarkEnd w:id="146"/>
     <w:bookmarkEnd w:id="147"/>
-    <w:bookmarkStart w:id="154" w:name="main-measured-summary"/>
+    <w:bookmarkEnd w:id="148"/>
+    <w:bookmarkStart w:id="155" w:name="main-measured-summary"/>
     <w:p>
       <w:pPr>
         <w:pStyle w:val="Heading3"/>
@@ -11039,7 +11022,7 @@
         <w:t xml:space="preserve">= Qwen plus LayerForge graph enrichment.</w:t>
       </w:r>
     </w:p>
-    <w:bookmarkStart w:id="148" w:name="five-image-qwen-raw-versus-hybrid-review"/>
+    <w:bookmarkStart w:id="149" w:name="five-image-qwen-raw-versus-hybrid-review"/>
     <w:p>
       <w:pPr>
         <w:pStyle w:val="Heading4"/>
@@ -11365,8 +11348,8 @@
         </w:tc>
       </w:tr>
     </w:tbl>
-    <w:bookmarkEnd w:id="148"/>
-    <w:bookmarkStart w:id="149" w:name="associated-effect-demo"/>
+    <w:bookmarkEnd w:id="149"/>
+    <w:bookmarkStart w:id="150" w:name="associated-effect-demo"/>
     <w:p>
       <w:pPr>
         <w:pStyle w:val="Heading4"/>
@@ -11516,8 +11499,8 @@
         </w:tc>
       </w:tr>
     </w:tbl>
-    <w:bookmarkEnd w:id="149"/>
-    <w:bookmarkStart w:id="150" w:name="X0e9e3f984752b954aaab98655e513f4cd780034"/>
+    <w:bookmarkEnd w:id="150"/>
+    <w:bookmarkStart w:id="151" w:name="X0e9e3f984752b954aaab98655e513f4cd780034"/>
     <w:p>
       <w:pPr>
         <w:pStyle w:val="Heading4"/>
@@ -11673,7 +11656,7 @@
               <w:jc w:val="right"/>
             </w:pPr>
             <w:r>
-              <w:t xml:space="preserve">0.6283</w:t>
+              <w:t xml:space="preserve">0.6981</w:t>
             </w:r>
           </w:p>
         </w:tc>
@@ -11746,7 +11729,7 @@
               <w:jc w:val="right"/>
             </w:pPr>
             <w:r>
-              <w:t xml:space="preserve">0.4783</w:t>
+              <w:t xml:space="preserve">0.5314</w:t>
             </w:r>
           </w:p>
         </w:tc>
@@ -11819,7 +11802,7 @@
               <w:jc w:val="right"/>
             </w:pPr>
             <w:r>
-              <w:t xml:space="preserve">0.2541</w:t>
+              <w:t xml:space="preserve">0.2824</w:t>
             </w:r>
           </w:p>
         </w:tc>
@@ -11892,7 +11875,7 @@
               <w:jc w:val="right"/>
             </w:pPr>
             <w:r>
-              <w:t xml:space="preserve">0.5259</w:t>
+              <w:t xml:space="preserve">0.5843</w:t>
             </w:r>
           </w:p>
         </w:tc>
@@ -11965,7 +11948,7 @@
               <w:jc w:val="right"/>
             </w:pPr>
             <w:r>
-              <w:t xml:space="preserve">0.5251</w:t>
+              <w:t xml:space="preserve">0.5834</w:t>
             </w:r>
           </w:p>
         </w:tc>
@@ -11983,8 +11966,8 @@
         </w:tc>
       </w:tr>
     </w:tbl>
-    <w:bookmarkEnd w:id="150"/>
-    <w:bookmarkStart w:id="151" w:name="five-image-editability-suite"/>
+    <w:bookmarkEnd w:id="151"/>
+    <w:bookmarkStart w:id="152" w:name="five-image-editability-suite"/>
     <w:p>
       <w:pPr>
         <w:pStyle w:val="Heading4"/>
@@ -12523,8 +12506,8 @@
         </w:tc>
       </w:tr>
     </w:tbl>
-    <w:bookmarkEnd w:id="151"/>
-    <w:bookmarkStart w:id="152" w:name="promptable-extraction-benchmark-1"/>
+    <w:bookmarkEnd w:id="152"/>
+    <w:bookmarkStart w:id="153" w:name="promptable-extraction-benchmark-1"/>
     <w:p>
       <w:pPr>
         <w:pStyle w:val="Heading4"/>
@@ -12916,8 +12899,8 @@
         </w:tc>
       </w:tr>
     </w:tbl>
-    <w:bookmarkEnd w:id="152"/>
-    <w:bookmarkStart w:id="153" w:name="transparent-benchmark"/>
+    <w:bookmarkEnd w:id="153"/>
+    <w:bookmarkStart w:id="154" w:name="transparent-benchmark"/>
     <w:p>
       <w:pPr>
         <w:pStyle w:val="Heading4"/>
@@ -13090,9 +13073,9 @@
         </w:tc>
       </w:tr>
     </w:tbl>
-    <w:bookmarkEnd w:id="153"/>
     <w:bookmarkEnd w:id="154"/>
-    <w:bookmarkStart w:id="155" w:name="interpretation"/>
+    <w:bookmarkEnd w:id="155"/>
+    <w:bookmarkStart w:id="156" w:name="interpretation"/>
     <w:p>
       <w:pPr>
         <w:pStyle w:val="Heading3"/>
@@ -13285,12 +13268,12 @@
         <w:t xml:space="preserve">The intrinsic export path is present as a Retinex-style stretch module. The new intrinsic demo figure should be read as evidence of exported appearance factors for recolouring-style edits, not as a state-of-the-art intrinsic benchmark.</w:t>
       </w:r>
     </w:p>
-    <w:bookmarkEnd w:id="155"/>
     <w:bookmarkEnd w:id="156"/>
-    <w:bookmarkStart w:id="157" w:name="discussion"/>
-    <w:p>
-      <w:pPr>
-        <w:pStyle w:val="Heading2"/>
+    <w:bookmarkEnd w:id="157"/>
+    <w:bookmarkStart w:id="158" w:name="discussion"/>
+    <w:p>
+      <w:pPr>
+        <w:pStyle w:val="Heading1"/>
       </w:pPr>
       <w:r>
         <w:t xml:space="preserve">7. Discussion</w:t>
@@ -13304,11 +13287,11 @@
         <w:t xml:space="preserve">The current results do not support the claim that LayerForge-X universally exceeds generative decomposers on raw pixel fidelity. The defensible claim is narrower and more important: native, generative, and recursive decompositions are normalized into a single editable graph representation with auditable metrics and exportable structure. Qwen remains the appropriate generative RGBA baseline, while LayerForge-X is most compelling as a graph-aware, benchmarkable, editability-oriented complement to that frontier.</w:t>
       </w:r>
     </w:p>
-    <w:bookmarkEnd w:id="157"/>
-    <w:bookmarkStart w:id="160" w:name="limitations"/>
-    <w:p>
-      <w:pPr>
-        <w:pStyle w:val="Heading2"/>
+    <w:bookmarkEnd w:id="158"/>
+    <w:bookmarkStart w:id="161" w:name="limitations"/>
+    <w:p>
+      <w:pPr>
+        <w:pStyle w:val="Heading1"/>
       </w:pPr>
       <w:r>
         <w:t xml:space="preserve">8. Limitations</w:t>
@@ -13324,7 +13307,7 @@
       <w:r>
         <w:t xml:space="preserve"> </w:t>
       </w:r>
-      <w:hyperlink r:id="rId158">
+      <w:hyperlink r:id="rId159">
         <w:r>
           <w:rPr>
             <w:rStyle w:val="Hyperlink"/>
@@ -13341,7 +13324,7 @@
       <w:r>
         <w:t xml:space="preserve"> </w:t>
       </w:r>
-      <w:hyperlink r:id="rId159">
+      <w:hyperlink r:id="rId160">
         <w:r>
           <w:rPr>
             <w:rStyle w:val="Hyperlink"/>
@@ -13461,11 +13444,11 @@
         <w:t xml:space="preserve">transparent-layer recovery that is still approximate rather than generative.</w:t>
       </w:r>
     </w:p>
-    <w:bookmarkEnd w:id="160"/>
-    <w:bookmarkStart w:id="161" w:name="conclusion"/>
-    <w:p>
-      <w:pPr>
-        <w:pStyle w:val="Heading2"/>
+    <w:bookmarkEnd w:id="161"/>
+    <w:bookmarkStart w:id="162" w:name="conclusion"/>
+    <w:p>
+      <w:pPr>
+        <w:pStyle w:val="Heading1"/>
       </w:pPr>
       <w:r>
         <w:t xml:space="preserve">9. Conclusion</w:t>
@@ -13479,9 +13462,8 @@
         <w:t xml:space="preserve">LayerForge-X is best interpreted as a self-evaluating layer-representation system rather than a simple decomposition script. It produces native graph layers, enriches frontier RGBA layers, runs recursive peeling, measures editability, benchmarks prompt extraction, approximates transparent recovery, and exports a canonical DALG manifest. That combination defines the central project contribution.</w:t>
       </w:r>
     </w:p>
-    <w:bookmarkEnd w:id="161"/>
     <w:bookmarkEnd w:id="162"/>
-    <w:bookmarkStart w:id="176" w:name="references"/>
+    <w:bookmarkStart w:id="163" w:name="references"/>
     <w:p>
       <w:pPr>
         <w:pStyle w:val="Heading1"/>
@@ -13499,7 +13481,26 @@
         </w:numPr>
       </w:pPr>
       <w:r>
-        <w:t xml:space="preserve">Shade, J., Gortler, S., He, L., and Szeliski, R. Layered Depth Images. SIGGRAPH 1998.</w:t>
+        <w:t xml:space="preserve">Shade, J., Gortler, S. J., He, L.-w., and Szeliski, R.</w:t>
+      </w:r>
+      <w:r>
+        <w:t xml:space="preserve"> </w:t>
+      </w:r>
+      <w:r>
+        <w:t xml:space="preserve">“Layered Depth Images.”</w:t>
+      </w:r>
+      <w:r>
+        <w:t xml:space="preserve"> </w:t>
+      </w:r>
+      <w:r>
+        <w:rPr>
+          <w:i/>
+          <w:iCs/>
+        </w:rPr>
+        <w:t xml:space="preserve">Proceedings of SIGGRAPH</w:t>
+      </w:r>
+      <w:r>
+        <w:t xml:space="preserve">, 1998.</w:t>
       </w:r>
     </w:p>
     <w:p>
@@ -13511,7 +13512,26 @@
         </w:numPr>
       </w:pPr>
       <w:r>
-        <w:t xml:space="preserve">Shih, M.-L., Su, S.-Y., Kopf, J., and Huang, J.-B. 3D Photography using Context-aware Layered Depth Inpainting. CVPR 2020.</w:t>
+        <w:t xml:space="preserve">Shih, M.-L., Su, S.-Y., Kopf, J., and Huang, J.-B.</w:t>
+      </w:r>
+      <w:r>
+        <w:t xml:space="preserve"> </w:t>
+      </w:r>
+      <w:r>
+        <w:t xml:space="preserve">“3D Photography Using Context-Aware Layered Depth Inpainting.”</w:t>
+      </w:r>
+      <w:r>
+        <w:t xml:space="preserve"> </w:t>
+      </w:r>
+      <w:r>
+        <w:rPr>
+          <w:i/>
+          <w:iCs/>
+        </w:rPr>
+        <w:t xml:space="preserve">Proceedings of CVPR</w:t>
+      </w:r>
+      <w:r>
+        <w:t xml:space="preserve">, 2020.</w:t>
       </w:r>
     </w:p>
     <w:p>
@@ -13523,7 +13543,23 @@
         </w:numPr>
       </w:pPr>
       <w:r>
-        <w:t xml:space="preserve">Kirillov, A. et al. Panoptic Segmentation. CVPR 2019.</w:t>
+        <w:t xml:space="preserve">Kirillov, A. et al. </w:t>
+      </w:r>
+      <w:r>
+        <w:t xml:space="preserve">“Panoptic Segmentation.”</w:t>
+      </w:r>
+      <w:r>
+        <w:t xml:space="preserve"> </w:t>
+      </w:r>
+      <w:r>
+        <w:rPr>
+          <w:i/>
+          <w:iCs/>
+        </w:rPr>
+        <w:t xml:space="preserve">Proceedings of CVPR</w:t>
+      </w:r>
+      <w:r>
+        <w:t xml:space="preserve">, 2019.</w:t>
       </w:r>
     </w:p>
     <w:p>
@@ -13535,7 +13571,23 @@
         </w:numPr>
       </w:pPr>
       <w:r>
-        <w:t xml:space="preserve">Cheng, B. et al. Mask2Former for Universal Image Segmentation. CVPR 2022.</w:t>
+        <w:t xml:space="preserve">Cheng, B. et al. </w:t>
+      </w:r>
+      <w:r>
+        <w:t xml:space="preserve">“Masked-Attention Mask Transformer for Universal Image Segmentation.”</w:t>
+      </w:r>
+      <w:r>
+        <w:t xml:space="preserve"> </w:t>
+      </w:r>
+      <w:r>
+        <w:rPr>
+          <w:i/>
+          <w:iCs/>
+        </w:rPr>
+        <w:t xml:space="preserve">Proceedings of CVPR</w:t>
+      </w:r>
+      <w:r>
+        <w:t xml:space="preserve">, 2022.</w:t>
       </w:r>
     </w:p>
     <w:p>
@@ -13547,7 +13599,23 @@
         </w:numPr>
       </w:pPr>
       <w:r>
-        <w:t xml:space="preserve">Liu, S. et al. Grounding DINO: Marrying DINO with Grounded Pre-Training for Open-Set Object Detection. ECCV 2024 / arXiv 2023.</w:t>
+        <w:t xml:space="preserve">Liu, S. et al. </w:t>
+      </w:r>
+      <w:r>
+        <w:t xml:space="preserve">“Grounding DINO: Marrying DINO with Grounded Pre-Training for Open-Set Object Detection.”</w:t>
+      </w:r>
+      <w:r>
+        <w:t xml:space="preserve"> </w:t>
+      </w:r>
+      <w:r>
+        <w:rPr>
+          <w:i/>
+          <w:iCs/>
+        </w:rPr>
+        <w:t xml:space="preserve">Proceedings of ECCV</w:t>
+      </w:r>
+      <w:r>
+        <w:t xml:space="preserve">, 2024.</w:t>
       </w:r>
     </w:p>
     <w:p>
@@ -13559,7 +13627,16 @@
         </w:numPr>
       </w:pPr>
       <w:r>
-        <w:t xml:space="preserve">Ravi, N. et al. SAM 2: Segment Anything in Images and Videos. 2024.</w:t>
+        <w:t xml:space="preserve">Ravi, N. et al. </w:t>
+      </w:r>
+      <w:r>
+        <w:t xml:space="preserve">“SAM 2: Segment Anything in Images and Videos.”</w:t>
+      </w:r>
+      <w:r>
+        <w:t xml:space="preserve"> </w:t>
+      </w:r>
+      <w:r>
+        <w:t xml:space="preserve">arXiv preprint, 2024.</w:t>
       </w:r>
     </w:p>
     <w:p>
@@ -13571,7 +13648,23 @@
         </w:numPr>
       </w:pPr>
       <w:r>
-        <w:t xml:space="preserve">Xiao, B. et al. Florence-2: Advancing a Unified Representation for a Variety of Vision Tasks. CVPR 2024.</w:t>
+        <w:t xml:space="preserve">Xiao, B. et al. </w:t>
+      </w:r>
+      <w:r>
+        <w:t xml:space="preserve">“Florence-2: Advancing a Unified Representation for a Variety of Vision Tasks.”</w:t>
+      </w:r>
+      <w:r>
+        <w:t xml:space="preserve"> </w:t>
+      </w:r>
+      <w:r>
+        <w:rPr>
+          <w:i/>
+          <w:iCs/>
+        </w:rPr>
+        <w:t xml:space="preserve">Proceedings of CVPR</w:t>
+      </w:r>
+      <w:r>
+        <w:t xml:space="preserve">, 2024.</w:t>
       </w:r>
     </w:p>
     <w:p>
@@ -13583,7 +13676,16 @@
         </w:numPr>
       </w:pPr>
       <w:r>
-        <w:t xml:space="preserve">Bochkovskiy, A. et al. Depth Pro: Sharp Monocular Metric Depth in Less Than a Second. 2024.</w:t>
+        <w:t xml:space="preserve">Bochkovskiy, A. et al. </w:t>
+      </w:r>
+      <w:r>
+        <w:t xml:space="preserve">“Depth Pro: Sharp Monocular Metric Depth in Less Than a Second.”</w:t>
+      </w:r>
+      <w:r>
+        <w:t xml:space="preserve"> </w:t>
+      </w:r>
+      <w:r>
+        <w:t xml:space="preserve">arXiv preprint, 2024.</w:t>
       </w:r>
     </w:p>
     <w:p>
@@ -13595,7 +13697,23 @@
         </w:numPr>
       </w:pPr>
       <w:r>
-        <w:t xml:space="preserve">Yang, Y. et al. Generative Image Layer Decomposition with Visual Effects. CVPR 2025.</w:t>
+        <w:t xml:space="preserve">Yang, Y. et al. </w:t>
+      </w:r>
+      <w:r>
+        <w:t xml:space="preserve">“Generative Image Layer Decomposition with Visual Effects.”</w:t>
+      </w:r>
+      <w:r>
+        <w:t xml:space="preserve"> </w:t>
+      </w:r>
+      <w:r>
+        <w:rPr>
+          <w:i/>
+          <w:iCs/>
+        </w:rPr>
+        <w:t xml:space="preserve">Proceedings of CVPR</w:t>
+      </w:r>
+      <w:r>
+        <w:t xml:space="preserve">, 2025.</w:t>
       </w:r>
     </w:p>
     <w:p>
@@ -13607,7 +13725,17 @@
         </w:numPr>
       </w:pPr>
       <w:r>
-        <w:t xml:space="preserve">DiffDecompose: Layer-Wise Decomposition of Alpha-Composited Images via Diffusion Transformers. arXiv 2025.</w:t>
+        <w:rPr>
+          <w:i/>
+          <w:iCs/>
+        </w:rPr>
+        <w:t xml:space="preserve">DiffDecompose: Layer-Wise Decomposition of Alpha-Composited Images via Diffusion Transformers.</w:t>
+      </w:r>
+      <w:r>
+        <w:t xml:space="preserve"> </w:t>
+      </w:r>
+      <w:r>
+        <w:t xml:space="preserve">arXiv preprint, 2025.</w:t>
       </w:r>
     </w:p>
     <w:p>
@@ -13619,7 +13747,17 @@
         </w:numPr>
       </w:pPr>
       <w:r>
-        <w:t xml:space="preserve">Referring Layer Decomposition. arXiv 2026.</w:t>
+        <w:rPr>
+          <w:i/>
+          <w:iCs/>
+        </w:rPr>
+        <w:t xml:space="preserve">Referring Layer Decomposition.</w:t>
+      </w:r>
+      <w:r>
+        <w:t xml:space="preserve"> </w:t>
+      </w:r>
+      <w:r>
+        <w:t xml:space="preserve">arXiv preprint, 2026.</w:t>
       </w:r>
     </w:p>
     <w:p>
@@ -13631,7 +13769,17 @@
         </w:numPr>
       </w:pPr>
       <w:r>
-        <w:t xml:space="preserve">Qwen-Image-Layered: Towards Inherent Editability via Layer Decomposition. 2025.</w:t>
+        <w:rPr>
+          <w:i/>
+          <w:iCs/>
+        </w:rPr>
+        <w:t xml:space="preserve">Qwen-Image-Layered: Towards Inherent Editability via Layer Decomposition.</w:t>
+      </w:r>
+      <w:r>
+        <w:t xml:space="preserve"> </w:t>
+      </w:r>
+      <w:r>
+        <w:t xml:space="preserve">arXiv preprint, 2025.</w:t>
       </w:r>
     </w:p>
     <w:p>
@@ -13643,7 +13791,16 @@
         </w:numPr>
       </w:pPr>
       <w:r>
-        <w:t xml:space="preserve">Yao, J. et al. Matte Anything. 2024.</w:t>
+        <w:t xml:space="preserve">Yao, J. et al. </w:t>
+      </w:r>
+      <w:r>
+        <w:t xml:space="preserve">“Matte Anything.”</w:t>
+      </w:r>
+      <w:r>
+        <w:t xml:space="preserve"> </w:t>
+      </w:r>
+      <w:r>
+        <w:t xml:space="preserve">arXiv preprint, 2024.</w:t>
       </w:r>
     </w:p>
     <w:p>
@@ -13655,7 +13812,23 @@
         </w:numPr>
       </w:pPr>
       <w:r>
-        <w:t xml:space="preserve">Suvorov, R. et al. Resolution-robust Large Mask Inpainting with Fourier Convolutions. WACV 2022.</w:t>
+        <w:t xml:space="preserve">Suvorov, R. et al. </w:t>
+      </w:r>
+      <w:r>
+        <w:t xml:space="preserve">“Resolution-Robust Large Mask Inpainting with Fourier Convolutions.”</w:t>
+      </w:r>
+      <w:r>
+        <w:t xml:space="preserve"> </w:t>
+      </w:r>
+      <w:r>
+        <w:rPr>
+          <w:i/>
+          <w:iCs/>
+        </w:rPr>
+        <w:t xml:space="preserve">Proceedings of WACV</w:t>
+      </w:r>
+      <w:r>
+        <w:t xml:space="preserve">, 2022.</w:t>
       </w:r>
     </w:p>
     <w:p>
@@ -13667,7 +13840,23 @@
         </w:numPr>
       </w:pPr>
       <w:r>
-        <w:t xml:space="preserve">Bell, S. et al. Intrinsic Images in the Wild. SIGGRAPH 2014.</w:t>
+        <w:t xml:space="preserve">Bell, S. et al. </w:t>
+      </w:r>
+      <w:r>
+        <w:t xml:space="preserve">“Intrinsic Images in the Wild.”</w:t>
+      </w:r>
+      <w:r>
+        <w:t xml:space="preserve"> </w:t>
+      </w:r>
+      <w:r>
+        <w:rPr>
+          <w:i/>
+          <w:iCs/>
+        </w:rPr>
+        <w:t xml:space="preserve">ACM Transactions on Graphics (SIGGRAPH)</w:t>
+      </w:r>
+      <w:r>
+        <w:t xml:space="preserve">, 2014.</w:t>
       </w:r>
     </w:p>
     <w:p>
@@ -13679,16 +13868,26 @@
         </w:numPr>
       </w:pPr>
       <w:r>
-        <w:t xml:space="preserve">Tai, Y. et al. Segment Anything, Even Occluded. 2025.</w:t>
-      </w:r>
-    </w:p>
-    <w:bookmarkStart w:id="174" w:name="appendix-a-artifact-map"/>
-    <w:p>
-      <w:pPr>
-        <w:pStyle w:val="Heading2"/>
-      </w:pPr>
-      <w:r>
-        <w:t xml:space="preserve">Appendix A: artifact map</w:t>
+        <w:t xml:space="preserve">Tai, Y. et al. </w:t>
+      </w:r>
+      <w:r>
+        <w:t xml:space="preserve">“Segment Anything, Even Occluded.”</w:t>
+      </w:r>
+      <w:r>
+        <w:t xml:space="preserve"> </w:t>
+      </w:r>
+      <w:r>
+        <w:t xml:space="preserve">arXiv preprint, 2025.</w:t>
+      </w:r>
+    </w:p>
+    <w:bookmarkEnd w:id="163"/>
+    <w:bookmarkStart w:id="175" w:name="appendix-a-artifact-map"/>
+    <w:p>
+      <w:pPr>
+        <w:pStyle w:val="Heading1"/>
+      </w:pPr>
+      <w:r>
+        <w:t xml:space="preserve">Appendix A: Artifact Map</w:t>
       </w:r>
     </w:p>
     <w:p>
@@ -13707,7 +13906,7 @@
           <w:numId w:val="1019"/>
         </w:numPr>
       </w:pPr>
-      <w:hyperlink r:id="rId163">
+      <w:hyperlink r:id="rId164">
         <w:r>
           <w:rPr>
             <w:rStyle w:val="Hyperlink"/>
@@ -13724,7 +13923,7 @@
           <w:numId w:val="1019"/>
         </w:numPr>
       </w:pPr>
-      <w:hyperlink r:id="rId164">
+      <w:hyperlink r:id="rId165">
         <w:r>
           <w:rPr>
             <w:rStyle w:val="Hyperlink"/>
@@ -13741,7 +13940,7 @@
           <w:numId w:val="1019"/>
         </w:numPr>
       </w:pPr>
-      <w:hyperlink r:id="rId165">
+      <w:hyperlink r:id="rId166">
         <w:r>
           <w:rPr>
             <w:rStyle w:val="Hyperlink"/>
@@ -13758,7 +13957,7 @@
           <w:numId w:val="1019"/>
         </w:numPr>
       </w:pPr>
-      <w:hyperlink r:id="rId166">
+      <w:hyperlink r:id="rId167">
         <w:r>
           <w:rPr>
             <w:rStyle w:val="Hyperlink"/>
@@ -13775,7 +13974,7 @@
           <w:numId w:val="1019"/>
         </w:numPr>
       </w:pPr>
-      <w:hyperlink r:id="rId167">
+      <w:hyperlink r:id="rId168">
         <w:r>
           <w:rPr>
             <w:rStyle w:val="Hyperlink"/>
@@ -13792,7 +13991,7 @@
           <w:numId w:val="1019"/>
         </w:numPr>
       </w:pPr>
-      <w:hyperlink r:id="rId168">
+      <w:hyperlink r:id="rId169">
         <w:r>
           <w:rPr>
             <w:rStyle w:val="Hyperlink"/>
@@ -13809,7 +14008,7 @@
           <w:numId w:val="1019"/>
         </w:numPr>
       </w:pPr>
-      <w:hyperlink r:id="rId169">
+      <w:hyperlink r:id="rId170">
         <w:r>
           <w:rPr>
             <w:rStyle w:val="Hyperlink"/>
@@ -13826,7 +14025,7 @@
           <w:numId w:val="1019"/>
         </w:numPr>
       </w:pPr>
-      <w:hyperlink r:id="rId170">
+      <w:hyperlink r:id="rId171">
         <w:r>
           <w:rPr>
             <w:rStyle w:val="Hyperlink"/>
@@ -13843,7 +14042,7 @@
           <w:numId w:val="1019"/>
         </w:numPr>
       </w:pPr>
-      <w:hyperlink r:id="rId171">
+      <w:hyperlink r:id="rId172">
         <w:r>
           <w:rPr>
             <w:rStyle w:val="Hyperlink"/>
@@ -13860,7 +14059,7 @@
           <w:numId w:val="1019"/>
         </w:numPr>
       </w:pPr>
-      <w:hyperlink r:id="rId172">
+      <w:hyperlink r:id="rId173">
         <w:r>
           <w:rPr>
             <w:rStyle w:val="Hyperlink"/>
@@ -13877,7 +14076,7 @@
           <w:numId w:val="1019"/>
         </w:numPr>
       </w:pPr>
-      <w:hyperlink r:id="rId173">
+      <w:hyperlink r:id="rId174">
         <w:r>
           <w:rPr>
             <w:rStyle w:val="Hyperlink"/>
@@ -13886,25 +14085,14 @@
         </w:r>
       </w:hyperlink>
     </w:p>
-    <w:bookmarkEnd w:id="174"/>
-    <w:bookmarkStart w:id="175" w:name="appendix-b-extended-tables-and-ablations"/>
-    <w:p>
-      <w:pPr>
-        <w:pStyle w:val="Heading2"/>
-      </w:pPr>
-      <w:r>
-        <w:t xml:space="preserve">Appendix B: extended tables and ablations</w:t>
-      </w:r>
-    </w:p>
     <w:bookmarkEnd w:id="175"/>
-    <w:bookmarkEnd w:id="176"/>
-    <w:bookmarkStart w:id="191" w:name="X45208ce828bed5a4ae76192024806b0334f8216"/>
+    <w:bookmarkStart w:id="186" w:name="appendix-b-extended-tables-and-ablations"/>
     <w:p>
       <w:pPr>
         <w:pStyle w:val="Heading1"/>
       </w:pPr>
       <w:r>
-        <w:t xml:space="preserve">Appendix B. Extended Tables and Ablations</w:t>
+        <w:t xml:space="preserve">Appendix B: Extended Tables and Ablations</w:t>
       </w:r>
     </w:p>
     <w:p>
@@ -13915,7 +14103,7 @@
         <w:t xml:space="preserve">This appendix collects the extended quantitative tables, measured ablations, and failure-taxonomy material that support the main report.</w:t>
       </w:r>
     </w:p>
-    <w:bookmarkStart w:id="177" w:name="b.1-completed-runs-snapshot"/>
+    <w:bookmarkStart w:id="176" w:name="b.1-completed-runs-snapshot"/>
     <w:p>
       <w:pPr>
         <w:pStyle w:val="Heading2"/>
@@ -14423,8 +14611,8 @@
         <w:t xml:space="preserve">system rather than further tuning of the deterministic baseline.</w:t>
       </w:r>
     </w:p>
-    <w:bookmarkEnd w:id="177"/>
-    <w:bookmarkStart w:id="178" w:name="b.2-frontier-candidate-bank-review"/>
+    <w:bookmarkEnd w:id="176"/>
+    <w:bookmarkStart w:id="177" w:name="b.2-frontier-candidate-bank-review"/>
     <w:p>
       <w:pPr>
         <w:pStyle w:val="Heading2"/>
@@ -14438,7 +14626,7 @@
         <w:pStyle w:val="FirstParagraph"/>
       </w:pPr>
       <w:r>
-        <w:t xml:space="preserve">The repository contains a measured five-image frontier comparison in</w:t>
+        <w:t xml:space="preserve">The local working tree contains a measured five-image frontier comparison in</w:t>
       </w:r>
       <w:r>
         <w:t xml:space="preserve"> </w:t>
@@ -14448,6 +14636,18 @@
           <w:rStyle w:val="VerbatimChar"/>
         </w:rPr>
         <w:t xml:space="preserve">runs/frontier_review/frontier_summary.json</w:t>
+      </w:r>
+      <w:r>
+        <w:t xml:space="preserve">, and the submission archive ships the copied summary in</w:t>
+      </w:r>
+      <w:r>
+        <w:t xml:space="preserve"> </w:t>
+      </w:r>
+      <w:r>
+        <w:rPr>
+          <w:rStyle w:val="VerbatimChar"/>
+        </w:rPr>
+        <w:t xml:space="preserve">report_artifacts/metrics_snapshots/frontier_review_summary.json</w:t>
       </w:r>
       <w:r>
         <w:t xml:space="preserve">.</w:t>
@@ -14600,7 +14800,7 @@
               <w:jc w:val="right"/>
             </w:pPr>
             <w:r>
-              <w:t xml:space="preserve">0.6283</w:t>
+              <w:t xml:space="preserve">0.6981</w:t>
             </w:r>
           </w:p>
         </w:tc>
@@ -14673,7 +14873,7 @@
               <w:jc w:val="right"/>
             </w:pPr>
             <w:r>
-              <w:t xml:space="preserve">0.4783</w:t>
+              <w:t xml:space="preserve">0.5314</w:t>
             </w:r>
           </w:p>
         </w:tc>
@@ -14746,7 +14946,7 @@
               <w:jc w:val="right"/>
             </w:pPr>
             <w:r>
-              <w:t xml:space="preserve">0.2541</w:t>
+              <w:t xml:space="preserve">0.2824</w:t>
             </w:r>
           </w:p>
         </w:tc>
@@ -14819,7 +15019,7 @@
               <w:jc w:val="right"/>
             </w:pPr>
             <w:r>
-              <w:t xml:space="preserve">0.5259</w:t>
+              <w:t xml:space="preserve">0.5843</w:t>
             </w:r>
           </w:p>
         </w:tc>
@@ -14892,7 +15092,7 @@
               <w:jc w:val="right"/>
             </w:pPr>
             <w:r>
-              <w:t xml:space="preserve">0.5251</w:t>
+              <w:t xml:space="preserve">0.5834</w:t>
             </w:r>
           </w:p>
         </w:tc>
@@ -14996,8 +15196,8 @@
         <w:t xml:space="preserve">remains the compact generative baseline, but it is no longer the strongest editable representation once structure and editability are scored explicitly.</w:t>
       </w:r>
     </w:p>
-    <w:bookmarkEnd w:id="178"/>
-    <w:bookmarkStart w:id="179" w:name="b.3-editability-suite"/>
+    <w:bookmarkEnd w:id="177"/>
+    <w:bookmarkStart w:id="178" w:name="b.3-editability-suite"/>
     <w:p>
       <w:pPr>
         <w:pStyle w:val="Heading2"/>
@@ -15609,8 +15809,8 @@
         <w:t xml:space="preserve">the hybrid rows currently post the strongest edit-success scores because imported generative stacks combined with explicit LayerForge graph metadata remain easy to move, recolor, and remove cleanly.</w:t>
       </w:r>
     </w:p>
-    <w:bookmarkEnd w:id="179"/>
-    <w:bookmarkStart w:id="180" w:name="b.4-promptable-extraction-benchmark"/>
+    <w:bookmarkEnd w:id="178"/>
+    <w:bookmarkStart w:id="179" w:name="b.4-promptable-extraction-benchmark"/>
     <w:p>
       <w:pPr>
         <w:pStyle w:val="Heading2"/>
@@ -16055,8 +16255,8 @@
         <w:t xml:space="preserve">the present bottleneck is semantic routing rather than matte stability.</w:t>
       </w:r>
     </w:p>
-    <w:bookmarkEnd w:id="180"/>
-    <w:bookmarkStart w:id="181" w:name="b.5-transparent-benchmark"/>
+    <w:bookmarkEnd w:id="179"/>
+    <w:bookmarkStart w:id="180" w:name="b.5-transparent-benchmark"/>
     <w:p>
       <w:pPr>
         <w:pStyle w:val="Heading2"/>
@@ -16281,8 +16481,8 @@
         <w:t xml:space="preserve">the prototype is strongest on flare-like overlays and weakest on the semi-transparent panel variant.</w:t>
       </w:r>
     </w:p>
-    <w:bookmarkEnd w:id="181"/>
-    <w:bookmarkStart w:id="182" w:name="b.6-main-ablation-matrix"/>
+    <w:bookmarkEnd w:id="180"/>
+    <w:bookmarkStart w:id="181" w:name="b.6-main-ablation-matrix"/>
     <w:p>
       <w:pPr>
         <w:pStyle w:val="Heading2"/>
@@ -17323,8 +17523,8 @@
         </w:tc>
       </w:tr>
     </w:tbl>
-    <w:bookmarkEnd w:id="182"/>
-    <w:bookmarkStart w:id="183" w:name="b.7-literature-comparison"/>
+    <w:bookmarkEnd w:id="181"/>
+    <w:bookmarkStart w:id="182" w:name="b.7-literature-comparison"/>
     <w:p>
       <w:pPr>
         <w:pStyle w:val="Heading2"/>
@@ -18435,8 +18635,8 @@
         </w:tc>
       </w:tr>
     </w:tbl>
-    <w:bookmarkEnd w:id="183"/>
-    <w:bookmarkStart w:id="184" w:name="b.8-dataset-coverage"/>
+    <w:bookmarkEnd w:id="182"/>
+    <w:bookmarkStart w:id="183" w:name="b.8-dataset-coverage"/>
     <w:p>
       <w:pPr>
         <w:pStyle w:val="Heading2"/>
@@ -18876,8 +19076,8 @@
         </w:tc>
       </w:tr>
     </w:tbl>
-    <w:bookmarkEnd w:id="184"/>
-    <w:bookmarkStart w:id="185" w:name="b.9-failure-taxonomy"/>
+    <w:bookmarkEnd w:id="183"/>
+    <w:bookmarkStart w:id="184" w:name="b.9-failure-taxonomy"/>
     <w:p>
       <w:pPr>
         <w:pStyle w:val="Heading2"/>
@@ -19363,8 +19563,8 @@
         </w:tc>
       </w:tr>
     </w:tbl>
-    <w:bookmarkEnd w:id="185"/>
-    <w:bookmarkStart w:id="186" w:name="b.10-intrinsic-export-snapshot"/>
+    <w:bookmarkEnd w:id="184"/>
+    <w:bookmarkStart w:id="185" w:name="b.10-intrinsic-export-snapshot"/>
     <w:p>
       <w:pPr>
         <w:pStyle w:val="Heading2"/>
@@ -19628,14 +19828,15 @@
         <w:t xml:space="preserve">.</w:t>
       </w:r>
     </w:p>
+    <w:bookmarkEnd w:id="185"/>
     <w:bookmarkEnd w:id="186"/>
     <w:bookmarkStart w:id="187" w:name="appendix-c-command-log"/>
     <w:p>
       <w:pPr>
-        <w:pStyle w:val="Heading2"/>
-      </w:pPr>
-      <w:r>
-        <w:t xml:space="preserve">Appendix C: command log</w:t>
+        <w:pStyle w:val="Heading1"/>
+      </w:pPr>
+      <w:r>
+        <w:t xml:space="preserve">Appendix C: Command Log</w:t>
       </w:r>
     </w:p>
     <w:p>
@@ -19646,7 +19847,7 @@
           <w:numId w:val="1026"/>
         </w:numPr>
       </w:pPr>
-      <w:hyperlink r:id="rId167">
+      <w:hyperlink r:id="rId168">
         <w:r>
           <w:rPr>
             <w:rStyle w:val="Hyperlink"/>
@@ -19659,10 +19860,10 @@
     <w:bookmarkStart w:id="190" w:name="appendix-d-extra-literature-notes"/>
     <w:p>
       <w:pPr>
-        <w:pStyle w:val="Heading2"/>
-      </w:pPr>
-      <w:r>
-        <w:t xml:space="preserve">Appendix D: extra literature notes</w:t>
+        <w:pStyle w:val="Heading1"/>
+      </w:pPr>
+      <w:r>
+        <w:t xml:space="preserve">Appendix D: Extra Literature Notes</w:t>
       </w:r>
     </w:p>
     <w:p>
@@ -19700,7 +19901,6 @@
       </w:hyperlink>
     </w:p>
     <w:bookmarkEnd w:id="190"/>
-    <w:bookmarkEnd w:id="191"/>
     <w:sectPr/>
   </w:body>
 </w:document>

</xml_diff>

<commit_message>
docs: publish qwen layer-count sweep
</commit_message>
<xml_diff>
--- a/docs/final_report_pack/LayerForge_X_Final_Report_2026_04_22.docx
+++ b/docs/final_report_pack/LayerForge_X_Final_Report_2026_04_22.docx
@@ -14010,7 +14010,7 @@
       </w:hyperlink>
     </w:p>
     <w:bookmarkEnd w:id="172"/>
-    <w:bookmarkStart w:id="187" w:name="appendix-b-extended-tables-and-ablations"/>
+    <w:bookmarkStart w:id="188" w:name="appendix-b-extended-tables-and-ablations"/>
     <w:p>
       <w:pPr>
         <w:pStyle w:val="Heading1"/>
@@ -15663,7 +15663,646 @@
       </w:r>
     </w:p>
     <w:bookmarkEnd w:id="175"/>
-    <w:bookmarkStart w:id="176" w:name="b.4-promptable-extraction-benchmark"/>
+    <w:bookmarkStart w:id="176" w:name="b.3a-qwen-layer-count-sweep"/>
+    <w:p>
+      <w:pPr>
+        <w:pStyle w:val="Heading2"/>
+      </w:pPr>
+      <w:r>
+        <w:t xml:space="preserve">B.3a Qwen layer-count sweep</w:t>
+      </w:r>
+    </w:p>
+    <w:p>
+      <w:pPr>
+        <w:pStyle w:val="FirstParagraph"/>
+      </w:pPr>
+      <w:r>
+        <w:t xml:space="preserve">The repository also includes a measured five-image</w:t>
+      </w:r>
+      <w:r>
+        <w:t xml:space="preserve"> </w:t>
+      </w:r>
+      <w:r>
+        <w:rPr>
+          <w:rStyle w:val="VerbatimChar"/>
+        </w:rPr>
+        <w:t xml:space="preserve">3/4/6/8</w:t>
+      </w:r>
+      <w:r>
+        <w:t xml:space="preserve"> </w:t>
+      </w:r>
+      <w:r>
+        <w:t xml:space="preserve">sweep for the Qwen family. This experiment keeps the same five images while varying the requested Qwen layer count.</w:t>
+      </w:r>
+    </w:p>
+    <w:tbl>
+      <w:tblPr>
+        <w:tblStyle w:val="Table"/>
+        <w:tblW w:type="auto" w:w="0"/>
+        <w:tblLook w:firstRow="1" w:lastRow="0" w:firstColumn="0" w:lastColumn="0" w:noHBand="0" w:noVBand="0" w:val="0020"/>
+      </w:tblPr>
+      <w:tblGrid>
+        <w:gridCol w:w="2640"/>
+        <w:gridCol w:w="2640"/>
+        <w:gridCol w:w="2640"/>
+      </w:tblGrid>
+      <w:tr>
+        <w:trPr>
+          <w:tblHeader w:val="on"/>
+        </w:trPr>
+        <w:tc>
+          <w:tcPr/>
+          <w:p>
+            <w:pPr>
+              <w:pStyle w:val="Compact"/>
+            </w:pPr>
+            <w:r>
+              <w:t xml:space="preserve">Row</w:t>
+            </w:r>
+          </w:p>
+        </w:tc>
+        <w:tc>
+          <w:tcPr/>
+          <w:p>
+            <w:pPr>
+              <w:pStyle w:val="Compact"/>
+              <w:jc w:val="right"/>
+            </w:pPr>
+            <w:r>
+              <w:t xml:space="preserve">PSNR</w:t>
+            </w:r>
+          </w:p>
+        </w:tc>
+        <w:tc>
+          <w:tcPr/>
+          <w:p>
+            <w:pPr>
+              <w:pStyle w:val="Compact"/>
+              <w:jc w:val="right"/>
+            </w:pPr>
+            <w:r>
+              <w:t xml:space="preserve">SSIM</w:t>
+            </w:r>
+          </w:p>
+        </w:tc>
+      </w:tr>
+      <w:tr>
+        <w:tc>
+          <w:tcPr/>
+          <w:p>
+            <w:pPr>
+              <w:pStyle w:val="Compact"/>
+            </w:pPr>
+            <w:r>
+              <w:t xml:space="preserve">Q raw3</w:t>
+            </w:r>
+          </w:p>
+        </w:tc>
+        <w:tc>
+          <w:tcPr/>
+          <w:p>
+            <w:pPr>
+              <w:pStyle w:val="Compact"/>
+              <w:jc w:val="right"/>
+            </w:pPr>
+            <w:r>
+              <w:t xml:space="preserve">29.7574</w:t>
+            </w:r>
+          </w:p>
+        </w:tc>
+        <w:tc>
+          <w:tcPr/>
+          <w:p>
+            <w:pPr>
+              <w:pStyle w:val="Compact"/>
+              <w:jc w:val="right"/>
+            </w:pPr>
+            <w:r>
+              <w:t xml:space="preserve">0.8874</w:t>
+            </w:r>
+          </w:p>
+        </w:tc>
+      </w:tr>
+      <w:tr>
+        <w:tc>
+          <w:tcPr/>
+          <w:p>
+            <w:pPr>
+              <w:pStyle w:val="Compact"/>
+            </w:pPr>
+            <w:r>
+              <w:t xml:space="preserve">Q raw4</w:t>
+            </w:r>
+          </w:p>
+        </w:tc>
+        <w:tc>
+          <w:tcPr/>
+          <w:p>
+            <w:pPr>
+              <w:pStyle w:val="Compact"/>
+              <w:jc w:val="right"/>
+            </w:pPr>
+            <w:r>
+              <w:t xml:space="preserve">29.0757</w:t>
+            </w:r>
+          </w:p>
+        </w:tc>
+        <w:tc>
+          <w:tcPr/>
+          <w:p>
+            <w:pPr>
+              <w:pStyle w:val="Compact"/>
+              <w:jc w:val="right"/>
+            </w:pPr>
+            <w:r>
+              <w:t xml:space="preserve">0.8850</w:t>
+            </w:r>
+          </w:p>
+        </w:tc>
+      </w:tr>
+      <w:tr>
+        <w:tc>
+          <w:tcPr/>
+          <w:p>
+            <w:pPr>
+              <w:pStyle w:val="Compact"/>
+            </w:pPr>
+            <w:r>
+              <w:t xml:space="preserve">Q raw6</w:t>
+            </w:r>
+          </w:p>
+        </w:tc>
+        <w:tc>
+          <w:tcPr/>
+          <w:p>
+            <w:pPr>
+              <w:pStyle w:val="Compact"/>
+              <w:jc w:val="right"/>
+            </w:pPr>
+            <w:r>
+              <w:t xml:space="preserve">29.1079</w:t>
+            </w:r>
+          </w:p>
+        </w:tc>
+        <w:tc>
+          <w:tcPr/>
+          <w:p>
+            <w:pPr>
+              <w:pStyle w:val="Compact"/>
+              <w:jc w:val="right"/>
+            </w:pPr>
+            <w:r>
+              <w:t xml:space="preserve">0.8800</w:t>
+            </w:r>
+          </w:p>
+        </w:tc>
+      </w:tr>
+      <w:tr>
+        <w:tc>
+          <w:tcPr/>
+          <w:p>
+            <w:pPr>
+              <w:pStyle w:val="Compact"/>
+            </w:pPr>
+            <w:r>
+              <w:t xml:space="preserve">Q raw8</w:t>
+            </w:r>
+          </w:p>
+        </w:tc>
+        <w:tc>
+          <w:tcPr/>
+          <w:p>
+            <w:pPr>
+              <w:pStyle w:val="Compact"/>
+              <w:jc w:val="right"/>
+            </w:pPr>
+            <w:r>
+              <w:t xml:space="preserve">27.1419</w:t>
+            </w:r>
+          </w:p>
+        </w:tc>
+        <w:tc>
+          <w:tcPr/>
+          <w:p>
+            <w:pPr>
+              <w:pStyle w:val="Compact"/>
+              <w:jc w:val="right"/>
+            </w:pPr>
+            <w:r>
+              <w:t xml:space="preserve">0.8663</w:t>
+            </w:r>
+          </w:p>
+        </w:tc>
+      </w:tr>
+      <w:tr>
+        <w:tc>
+          <w:tcPr/>
+          <w:p>
+            <w:pPr>
+              <w:pStyle w:val="Compact"/>
+            </w:pPr>
+            <w:r>
+              <w:t xml:space="preserve">Q+G-P3</w:t>
+            </w:r>
+          </w:p>
+        </w:tc>
+        <w:tc>
+          <w:tcPr/>
+          <w:p>
+            <w:pPr>
+              <w:pStyle w:val="Compact"/>
+              <w:jc w:val="right"/>
+            </w:pPr>
+            <w:r>
+              <w:t xml:space="preserve">29.2311</w:t>
+            </w:r>
+          </w:p>
+        </w:tc>
+        <w:tc>
+          <w:tcPr/>
+          <w:p>
+            <w:pPr>
+              <w:pStyle w:val="Compact"/>
+              <w:jc w:val="right"/>
+            </w:pPr>
+            <w:r>
+              <w:t xml:space="preserve">0.8663</w:t>
+            </w:r>
+          </w:p>
+        </w:tc>
+      </w:tr>
+      <w:tr>
+        <w:tc>
+          <w:tcPr/>
+          <w:p>
+            <w:pPr>
+              <w:pStyle w:val="Compact"/>
+            </w:pPr>
+            <w:r>
+              <w:t xml:space="preserve">Q+G-P4</w:t>
+            </w:r>
+          </w:p>
+        </w:tc>
+        <w:tc>
+          <w:tcPr/>
+          <w:p>
+            <w:pPr>
+              <w:pStyle w:val="Compact"/>
+              <w:jc w:val="right"/>
+            </w:pPr>
+            <w:r>
+              <w:t xml:space="preserve">28.5539</w:t>
+            </w:r>
+          </w:p>
+        </w:tc>
+        <w:tc>
+          <w:tcPr/>
+          <w:p>
+            <w:pPr>
+              <w:pStyle w:val="Compact"/>
+              <w:jc w:val="right"/>
+            </w:pPr>
+            <w:r>
+              <w:t xml:space="preserve">0.8638</w:t>
+            </w:r>
+          </w:p>
+        </w:tc>
+      </w:tr>
+      <w:tr>
+        <w:tc>
+          <w:tcPr/>
+          <w:p>
+            <w:pPr>
+              <w:pStyle w:val="Compact"/>
+            </w:pPr>
+            <w:r>
+              <w:t xml:space="preserve">Q+G-P6</w:t>
+            </w:r>
+          </w:p>
+        </w:tc>
+        <w:tc>
+          <w:tcPr/>
+          <w:p>
+            <w:pPr>
+              <w:pStyle w:val="Compact"/>
+              <w:jc w:val="right"/>
+            </w:pPr>
+            <w:r>
+              <w:t xml:space="preserve">28.6464</w:t>
+            </w:r>
+          </w:p>
+        </w:tc>
+        <w:tc>
+          <w:tcPr/>
+          <w:p>
+            <w:pPr>
+              <w:pStyle w:val="Compact"/>
+              <w:jc w:val="right"/>
+            </w:pPr>
+            <w:r>
+              <w:t xml:space="preserve">0.8588</w:t>
+            </w:r>
+          </w:p>
+        </w:tc>
+      </w:tr>
+      <w:tr>
+        <w:tc>
+          <w:tcPr/>
+          <w:p>
+            <w:pPr>
+              <w:pStyle w:val="Compact"/>
+            </w:pPr>
+            <w:r>
+              <w:t xml:space="preserve">Q+G-P8</w:t>
+            </w:r>
+          </w:p>
+        </w:tc>
+        <w:tc>
+          <w:tcPr/>
+          <w:p>
+            <w:pPr>
+              <w:pStyle w:val="Compact"/>
+              <w:jc w:val="right"/>
+            </w:pPr>
+            <w:r>
+              <w:t xml:space="preserve">26.7452</w:t>
+            </w:r>
+          </w:p>
+        </w:tc>
+        <w:tc>
+          <w:tcPr/>
+          <w:p>
+            <w:pPr>
+              <w:pStyle w:val="Compact"/>
+              <w:jc w:val="right"/>
+            </w:pPr>
+            <w:r>
+              <w:t xml:space="preserve">0.8444</w:t>
+            </w:r>
+          </w:p>
+        </w:tc>
+      </w:tr>
+      <w:tr>
+        <w:tc>
+          <w:tcPr/>
+          <w:p>
+            <w:pPr>
+              <w:pStyle w:val="Compact"/>
+            </w:pPr>
+            <w:r>
+              <w:t xml:space="preserve">Q+G-R3</w:t>
+            </w:r>
+          </w:p>
+        </w:tc>
+        <w:tc>
+          <w:tcPr/>
+          <w:p>
+            <w:pPr>
+              <w:pStyle w:val="Compact"/>
+              <w:jc w:val="right"/>
+            </w:pPr>
+            <w:r>
+              <w:t xml:space="preserve">29.2263</w:t>
+            </w:r>
+          </w:p>
+        </w:tc>
+        <w:tc>
+          <w:tcPr/>
+          <w:p>
+            <w:pPr>
+              <w:pStyle w:val="Compact"/>
+              <w:jc w:val="right"/>
+            </w:pPr>
+            <w:r>
+              <w:t xml:space="preserve">0.8663</w:t>
+            </w:r>
+          </w:p>
+        </w:tc>
+      </w:tr>
+      <w:tr>
+        <w:tc>
+          <w:tcPr/>
+          <w:p>
+            <w:pPr>
+              <w:pStyle w:val="Compact"/>
+            </w:pPr>
+            <w:r>
+              <w:t xml:space="preserve">Q+G-R4</w:t>
+            </w:r>
+          </w:p>
+        </w:tc>
+        <w:tc>
+          <w:tcPr/>
+          <w:p>
+            <w:pPr>
+              <w:pStyle w:val="Compact"/>
+              <w:jc w:val="right"/>
+            </w:pPr>
+            <w:r>
+              <w:t xml:space="preserve">28.5397</w:t>
+            </w:r>
+          </w:p>
+        </w:tc>
+        <w:tc>
+          <w:tcPr/>
+          <w:p>
+            <w:pPr>
+              <w:pStyle w:val="Compact"/>
+              <w:jc w:val="right"/>
+            </w:pPr>
+            <w:r>
+              <w:t xml:space="preserve">0.8637</w:t>
+            </w:r>
+          </w:p>
+        </w:tc>
+      </w:tr>
+      <w:tr>
+        <w:tc>
+          <w:tcPr/>
+          <w:p>
+            <w:pPr>
+              <w:pStyle w:val="Compact"/>
+            </w:pPr>
+            <w:r>
+              <w:t xml:space="preserve">Q+G-R6</w:t>
+            </w:r>
+          </w:p>
+        </w:tc>
+        <w:tc>
+          <w:tcPr/>
+          <w:p>
+            <w:pPr>
+              <w:pStyle w:val="Compact"/>
+              <w:jc w:val="right"/>
+            </w:pPr>
+            <w:r>
+              <w:t xml:space="preserve">21.4064</w:t>
+            </w:r>
+          </w:p>
+        </w:tc>
+        <w:tc>
+          <w:tcPr/>
+          <w:p>
+            <w:pPr>
+              <w:pStyle w:val="Compact"/>
+              <w:jc w:val="right"/>
+            </w:pPr>
+            <w:r>
+              <w:t xml:space="preserve">0.8133</w:t>
+            </w:r>
+          </w:p>
+        </w:tc>
+      </w:tr>
+      <w:tr>
+        <w:tc>
+          <w:tcPr/>
+          <w:p>
+            <w:pPr>
+              <w:pStyle w:val="Compact"/>
+            </w:pPr>
+            <w:r>
+              <w:t xml:space="preserve">Q+G-R8</w:t>
+            </w:r>
+          </w:p>
+        </w:tc>
+        <w:tc>
+          <w:tcPr/>
+          <w:p>
+            <w:pPr>
+              <w:pStyle w:val="Compact"/>
+              <w:jc w:val="right"/>
+            </w:pPr>
+            <w:r>
+              <w:t xml:space="preserve">18.4597</w:t>
+            </w:r>
+          </w:p>
+        </w:tc>
+        <w:tc>
+          <w:tcPr/>
+          <w:p>
+            <w:pPr>
+              <w:pStyle w:val="Compact"/>
+              <w:jc w:val="right"/>
+            </w:pPr>
+            <w:r>
+              <w:t xml:space="preserve">0.7827</w:t>
+            </w:r>
+          </w:p>
+        </w:tc>
+      </w:tr>
+    </w:tbl>
+    <w:p>
+      <w:pPr>
+        <w:pStyle w:val="BodyText"/>
+      </w:pPr>
+      <w:r>
+        <w:t xml:space="preserve">Interpretation:</w:t>
+      </w:r>
+    </w:p>
+    <w:p>
+      <w:pPr>
+        <w:pStyle w:val="Compact"/>
+        <w:numPr>
+          <w:ilvl w:val="0"/>
+          <w:numId w:val="1023"/>
+        </w:numPr>
+      </w:pPr>
+      <w:r>
+        <w:rPr>
+          <w:rStyle w:val="VerbatimChar"/>
+        </w:rPr>
+        <w:t xml:space="preserve">Qwen raw (3)</w:t>
+      </w:r>
+      <w:r>
+        <w:t xml:space="preserve"> </w:t>
+      </w:r>
+      <w:r>
+        <w:t xml:space="preserve">is the strongest compact pure-fidelity setting on the measured five-image bank, with</w:t>
+      </w:r>
+      <w:r>
+        <w:t xml:space="preserve"> </w:t>
+      </w:r>
+      <w:r>
+        <w:rPr>
+          <w:rStyle w:val="VerbatimChar"/>
+        </w:rPr>
+        <w:t xml:space="preserve">Qwen raw (6)</w:t>
+      </w:r>
+      <w:r>
+        <w:t xml:space="preserve"> </w:t>
+      </w:r>
+      <w:r>
+        <w:t xml:space="preserve">close behind;</w:t>
+      </w:r>
+    </w:p>
+    <w:p>
+      <w:pPr>
+        <w:pStyle w:val="Compact"/>
+        <w:numPr>
+          <w:ilvl w:val="0"/>
+          <w:numId w:val="1023"/>
+        </w:numPr>
+      </w:pPr>
+      <w:r>
+        <w:t xml:space="preserve">preserve-style hybrid enrichment remains relatively stable through</w:t>
+      </w:r>
+      <w:r>
+        <w:t xml:space="preserve"> </w:t>
+      </w:r>
+      <w:r>
+        <w:rPr>
+          <w:rStyle w:val="VerbatimChar"/>
+        </w:rPr>
+        <w:t xml:space="preserve">3/4/6</w:t>
+      </w:r>
+      <w:r>
+        <w:t xml:space="preserve"> </w:t>
+      </w:r>
+      <w:r>
+        <w:t xml:space="preserve">layers, although it still trails raw Qwen on recomposition fidelity;</w:t>
+      </w:r>
+    </w:p>
+    <w:p>
+      <w:pPr>
+        <w:pStyle w:val="Compact"/>
+        <w:numPr>
+          <w:ilvl w:val="0"/>
+          <w:numId w:val="1023"/>
+        </w:numPr>
+      </w:pPr>
+      <w:r>
+        <w:t xml:space="preserve">graph reorder is acceptable at</w:t>
+      </w:r>
+      <w:r>
+        <w:t xml:space="preserve"> </w:t>
+      </w:r>
+      <w:r>
+        <w:rPr>
+          <w:rStyle w:val="VerbatimChar"/>
+        </w:rPr>
+        <w:t xml:space="preserve">3/4</w:t>
+      </w:r>
+      <w:r>
+        <w:t xml:space="preserve"> </w:t>
+      </w:r>
+      <w:r>
+        <w:t xml:space="preserve">layers but degrades sharply at</w:t>
+      </w:r>
+      <w:r>
+        <w:t xml:space="preserve"> </w:t>
+      </w:r>
+      <w:r>
+        <w:rPr>
+          <w:rStyle w:val="VerbatimChar"/>
+        </w:rPr>
+        <w:t xml:space="preserve">6/8</w:t>
+      </w:r>
+      <w:r>
+        <w:t xml:space="preserve">, so the current evidence supports preserve-style hybrid enrichment as the safer exported default.</w:t>
+      </w:r>
+    </w:p>
+    <w:bookmarkEnd w:id="176"/>
+    <w:bookmarkStart w:id="177" w:name="b.4-promptable-extraction-benchmark"/>
     <w:p>
       <w:pPr>
         <w:pStyle w:val="Heading2"/>
@@ -16077,7 +16716,7 @@
         <w:pStyle w:val="Compact"/>
         <w:numPr>
           <w:ilvl w:val="0"/>
-          <w:numId w:val="1023"/>
+          <w:numId w:val="1024"/>
         </w:numPr>
       </w:pPr>
       <w:r>
@@ -16089,7 +16728,7 @@
         <w:pStyle w:val="Compact"/>
         <w:numPr>
           <w:ilvl w:val="0"/>
-          <w:numId w:val="1023"/>
+          <w:numId w:val="1024"/>
         </w:numPr>
       </w:pPr>
       <w:r>
@@ -16101,15 +16740,15 @@
         <w:pStyle w:val="Compact"/>
         <w:numPr>
           <w:ilvl w:val="0"/>
-          <w:numId w:val="1023"/>
+          <w:numId w:val="1024"/>
         </w:numPr>
       </w:pPr>
       <w:r>
         <w:t xml:space="preserve">the present bottleneck is semantic routing rather than matte stability.</w:t>
       </w:r>
     </w:p>
-    <w:bookmarkEnd w:id="176"/>
-    <w:bookmarkStart w:id="177" w:name="b.5-transparent-benchmark"/>
+    <w:bookmarkEnd w:id="177"/>
+    <w:bookmarkStart w:id="178" w:name="b.5-transparent-benchmark"/>
     <w:p>
       <w:pPr>
         <w:pStyle w:val="Heading2"/>
@@ -16303,7 +16942,7 @@
         <w:pStyle w:val="Compact"/>
         <w:numPr>
           <w:ilvl w:val="0"/>
-          <w:numId w:val="1024"/>
+          <w:numId w:val="1025"/>
         </w:numPr>
       </w:pPr>
       <w:r>
@@ -16315,7 +16954,7 @@
         <w:pStyle w:val="Compact"/>
         <w:numPr>
           <w:ilvl w:val="0"/>
-          <w:numId w:val="1024"/>
+          <w:numId w:val="1025"/>
         </w:numPr>
       </w:pPr>
       <w:r>
@@ -16327,15 +16966,15 @@
         <w:pStyle w:val="Compact"/>
         <w:numPr>
           <w:ilvl w:val="0"/>
-          <w:numId w:val="1024"/>
+          <w:numId w:val="1025"/>
         </w:numPr>
       </w:pPr>
       <w:r>
         <w:t xml:space="preserve">the prototype is strongest on flare-like overlays and weakest on the semi-transparent panel variant.</w:t>
       </w:r>
     </w:p>
-    <w:bookmarkEnd w:id="177"/>
-    <w:bookmarkStart w:id="180" w:name="b.6-main-ablation-matrix"/>
+    <w:bookmarkEnd w:id="178"/>
+    <w:bookmarkStart w:id="181" w:name="b.6-main-ablation-matrix"/>
     <w:p>
       <w:pPr>
         <w:pStyle w:val="Heading2"/>
@@ -16344,7 +16983,7 @@
         <w:t xml:space="preserve">B.6 Main ablation matrix</w:t>
       </w:r>
     </w:p>
-    <w:bookmarkStart w:id="178" w:name="b.6.1-core-ladder"/>
+    <w:bookmarkStart w:id="179" w:name="b.6.1-core-ladder"/>
     <w:p>
       <w:pPr>
         <w:pStyle w:val="Heading3"/>
@@ -16848,8 +17487,8 @@
         </w:tc>
       </w:tr>
     </w:tbl>
-    <w:bookmarkEnd w:id="178"/>
-    <w:bookmarkStart w:id="179" w:name="b.6.2-full-system-extensions"/>
+    <w:bookmarkEnd w:id="179"/>
+    <w:bookmarkStart w:id="180" w:name="b.6.2-full-system-extensions"/>
     <w:p>
       <w:pPr>
         <w:pStyle w:val="Heading3"/>
@@ -17149,9 +17788,9 @@
         </w:tc>
       </w:tr>
     </w:tbl>
-    <w:bookmarkEnd w:id="179"/>
     <w:bookmarkEnd w:id="180"/>
-    <w:bookmarkStart w:id="183" w:name="b.7-literature-comparison"/>
+    <w:bookmarkEnd w:id="181"/>
+    <w:bookmarkStart w:id="184" w:name="b.7-literature-comparison"/>
     <w:p>
       <w:pPr>
         <w:pStyle w:val="Heading2"/>
@@ -17160,7 +17799,7 @@
         <w:t xml:space="preserve">B.7 Literature comparison</w:t>
       </w:r>
     </w:p>
-    <w:bookmarkStart w:id="181" w:name="b.7.1-representation-oriented-baselines"/>
+    <w:bookmarkStart w:id="182" w:name="b.7.1-representation-oriented-baselines"/>
     <w:p>
       <w:pPr>
         <w:pStyle w:val="Heading3"/>
@@ -17547,8 +18186,8 @@
         </w:tc>
       </w:tr>
     </w:tbl>
-    <w:bookmarkEnd w:id="181"/>
-    <w:bookmarkStart w:id="182" w:name="b.7.2-layered-editing-baselines"/>
+    <w:bookmarkEnd w:id="182"/>
+    <w:bookmarkStart w:id="183" w:name="b.7.2-layered-editing-baselines"/>
     <w:p>
       <w:pPr>
         <w:pStyle w:val="Heading3"/>
@@ -17936,9 +18575,9 @@
         </w:tc>
       </w:tr>
     </w:tbl>
-    <w:bookmarkEnd w:id="182"/>
     <w:bookmarkEnd w:id="183"/>
-    <w:bookmarkStart w:id="184" w:name="b.8-dataset-coverage"/>
+    <w:bookmarkEnd w:id="184"/>
+    <w:bookmarkStart w:id="185" w:name="b.8-dataset-coverage"/>
     <w:p>
       <w:pPr>
         <w:pStyle w:val="Heading2"/>
@@ -18378,8 +19017,8 @@
         </w:tc>
       </w:tr>
     </w:tbl>
-    <w:bookmarkEnd w:id="184"/>
-    <w:bookmarkStart w:id="185" w:name="b.9-failure-taxonomy"/>
+    <w:bookmarkEnd w:id="185"/>
+    <w:bookmarkStart w:id="186" w:name="b.9-failure-taxonomy"/>
     <w:p>
       <w:pPr>
         <w:pStyle w:val="Heading2"/>
@@ -18865,8 +19504,8 @@
         </w:tc>
       </w:tr>
     </w:tbl>
-    <w:bookmarkEnd w:id="185"/>
-    <w:bookmarkStart w:id="186" w:name="b.10-intrinsic-export-snapshot"/>
+    <w:bookmarkEnd w:id="186"/>
+    <w:bookmarkStart w:id="187" w:name="b.10-intrinsic-export-snapshot"/>
     <w:p>
       <w:pPr>
         <w:pStyle w:val="Heading2"/>
@@ -19061,7 +19700,7 @@
         <w:pStyle w:val="Compact"/>
         <w:numPr>
           <w:ilvl w:val="0"/>
-          <w:numId w:val="1025"/>
+          <w:numId w:val="1026"/>
         </w:numPr>
       </w:pPr>
       <w:r>
@@ -19073,7 +19712,7 @@
         <w:pStyle w:val="Compact"/>
         <w:numPr>
           <w:ilvl w:val="0"/>
-          <w:numId w:val="1025"/>
+          <w:numId w:val="1026"/>
         </w:numPr>
       </w:pPr>
       <w:r>
@@ -19085,7 +19724,7 @@
         <w:pStyle w:val="Compact"/>
         <w:numPr>
           <w:ilvl w:val="0"/>
-          <w:numId w:val="1025"/>
+          <w:numId w:val="1026"/>
         </w:numPr>
       </w:pPr>
       <w:r>
@@ -19104,9 +19743,9 @@
         <w:t xml:space="preserve">.</w:t>
       </w:r>
     </w:p>
-    <w:bookmarkEnd w:id="186"/>
     <w:bookmarkEnd w:id="187"/>
-    <w:bookmarkStart w:id="188" w:name="appendix-c-command-log"/>
+    <w:bookmarkEnd w:id="188"/>
+    <w:bookmarkStart w:id="189" w:name="appendix-c-command-log"/>
     <w:p>
       <w:pPr>
         <w:pStyle w:val="Heading1"/>
@@ -19243,8 +19882,8 @@
         <w:t xml:space="preserve">Those commands connect the final report outputs to the compact JSON summaries and generated figures that are stored in the report-artifact set.</w:t>
       </w:r>
     </w:p>
-    <w:bookmarkEnd w:id="188"/>
-    <w:bookmarkStart w:id="189" w:name="appendix-d-extra-literature-notes"/>
+    <w:bookmarkEnd w:id="189"/>
+    <w:bookmarkStart w:id="190" w:name="appendix-d-extra-literature-notes"/>
     <w:p>
       <w:pPr>
         <w:pStyle w:val="Heading1"/>
@@ -19266,7 +19905,7 @@
         <w:pStyle w:val="Compact"/>
         <w:numPr>
           <w:ilvl w:val="0"/>
-          <w:numId w:val="1026"/>
+          <w:numId w:val="1027"/>
         </w:numPr>
       </w:pPr>
       <w:r>
@@ -19278,7 +19917,7 @@
         <w:pStyle w:val="Compact"/>
         <w:numPr>
           <w:ilvl w:val="0"/>
-          <w:numId w:val="1026"/>
+          <w:numId w:val="1027"/>
         </w:numPr>
       </w:pPr>
       <w:r>
@@ -19290,7 +19929,7 @@
         <w:pStyle w:val="Compact"/>
         <w:numPr>
           <w:ilvl w:val="0"/>
-          <w:numId w:val="1026"/>
+          <w:numId w:val="1027"/>
         </w:numPr>
       </w:pPr>
       <w:r>
@@ -19302,7 +19941,7 @@
         <w:pStyle w:val="Compact"/>
         <w:numPr>
           <w:ilvl w:val="0"/>
-          <w:numId w:val="1026"/>
+          <w:numId w:val="1027"/>
         </w:numPr>
       </w:pPr>
       <w:r>
@@ -19314,7 +19953,7 @@
         <w:pStyle w:val="Compact"/>
         <w:numPr>
           <w:ilvl w:val="0"/>
-          <w:numId w:val="1026"/>
+          <w:numId w:val="1027"/>
         </w:numPr>
       </w:pPr>
       <w:r>
@@ -19356,7 +19995,7 @@
         <w:t xml:space="preserve">, but the report body and the references section are the intended citation surface for submission.</w:t>
       </w:r>
     </w:p>
-    <w:bookmarkEnd w:id="189"/>
+    <w:bookmarkEnd w:id="190"/>
     <w:sectPr/>
   </w:body>
 </w:document>
@@ -19946,6 +20585,9 @@
     <w:abstractNumId w:val="991"/>
   </w:num>
   <w:num w:numId="1026">
+    <w:abstractNumId w:val="991"/>
+  </w:num>
+  <w:num w:numId="1027">
     <w:abstractNumId w:val="991"/>
   </w:num>
 </w:numbering>

</xml_diff>

<commit_message>
artifacts: sync qwen guardrail evidence
</commit_message>
<xml_diff>
--- a/docs/final_report_pack/LayerForge_X_Final_Report_2026_04_22.docx
+++ b/docs/final_report_pack/LayerForge_X_Final_Report_2026_04_22.docx
@@ -11569,7 +11569,7 @@
               <w:jc w:val="right"/>
             </w:pPr>
             <w:r>
-              <w:t xml:space="preserve">0.6981</w:t>
+              <w:t xml:space="preserve">0.6283</w:t>
             </w:r>
           </w:p>
         </w:tc>
@@ -11630,7 +11630,7 @@
               <w:jc w:val="right"/>
             </w:pPr>
             <w:r>
-              <w:t xml:space="preserve">0.5314</w:t>
+              <w:t xml:space="preserve">0.4783</w:t>
             </w:r>
           </w:p>
         </w:tc>
@@ -11691,7 +11691,7 @@
               <w:jc w:val="right"/>
             </w:pPr>
             <w:r>
-              <w:t xml:space="preserve">0.2824</w:t>
+              <w:t xml:space="preserve">0.2541</w:t>
             </w:r>
           </w:p>
         </w:tc>
@@ -11752,7 +11752,7 @@
               <w:jc w:val="right"/>
             </w:pPr>
             <w:r>
-              <w:t xml:space="preserve">0.5843</w:t>
+              <w:t xml:space="preserve">0.5259</w:t>
             </w:r>
           </w:p>
         </w:tc>
@@ -11813,7 +11813,7 @@
               <w:jc w:val="right"/>
             </w:pPr>
             <w:r>
-              <w:t xml:space="preserve">0.5834</w:t>
+              <w:t xml:space="preserve">0.5251</w:t>
             </w:r>
           </w:p>
         </w:tc>
@@ -14595,7 +14595,7 @@
               <w:jc w:val="right"/>
             </w:pPr>
             <w:r>
-              <w:t xml:space="preserve">0.6981</w:t>
+              <w:t xml:space="preserve">0.6283</w:t>
             </w:r>
           </w:p>
         </w:tc>
@@ -14656,7 +14656,7 @@
               <w:jc w:val="right"/>
             </w:pPr>
             <w:r>
-              <w:t xml:space="preserve">0.5314</w:t>
+              <w:t xml:space="preserve">0.4783</w:t>
             </w:r>
           </w:p>
         </w:tc>
@@ -14717,7 +14717,7 @@
               <w:jc w:val="right"/>
             </w:pPr>
             <w:r>
-              <w:t xml:space="preserve">0.2824</w:t>
+              <w:t xml:space="preserve">0.2541</w:t>
             </w:r>
           </w:p>
         </w:tc>
@@ -14778,7 +14778,7 @@
               <w:jc w:val="right"/>
             </w:pPr>
             <w:r>
-              <w:t xml:space="preserve">0.5843</w:t>
+              <w:t xml:space="preserve">0.5259</w:t>
             </w:r>
           </w:p>
         </w:tc>
@@ -14839,7 +14839,7 @@
               <w:jc w:val="right"/>
             </w:pPr>
             <w:r>
-              <w:t xml:space="preserve">0.5834</w:t>
+              <w:t xml:space="preserve">0.5251</w:t>
             </w:r>
           </w:p>
         </w:tc>
@@ -16136,19 +16136,19 @@
               <w:jc w:val="right"/>
             </w:pPr>
             <w:r>
-              <w:t xml:space="preserve">21.4064</w:t>
-            </w:r>
-          </w:p>
-        </w:tc>
-        <w:tc>
-          <w:tcPr/>
-          <w:p>
-            <w:pPr>
-              <w:pStyle w:val="Compact"/>
-              <w:jc w:val="right"/>
-            </w:pPr>
-            <w:r>
-              <w:t xml:space="preserve">0.8133</w:t>
+              <w:t xml:space="preserve">28.6964</w:t>
+            </w:r>
+          </w:p>
+        </w:tc>
+        <w:tc>
+          <w:tcPr/>
+          <w:p>
+            <w:pPr>
+              <w:pStyle w:val="Compact"/>
+              <w:jc w:val="right"/>
+            </w:pPr>
+            <w:r>
+              <w:t xml:space="preserve">0.8586</w:t>
             </w:r>
           </w:p>
         </w:tc>
@@ -16173,19 +16173,19 @@
               <w:jc w:val="right"/>
             </w:pPr>
             <w:r>
-              <w:t xml:space="preserve">18.4597</w:t>
-            </w:r>
-          </w:p>
-        </w:tc>
-        <w:tc>
-          <w:tcPr/>
-          <w:p>
-            <w:pPr>
-              <w:pStyle w:val="Compact"/>
-              <w:jc w:val="right"/>
-            </w:pPr>
-            <w:r>
-              <w:t xml:space="preserve">0.7827</w:t>
+              <w:t xml:space="preserve">26.7543</w:t>
+            </w:r>
+          </w:p>
+        </w:tc>
+        <w:tc>
+          <w:tcPr/>
+          <w:p>
+            <w:pPr>
+              <w:pStyle w:val="Compact"/>
+              <w:jc w:val="right"/>
+            </w:pPr>
+            <w:r>
+              <w:t xml:space="preserve">0.8443</w:t>
             </w:r>
           </w:p>
         </w:tc>
@@ -16271,7 +16271,7 @@
         </w:numPr>
       </w:pPr>
       <w:r>
-        <w:t xml:space="preserve">graph reorder is acceptable at</w:t>
+        <w:t xml:space="preserve">deeper reorder rows are now protected by a fidelity guardrail: graph-order export remains active on compact stacks, while</w:t>
       </w:r>
       <w:r>
         <w:t xml:space="preserve"> </w:t>
@@ -16280,13 +16280,13 @@
         <w:rPr>
           <w:rStyle w:val="VerbatimChar"/>
         </w:rPr>
-        <w:t xml:space="preserve">3/4</w:t>
+        <w:t xml:space="preserve">3/5</w:t>
       </w:r>
       <w:r>
         <w:t xml:space="preserve"> </w:t>
       </w:r>
       <w:r>
-        <w:t xml:space="preserve">layers but degrades sharply at</w:t>
+        <w:t xml:space="preserve">six-layer runs and</w:t>
       </w:r>
       <w:r>
         <w:t xml:space="preserve"> </w:t>
@@ -16295,10 +16295,13 @@
         <w:rPr>
           <w:rStyle w:val="VerbatimChar"/>
         </w:rPr>
-        <w:t xml:space="preserve">6/8</w:t>
-      </w:r>
-      <w:r>
-        <w:t xml:space="preserve">, so the current evidence supports preserve-style hybrid enrichment as the safer exported default.</w:t>
+        <w:t xml:space="preserve">4/5</w:t>
+      </w:r>
+      <w:r>
+        <w:t xml:space="preserve"> </w:t>
+      </w:r>
+      <w:r>
+        <w:t xml:space="preserve">eight-layer runs fall back to the selected external visual stack when graph order is materially worse.</w:t>
       </w:r>
     </w:p>
     <w:bookmarkEnd w:id="176"/>

</xml_diff>

<commit_message>
bench: refresh extraction and transparency artifacts
</commit_message>
<xml_diff>
--- a/docs/final_report_pack/LayerForge_X_Final_Report_2026_04_22.docx
+++ b/docs/final_report_pack/LayerForge_X_Final_Report_2026_04_22.docx
@@ -12608,19 +12608,19 @@
               <w:jc w:val="right"/>
             </w:pPr>
             <w:r>
-              <w:t xml:space="preserve">0.3776</w:t>
-            </w:r>
-          </w:p>
-        </w:tc>
-        <w:tc>
-          <w:tcPr/>
-          <w:p>
-            <w:pPr>
-              <w:pStyle w:val="Compact"/>
-              <w:jc w:val="right"/>
-            </w:pPr>
-            <w:r>
-              <w:t xml:space="preserve">0.1503</w:t>
+              <w:t xml:space="preserve">0.3640</w:t>
+            </w:r>
+          </w:p>
+        </w:tc>
+        <w:tc>
+          <w:tcPr/>
+          <w:p>
+            <w:pPr>
+              <w:pStyle w:val="Compact"/>
+              <w:jc w:val="right"/>
+            </w:pPr>
+            <w:r>
+              <w:t xml:space="preserve">0.1752</w:t>
             </w:r>
           </w:p>
         </w:tc>
@@ -12669,19 +12669,19 @@
               <w:jc w:val="right"/>
             </w:pPr>
             <w:r>
-              <w:t xml:space="preserve">0.3776</w:t>
-            </w:r>
-          </w:p>
-        </w:tc>
-        <w:tc>
-          <w:tcPr/>
-          <w:p>
-            <w:pPr>
-              <w:pStyle w:val="Compact"/>
-              <w:jc w:val="right"/>
-            </w:pPr>
-            <w:r>
-              <w:t xml:space="preserve">0.1503</w:t>
+              <w:t xml:space="preserve">0.4011</w:t>
+            </w:r>
+          </w:p>
+        </w:tc>
+        <w:tc>
+          <w:tcPr/>
+          <w:p>
+            <w:pPr>
+              <w:pStyle w:val="Compact"/>
+              <w:jc w:val="right"/>
+            </w:pPr>
+            <w:r>
+              <w:t xml:space="preserve">0.1646</w:t>
             </w:r>
           </w:p>
         </w:tc>
@@ -12730,19 +12730,19 @@
               <w:jc w:val="right"/>
             </w:pPr>
             <w:r>
-              <w:t xml:space="preserve">0.3776</w:t>
-            </w:r>
-          </w:p>
-        </w:tc>
-        <w:tc>
-          <w:tcPr/>
-          <w:p>
-            <w:pPr>
-              <w:pStyle w:val="Compact"/>
-              <w:jc w:val="right"/>
-            </w:pPr>
-            <w:r>
-              <w:t xml:space="preserve">0.1503</w:t>
+              <w:t xml:space="preserve">0.4011</w:t>
+            </w:r>
+          </w:p>
+        </w:tc>
+        <w:tc>
+          <w:tcPr/>
+          <w:p>
+            <w:pPr>
+              <w:pStyle w:val="Compact"/>
+              <w:jc w:val="right"/>
+            </w:pPr>
+            <w:r>
+              <w:t xml:space="preserve">0.1646</w:t>
             </w:r>
           </w:p>
         </w:tc>
@@ -12791,19 +12791,19 @@
               <w:jc w:val="right"/>
             </w:pPr>
             <w:r>
-              <w:t xml:space="preserve">0.8654</w:t>
-            </w:r>
-          </w:p>
-        </w:tc>
-        <w:tc>
-          <w:tcPr/>
-          <w:p>
-            <w:pPr>
-              <w:pStyle w:val="Compact"/>
-              <w:jc w:val="right"/>
-            </w:pPr>
-            <w:r>
-              <w:t xml:space="preserve">0.0222</w:t>
+              <w:t xml:space="preserve">0.7719</w:t>
+            </w:r>
+          </w:p>
+        </w:tc>
+        <w:tc>
+          <w:tcPr/>
+          <w:p>
+            <w:pPr>
+              <w:pStyle w:val="Compact"/>
+              <w:jc w:val="right"/>
+            </w:pPr>
+            <w:r>
+              <w:t xml:space="preserve">0.0521</w:t>
             </w:r>
           </w:p>
         </w:tc>
@@ -12852,19 +12852,19 @@
               <w:jc w:val="right"/>
             </w:pPr>
             <w:r>
-              <w:t xml:space="preserve">0.8654</w:t>
-            </w:r>
-          </w:p>
-        </w:tc>
-        <w:tc>
-          <w:tcPr/>
-          <w:p>
-            <w:pPr>
-              <w:pStyle w:val="Compact"/>
-              <w:jc w:val="right"/>
-            </w:pPr>
-            <w:r>
-              <w:t xml:space="preserve">0.0222</w:t>
+              <w:t xml:space="preserve">0.7719</w:t>
+            </w:r>
+          </w:p>
+        </w:tc>
+        <w:tc>
+          <w:tcPr/>
+          <w:p>
+            <w:pPr>
+              <w:pStyle w:val="Compact"/>
+              <w:jc w:val="right"/>
+            </w:pPr>
+            <w:r>
+              <w:t xml:space="preserve">0.0521</w:t>
             </w:r>
           </w:p>
         </w:tc>
@@ -12938,7 +12938,7 @@
               <w:jc w:val="right"/>
             </w:pPr>
             <w:r>
-              <w:t xml:space="preserve">0.1131</w:t>
+              <w:t xml:space="preserve">0.1126</w:t>
             </w:r>
           </w:p>
         </w:tc>
@@ -12963,7 +12963,7 @@
               <w:jc w:val="right"/>
             </w:pPr>
             <w:r>
-              <w:t xml:space="preserve">25.9863</w:t>
+              <w:t xml:space="preserve">26.1430</w:t>
             </w:r>
           </w:p>
         </w:tc>
@@ -12988,7 +12988,7 @@
               <w:jc w:val="right"/>
             </w:pPr>
             <w:r>
-              <w:t xml:space="preserve">0.9541</w:t>
+              <w:t xml:space="preserve">0.9572</w:t>
             </w:r>
           </w:p>
         </w:tc>
@@ -13013,7 +13013,7 @@
               <w:jc w:val="right"/>
             </w:pPr>
             <w:r>
-              <w:t xml:space="preserve">56.0066</w:t>
+              <w:t xml:space="preserve">56.2836</w:t>
             </w:r>
           </w:p>
         </w:tc>
@@ -16444,19 +16444,19 @@
               <w:jc w:val="right"/>
             </w:pPr>
             <w:r>
-              <w:t xml:space="preserve">0.3776</w:t>
-            </w:r>
-          </w:p>
-        </w:tc>
-        <w:tc>
-          <w:tcPr/>
-          <w:p>
-            <w:pPr>
-              <w:pStyle w:val="Compact"/>
-              <w:jc w:val="right"/>
-            </w:pPr>
-            <w:r>
-              <w:t xml:space="preserve">0.1503</w:t>
+              <w:t xml:space="preserve">0.3640</w:t>
+            </w:r>
+          </w:p>
+        </w:tc>
+        <w:tc>
+          <w:tcPr/>
+          <w:p>
+            <w:pPr>
+              <w:pStyle w:val="Compact"/>
+              <w:jc w:val="right"/>
+            </w:pPr>
+            <w:r>
+              <w:t xml:space="preserve">0.1752</w:t>
             </w:r>
           </w:p>
         </w:tc>
@@ -16505,19 +16505,19 @@
               <w:jc w:val="right"/>
             </w:pPr>
             <w:r>
-              <w:t xml:space="preserve">0.3776</w:t>
-            </w:r>
-          </w:p>
-        </w:tc>
-        <w:tc>
-          <w:tcPr/>
-          <w:p>
-            <w:pPr>
-              <w:pStyle w:val="Compact"/>
-              <w:jc w:val="right"/>
-            </w:pPr>
-            <w:r>
-              <w:t xml:space="preserve">0.1503</w:t>
+              <w:t xml:space="preserve">0.4011</w:t>
+            </w:r>
+          </w:p>
+        </w:tc>
+        <w:tc>
+          <w:tcPr/>
+          <w:p>
+            <w:pPr>
+              <w:pStyle w:val="Compact"/>
+              <w:jc w:val="right"/>
+            </w:pPr>
+            <w:r>
+              <w:t xml:space="preserve">0.1646</w:t>
             </w:r>
           </w:p>
         </w:tc>
@@ -16566,19 +16566,19 @@
               <w:jc w:val="right"/>
             </w:pPr>
             <w:r>
-              <w:t xml:space="preserve">0.3776</w:t>
-            </w:r>
-          </w:p>
-        </w:tc>
-        <w:tc>
-          <w:tcPr/>
-          <w:p>
-            <w:pPr>
-              <w:pStyle w:val="Compact"/>
-              <w:jc w:val="right"/>
-            </w:pPr>
-            <w:r>
-              <w:t xml:space="preserve">0.1503</w:t>
+              <w:t xml:space="preserve">0.4011</w:t>
+            </w:r>
+          </w:p>
+        </w:tc>
+        <w:tc>
+          <w:tcPr/>
+          <w:p>
+            <w:pPr>
+              <w:pStyle w:val="Compact"/>
+              <w:jc w:val="right"/>
+            </w:pPr>
+            <w:r>
+              <w:t xml:space="preserve">0.1646</w:t>
             </w:r>
           </w:p>
         </w:tc>
@@ -16627,19 +16627,19 @@
               <w:jc w:val="right"/>
             </w:pPr>
             <w:r>
-              <w:t xml:space="preserve">0.8654</w:t>
-            </w:r>
-          </w:p>
-        </w:tc>
-        <w:tc>
-          <w:tcPr/>
-          <w:p>
-            <w:pPr>
-              <w:pStyle w:val="Compact"/>
-              <w:jc w:val="right"/>
-            </w:pPr>
-            <w:r>
-              <w:t xml:space="preserve">0.0222</w:t>
+              <w:t xml:space="preserve">0.7719</w:t>
+            </w:r>
+          </w:p>
+        </w:tc>
+        <w:tc>
+          <w:tcPr/>
+          <w:p>
+            <w:pPr>
+              <w:pStyle w:val="Compact"/>
+              <w:jc w:val="right"/>
+            </w:pPr>
+            <w:r>
+              <w:t xml:space="preserve">0.0521</w:t>
             </w:r>
           </w:p>
         </w:tc>
@@ -16688,19 +16688,19 @@
               <w:jc w:val="right"/>
             </w:pPr>
             <w:r>
-              <w:t xml:space="preserve">0.8654</w:t>
-            </w:r>
-          </w:p>
-        </w:tc>
-        <w:tc>
-          <w:tcPr/>
-          <w:p>
-            <w:pPr>
-              <w:pStyle w:val="Compact"/>
-              <w:jc w:val="right"/>
-            </w:pPr>
-            <w:r>
-              <w:t xml:space="preserve">0.0222</w:t>
+              <w:t xml:space="preserve">0.7719</w:t>
+            </w:r>
+          </w:p>
+        </w:tc>
+        <w:tc>
+          <w:tcPr/>
+          <w:p>
+            <w:pPr>
+              <w:pStyle w:val="Compact"/>
+              <w:jc w:val="right"/>
+            </w:pPr>
+            <w:r>
+              <w:t xml:space="preserve">0.0521</w:t>
             </w:r>
           </w:p>
         </w:tc>
@@ -16735,7 +16735,7 @@
         </w:numPr>
       </w:pPr>
       <w:r>
-        <w:t xml:space="preserve">point-only and box-only prompts still achieve high overlap while missing the semantic target;</w:t>
+        <w:t xml:space="preserve">combined text + point and text + box queries improve overlap over text-only prompting while preserving the same semantic hit rate;</w:t>
       </w:r>
     </w:p>
     <w:p>
@@ -16747,7 +16747,7 @@
         </w:numPr>
       </w:pPr>
       <w:r>
-        <w:t xml:space="preserve">the present bottleneck is semantic routing rather than matte stability.</w:t>
+        <w:t xml:space="preserve">point-only and box-only prompts still achieve high overlap while missing the semantic target, so the remaining limitation is routing without a text label rather than matte stability.</w:t>
       </w:r>
     </w:p>
     <w:bookmarkEnd w:id="177"/>
@@ -16826,7 +16826,7 @@
               <w:jc w:val="right"/>
             </w:pPr>
             <w:r>
-              <w:t xml:space="preserve">0.1131</w:t>
+              <w:t xml:space="preserve">0.1126</w:t>
             </w:r>
           </w:p>
         </w:tc>
@@ -16851,7 +16851,7 @@
               <w:jc w:val="right"/>
             </w:pPr>
             <w:r>
-              <w:t xml:space="preserve">25.9863</w:t>
+              <w:t xml:space="preserve">26.1430</w:t>
             </w:r>
           </w:p>
         </w:tc>
@@ -16876,7 +16876,7 @@
               <w:jc w:val="right"/>
             </w:pPr>
             <w:r>
-              <w:t xml:space="preserve">0.9541</w:t>
+              <w:t xml:space="preserve">0.9572</w:t>
             </w:r>
           </w:p>
         </w:tc>
@@ -16901,7 +16901,7 @@
               <w:jc w:val="right"/>
             </w:pPr>
             <w:r>
-              <w:t xml:space="preserve">56.0066</w:t>
+              <w:t xml:space="preserve">56.2836</w:t>
             </w:r>
           </w:p>
         </w:tc>
@@ -16962,6 +16962,18 @@
       </w:pPr>
       <w:r>
         <w:t xml:space="preserve">the current path is best interpreted as approximate transparent-layer recovery rather than as a generative transparent-decomposition result;</w:t>
+      </w:r>
+    </w:p>
+    <w:p>
+      <w:pPr>
+        <w:pStyle w:val="Compact"/>
+        <w:numPr>
+          <w:ilvl w:val="0"/>
+          <w:numId w:val="1025"/>
+        </w:numPr>
+      </w:pPr>
+      <w:r>
+        <w:t xml:space="preserve">an optional BiRefNet-based matting backend is integrated in the codebase, but the shipped benchmark config keeps the heuristic alpha path because it remains the stronger measured default on this synthetic set;</w:t>
       </w:r>
     </w:p>
     <w:p>

</xml_diff>

<commit_message>
bench: refresh effect metrics
</commit_message>
<xml_diff>
--- a/docs/final_report_pack/LayerForge_X_Final_Report_2026_04_22.docx
+++ b/docs/final_report_pack/LayerForge_X_Final_Report_2026_04_22.docx
@@ -11374,7 +11374,7 @@
               <w:jc w:val="right"/>
             </w:pPr>
             <w:r>
-              <w:t xml:space="preserve">4853</w:t>
+              <w:t xml:space="preserve">13612</w:t>
             </w:r>
           </w:p>
         </w:tc>
@@ -11424,7 +11424,7 @@
               <w:jc w:val="right"/>
             </w:pPr>
             <w:r>
-              <w:t xml:space="preserve">0.3529</w:t>
+              <w:t xml:space="preserve">0.9733</w:t>
             </w:r>
           </w:p>
         </w:tc>

</xml_diff>

<commit_message>
bench: refresh extraction and transparency figures
</commit_message>
<xml_diff>
--- a/docs/final_report_pack/LayerForge_X_Final_Report_2026_04_22.docx
+++ b/docs/final_report_pack/LayerForge_X_Final_Report_2026_04_22.docx
@@ -12596,7 +12596,7 @@
               <w:jc w:val="right"/>
             </w:pPr>
             <w:r>
-              <w:t xml:space="preserve">1.0000</w:t>
+              <w:t xml:space="preserve">0.9000</w:t>
             </w:r>
           </w:p>
         </w:tc>
@@ -12779,31 +12779,31 @@
               <w:jc w:val="right"/>
             </w:pPr>
             <w:r>
-              <w:t xml:space="preserve">0.0000</w:t>
-            </w:r>
-          </w:p>
-        </w:tc>
-        <w:tc>
-          <w:tcPr/>
-          <w:p>
-            <w:pPr>
-              <w:pStyle w:val="Compact"/>
-              <w:jc w:val="right"/>
-            </w:pPr>
-            <w:r>
-              <w:t xml:space="preserve">0.7719</w:t>
-            </w:r>
-          </w:p>
-        </w:tc>
-        <w:tc>
-          <w:tcPr/>
-          <w:p>
-            <w:pPr>
-              <w:pStyle w:val="Compact"/>
-              <w:jc w:val="right"/>
-            </w:pPr>
-            <w:r>
-              <w:t xml:space="preserve">0.0521</w:t>
+              <w:t xml:space="preserve">1.0000</w:t>
+            </w:r>
+          </w:p>
+        </w:tc>
+        <w:tc>
+          <w:tcPr/>
+          <w:p>
+            <w:pPr>
+              <w:pStyle w:val="Compact"/>
+              <w:jc w:val="right"/>
+            </w:pPr>
+            <w:r>
+              <w:t xml:space="preserve">0.8121</w:t>
+            </w:r>
+          </w:p>
+        </w:tc>
+        <w:tc>
+          <w:tcPr/>
+          <w:p>
+            <w:pPr>
+              <w:pStyle w:val="Compact"/>
+              <w:jc w:val="right"/>
+            </w:pPr>
+            <w:r>
+              <w:t xml:space="preserve">0.0409</w:t>
             </w:r>
           </w:p>
         </w:tc>
@@ -12840,31 +12840,31 @@
               <w:jc w:val="right"/>
             </w:pPr>
             <w:r>
-              <w:t xml:space="preserve">0.0000</w:t>
-            </w:r>
-          </w:p>
-        </w:tc>
-        <w:tc>
-          <w:tcPr/>
-          <w:p>
-            <w:pPr>
-              <w:pStyle w:val="Compact"/>
-              <w:jc w:val="right"/>
-            </w:pPr>
-            <w:r>
-              <w:t xml:space="preserve">0.7719</w:t>
-            </w:r>
-          </w:p>
-        </w:tc>
-        <w:tc>
-          <w:tcPr/>
-          <w:p>
-            <w:pPr>
-              <w:pStyle w:val="Compact"/>
-              <w:jc w:val="right"/>
-            </w:pPr>
-            <w:r>
-              <w:t xml:space="preserve">0.0521</w:t>
+              <w:t xml:space="preserve">1.0000</w:t>
+            </w:r>
+          </w:p>
+        </w:tc>
+        <w:tc>
+          <w:tcPr/>
+          <w:p>
+            <w:pPr>
+              <w:pStyle w:val="Compact"/>
+              <w:jc w:val="right"/>
+            </w:pPr>
+            <w:r>
+              <w:t xml:space="preserve">0.8121</w:t>
+            </w:r>
+          </w:p>
+        </w:tc>
+        <w:tc>
+          <w:tcPr/>
+          <w:p>
+            <w:pPr>
+              <w:pStyle w:val="Compact"/>
+              <w:jc w:val="right"/>
+            </w:pPr>
+            <w:r>
+              <w:t xml:space="preserve">0.0409</w:t>
             </w:r>
           </w:p>
         </w:tc>
@@ -12938,7 +12938,7 @@
               <w:jc w:val="right"/>
             </w:pPr>
             <w:r>
-              <w:t xml:space="preserve">0.1126</w:t>
+              <w:t xml:space="preserve">0.1102</w:t>
             </w:r>
           </w:p>
         </w:tc>
@@ -13013,7 +13013,7 @@
               <w:jc w:val="right"/>
             </w:pPr>
             <w:r>
-              <w:t xml:space="preserve">56.2836</w:t>
+              <w:t xml:space="preserve">56.4872</w:t>
             </w:r>
           </w:p>
         </w:tc>
@@ -13184,7 +13184,7 @@
         </w:numPr>
       </w:pPr>
       <w:r>
-        <w:t xml:space="preserve">Promptable extraction is now a measured component instead of only a CLI feature. Text-bearing prompts currently carry the semantic routing load, while point-only and box-only prompts still need better disambiguation.</w:t>
+        <w:t xml:space="preserve">Promptable extraction is now a measured component instead of only a CLI feature. Geometry-only point and box queries now use semantic fallback only when the initial selected layer misses the cue, while text-only prompting still has one repeated-label ambiguity in the measured synthetic set.</w:t>
       </w:r>
     </w:p>
     <w:p>
@@ -13353,7 +13353,7 @@
         </w:numPr>
       </w:pPr>
       <w:r>
-        <w:t xml:space="preserve">point-only and box-only prompt-routing ambiguity;</w:t>
+        <w:t xml:space="preserve">text-only repeated-label ambiguity without a geometric cue;</w:t>
       </w:r>
     </w:p>
     <w:p>
@@ -16432,7 +16432,7 @@
               <w:jc w:val="right"/>
             </w:pPr>
             <w:r>
-              <w:t xml:space="preserve">1.0000</w:t>
+              <w:t xml:space="preserve">0.9000</w:t>
             </w:r>
           </w:p>
         </w:tc>
@@ -16615,31 +16615,31 @@
               <w:jc w:val="right"/>
             </w:pPr>
             <w:r>
-              <w:t xml:space="preserve">0.0000</w:t>
-            </w:r>
-          </w:p>
-        </w:tc>
-        <w:tc>
-          <w:tcPr/>
-          <w:p>
-            <w:pPr>
-              <w:pStyle w:val="Compact"/>
-              <w:jc w:val="right"/>
-            </w:pPr>
-            <w:r>
-              <w:t xml:space="preserve">0.7719</w:t>
-            </w:r>
-          </w:p>
-        </w:tc>
-        <w:tc>
-          <w:tcPr/>
-          <w:p>
-            <w:pPr>
-              <w:pStyle w:val="Compact"/>
-              <w:jc w:val="right"/>
-            </w:pPr>
-            <w:r>
-              <w:t xml:space="preserve">0.0521</w:t>
+              <w:t xml:space="preserve">1.0000</w:t>
+            </w:r>
+          </w:p>
+        </w:tc>
+        <w:tc>
+          <w:tcPr/>
+          <w:p>
+            <w:pPr>
+              <w:pStyle w:val="Compact"/>
+              <w:jc w:val="right"/>
+            </w:pPr>
+            <w:r>
+              <w:t xml:space="preserve">0.8121</w:t>
+            </w:r>
+          </w:p>
+        </w:tc>
+        <w:tc>
+          <w:tcPr/>
+          <w:p>
+            <w:pPr>
+              <w:pStyle w:val="Compact"/>
+              <w:jc w:val="right"/>
+            </w:pPr>
+            <w:r>
+              <w:t xml:space="preserve">0.0409</w:t>
             </w:r>
           </w:p>
         </w:tc>
@@ -16676,31 +16676,31 @@
               <w:jc w:val="right"/>
             </w:pPr>
             <w:r>
-              <w:t xml:space="preserve">0.0000</w:t>
-            </w:r>
-          </w:p>
-        </w:tc>
-        <w:tc>
-          <w:tcPr/>
-          <w:p>
-            <w:pPr>
-              <w:pStyle w:val="Compact"/>
-              <w:jc w:val="right"/>
-            </w:pPr>
-            <w:r>
-              <w:t xml:space="preserve">0.7719</w:t>
-            </w:r>
-          </w:p>
-        </w:tc>
-        <w:tc>
-          <w:tcPr/>
-          <w:p>
-            <w:pPr>
-              <w:pStyle w:val="Compact"/>
-              <w:jc w:val="right"/>
-            </w:pPr>
-            <w:r>
-              <w:t xml:space="preserve">0.0521</w:t>
+              <w:t xml:space="preserve">1.0000</w:t>
+            </w:r>
+          </w:p>
+        </w:tc>
+        <w:tc>
+          <w:tcPr/>
+          <w:p>
+            <w:pPr>
+              <w:pStyle w:val="Compact"/>
+              <w:jc w:val="right"/>
+            </w:pPr>
+            <w:r>
+              <w:t xml:space="preserve">0.8121</w:t>
+            </w:r>
+          </w:p>
+        </w:tc>
+        <w:tc>
+          <w:tcPr/>
+          <w:p>
+            <w:pPr>
+              <w:pStyle w:val="Compact"/>
+              <w:jc w:val="right"/>
+            </w:pPr>
+            <w:r>
+              <w:t xml:space="preserve">0.0409</w:t>
             </w:r>
           </w:p>
         </w:tc>
@@ -16723,7 +16723,22 @@
         </w:numPr>
       </w:pPr>
       <w:r>
-        <w:t xml:space="preserve">text-bearing prompts identify the intended semantic target on the measured synthetic set;</w:t>
+        <w:t xml:space="preserve">text-bearing prompts identify the intended semantic target in</w:t>
+      </w:r>
+      <w:r>
+        <w:t xml:space="preserve"> </w:t>
+      </w:r>
+      <w:r>
+        <w:rPr>
+          <w:rStyle w:val="VerbatimChar"/>
+        </w:rPr>
+        <w:t xml:space="preserve">9/10</w:t>
+      </w:r>
+      <w:r>
+        <w:t xml:space="preserve"> </w:t>
+      </w:r>
+      <w:r>
+        <w:t xml:space="preserve">measured synthetic queries under the stricter semantic-plus-overlap hit definition;</w:t>
       </w:r>
     </w:p>
     <w:p>
@@ -16735,7 +16750,22 @@
         </w:numPr>
       </w:pPr>
       <w:r>
-        <w:t xml:space="preserve">combined text + point and text + box queries improve overlap over text-only prompting while preserving the same semantic hit rate;</w:t>
+        <w:t xml:space="preserve">combined text + point and text + box queries recover the repeated-label miss while preserving</w:t>
+      </w:r>
+      <w:r>
+        <w:t xml:space="preserve"> </w:t>
+      </w:r>
+      <w:r>
+        <w:rPr>
+          <w:rStyle w:val="VerbatimChar"/>
+        </w:rPr>
+        <w:t xml:space="preserve">1.0000</w:t>
+      </w:r>
+      <w:r>
+        <w:t xml:space="preserve"> </w:t>
+      </w:r>
+      <w:r>
+        <w:t xml:space="preserve">hit rate;</w:t>
       </w:r>
     </w:p>
     <w:p>
@@ -16747,7 +16777,7 @@
         </w:numPr>
       </w:pPr>
       <w:r>
-        <w:t xml:space="preserve">point-only and box-only prompts still achieve high overlap while missing the semantic target, so the remaining limitation is routing without a text label rather than matte stability.</w:t>
+        <w:t xml:space="preserve">point-only and box-only prompts now use geometry-derived semantic fallback only when the first selected layer misses the cue, so the remaining limitation is repeated text labels without geometry rather than geometry-only routing.</w:t>
       </w:r>
     </w:p>
     <w:bookmarkEnd w:id="177"/>
@@ -16826,7 +16856,7 @@
               <w:jc w:val="right"/>
             </w:pPr>
             <w:r>
-              <w:t xml:space="preserve">0.1126</w:t>
+              <w:t xml:space="preserve">0.1102</w:t>
             </w:r>
           </w:p>
         </w:tc>
@@ -16901,7 +16931,7 @@
               <w:jc w:val="right"/>
             </w:pPr>
             <w:r>
-              <w:t xml:space="preserve">56.2836</w:t>
+              <w:t xml:space="preserve">56.4872</w:t>
             </w:r>
           </w:p>
         </w:tc>
@@ -16973,7 +17003,22 @@
         </w:numPr>
       </w:pPr>
       <w:r>
-        <w:t xml:space="preserve">an optional BiRefNet-based matting backend is integrated in the codebase, but the shipped benchmark config keeps the heuristic alpha path because it remains the stronger measured default on this synthetic set;</w:t>
+        <w:t xml:space="preserve">an optional BiRefNet-based matting backend is integrated in the codebase, and the refreshed benchmark confirms the</w:t>
+      </w:r>
+      <w:r>
+        <w:t xml:space="preserve"> </w:t>
+      </w:r>
+      <w:r>
+        <w:rPr>
+          <w:rStyle w:val="VerbatimChar"/>
+        </w:rPr>
+        <w:t xml:space="preserve">auto</w:t>
+      </w:r>
+      <w:r>
+        <w:t xml:space="preserve"> </w:t>
+      </w:r>
+      <w:r>
+        <w:t xml:space="preserve">default improves alpha MAE and recomposition PSNR on this synthetic set;</w:t>
       </w:r>
     </w:p>
     <w:p>

</xml_diff>

<commit_message>
docs: embed complete figure pack
</commit_message>
<xml_diff>
--- a/docs/final_report_pack/LayerForge_X_Final_Report_2026_04_22.docx
+++ b/docs/final_report_pack/LayerForge_X_Final_Report_2026_04_22.docx
@@ -10573,7 +10573,7 @@
     </w:p>
     <w:bookmarkEnd w:id="121"/>
     <w:bookmarkEnd w:id="122"/>
-    <w:bookmarkStart w:id="156" w:name="results"/>
+    <w:bookmarkStart w:id="185" w:name="results"/>
     <w:p>
       <w:pPr>
         <w:pStyle w:val="Heading1"/>
@@ -10982,12 +10982,500 @@
     </w:p>
     <w:bookmarkEnd w:id="146"/>
     <w:bookmarkEnd w:id="147"/>
-    <w:bookmarkStart w:id="154" w:name="main-measured-summary"/>
+    <w:bookmarkStart w:id="176" w:name="complete-figure-pack"/>
     <w:p>
       <w:pPr>
         <w:pStyle w:val="Heading3"/>
       </w:pPr>
       <w:r>
+        <w:t xml:space="preserve">Complete figure pack</w:t>
+      </w:r>
+    </w:p>
+    <w:p>
+      <w:pPr>
+        <w:pStyle w:val="FirstParagraph"/>
+      </w:pPr>
+      <w:r>
+        <w:t xml:space="preserve">The six hero figures above are the primary reading sequence. The supporting diagnostics below complete the</w:t>
+      </w:r>
+      <w:r>
+        <w:t xml:space="preserve"> </w:t>
+      </w:r>
+      <w:r>
+        <w:rPr>
+          <w:rStyle w:val="VerbatimChar"/>
+        </w:rPr>
+        <w:t xml:space="preserve">docs/figures/</w:t>
+      </w:r>
+      <w:r>
+        <w:t xml:space="preserve"> </w:t>
+      </w:r>
+      <w:r>
+        <w:t xml:space="preserve">pack used by this report and are generated from the same measured artifacts.</w:t>
+      </w:r>
+    </w:p>
+    <w:bookmarkStart w:id="151" w:name="layer-stack-decomposition-comparison"/>
+    <w:p>
+      <w:pPr>
+        <w:pStyle w:val="Heading4"/>
+      </w:pPr>
+      <w:r>
+        <w:t xml:space="preserve">Layer-stack decomposition comparison</w:t>
+      </w:r>
+    </w:p>
+    <w:p>
+      <w:pPr>
+        <w:pStyle w:val="CaptionedFigure"/>
+      </w:pPr>
+      <w:r>
+        <w:drawing>
+          <wp:inline>
+            <wp:extent cx="5334000" cy="3433053"/>
+            <wp:effectExtent b="0" l="0" r="0" t="0"/>
+            <wp:docPr descr="Truck layer stack comparison" title="" id="149" name="Picture"/>
+            <a:graphic>
+              <a:graphicData uri="http://schemas.openxmlformats.org/drawingml/2006/picture">
+                <pic:pic>
+                  <pic:nvPicPr>
+                    <pic:cNvPr descr="../figures/truck_layer_stack_comparison.png" id="150" name="Picture"/>
+                    <pic:cNvPicPr>
+                      <a:picLocks noChangeArrowheads="1" noChangeAspect="1"/>
+                    </pic:cNvPicPr>
+                  </pic:nvPicPr>
+                  <pic:blipFill>
+                    <a:blip r:embed="rId148"/>
+                    <a:stretch>
+                      <a:fillRect/>
+                    </a:stretch>
+                  </pic:blipFill>
+                  <pic:spPr bwMode="auto">
+                    <a:xfrm>
+                      <a:off x="0" y="0"/>
+                      <a:ext cx="5334000" cy="3433053"/>
+                    </a:xfrm>
+                    <a:prstGeom prst="rect">
+                      <a:avLst/>
+                    </a:prstGeom>
+                    <a:noFill/>
+                    <a:ln w="9525">
+                      <a:noFill/>
+                      <a:headEnd/>
+                      <a:tailEnd/>
+                    </a:ln>
+                  </pic:spPr>
+                </pic:pic>
+              </a:graphicData>
+            </a:graphic>
+          </wp:inline>
+        </w:drawing>
+      </w:r>
+    </w:p>
+    <w:p>
+      <w:pPr>
+        <w:pStyle w:val="ImageCaption"/>
+      </w:pPr>
+      <w:r>
+        <w:t xml:space="preserve">Truck layer stack comparison</w:t>
+      </w:r>
+    </w:p>
+    <w:bookmarkEnd w:id="151"/>
+    <w:bookmarkStart w:id="155" w:name="truck-metric-comparison"/>
+    <w:p>
+      <w:pPr>
+        <w:pStyle w:val="Heading4"/>
+      </w:pPr>
+      <w:r>
+        <w:t xml:space="preserve">Truck metric comparison</w:t>
+      </w:r>
+    </w:p>
+    <w:p>
+      <w:pPr>
+        <w:pStyle w:val="CaptionedFigure"/>
+      </w:pPr>
+      <w:r>
+        <w:drawing>
+          <wp:inline>
+            <wp:extent cx="5334000" cy="2051538"/>
+            <wp:effectExtent b="0" l="0" r="0" t="0"/>
+            <wp:docPr descr="Truck metric comparison" title="" id="153" name="Picture"/>
+            <a:graphic>
+              <a:graphicData uri="http://schemas.openxmlformats.org/drawingml/2006/picture">
+                <pic:pic>
+                  <pic:nvPicPr>
+                    <pic:cNvPr descr="../figures/truck_metrics_comparison.png" id="154" name="Picture"/>
+                    <pic:cNvPicPr>
+                      <a:picLocks noChangeArrowheads="1" noChangeAspect="1"/>
+                    </pic:cNvPicPr>
+                  </pic:nvPicPr>
+                  <pic:blipFill>
+                    <a:blip r:embed="rId152"/>
+                    <a:stretch>
+                      <a:fillRect/>
+                    </a:stretch>
+                  </pic:blipFill>
+                  <pic:spPr bwMode="auto">
+                    <a:xfrm>
+                      <a:off x="0" y="0"/>
+                      <a:ext cx="5334000" cy="2051538"/>
+                    </a:xfrm>
+                    <a:prstGeom prst="rect">
+                      <a:avLst/>
+                    </a:prstGeom>
+                    <a:noFill/>
+                    <a:ln w="9525">
+                      <a:noFill/>
+                      <a:headEnd/>
+                      <a:tailEnd/>
+                    </a:ln>
+                  </pic:spPr>
+                </pic:pic>
+              </a:graphicData>
+            </a:graphic>
+          </wp:inline>
+        </w:drawing>
+      </w:r>
+    </w:p>
+    <w:p>
+      <w:pPr>
+        <w:pStyle w:val="ImageCaption"/>
+      </w:pPr>
+      <w:r>
+        <w:t xml:space="preserve">Truck metric comparison</w:t>
+      </w:r>
+    </w:p>
+    <w:bookmarkEnd w:id="155"/>
+    <w:bookmarkStart w:id="159" w:name="prompt-conditioning-ablation"/>
+    <w:p>
+      <w:pPr>
+        <w:pStyle w:val="Heading4"/>
+      </w:pPr>
+      <w:r>
+        <w:t xml:space="preserve">Prompt-conditioning ablation</w:t>
+      </w:r>
+    </w:p>
+    <w:p>
+      <w:pPr>
+        <w:pStyle w:val="CaptionedFigure"/>
+      </w:pPr>
+      <w:r>
+        <w:drawing>
+          <wp:inline>
+            <wp:extent cx="5334000" cy="2110153"/>
+            <wp:effectExtent b="0" l="0" r="0" t="0"/>
+            <wp:docPr descr="Truck prompt ablation" title="" id="157" name="Picture"/>
+            <a:graphic>
+              <a:graphicData uri="http://schemas.openxmlformats.org/drawingml/2006/picture">
+                <pic:pic>
+                  <pic:nvPicPr>
+                    <pic:cNvPr descr="../figures/truck_prompt_ablation.png" id="158" name="Picture"/>
+                    <pic:cNvPicPr>
+                      <a:picLocks noChangeArrowheads="1" noChangeAspect="1"/>
+                    </pic:cNvPicPr>
+                  </pic:nvPicPr>
+                  <pic:blipFill>
+                    <a:blip r:embed="rId156"/>
+                    <a:stretch>
+                      <a:fillRect/>
+                    </a:stretch>
+                  </pic:blipFill>
+                  <pic:spPr bwMode="auto">
+                    <a:xfrm>
+                      <a:off x="0" y="0"/>
+                      <a:ext cx="5334000" cy="2110153"/>
+                    </a:xfrm>
+                    <a:prstGeom prst="rect">
+                      <a:avLst/>
+                    </a:prstGeom>
+                    <a:noFill/>
+                    <a:ln w="9525">
+                      <a:noFill/>
+                      <a:headEnd/>
+                      <a:tailEnd/>
+                    </a:ln>
+                  </pic:spPr>
+                </pic:pic>
+              </a:graphicData>
+            </a:graphic>
+          </wp:inline>
+        </w:drawing>
+      </w:r>
+    </w:p>
+    <w:p>
+      <w:pPr>
+        <w:pStyle w:val="ImageCaption"/>
+      </w:pPr>
+      <w:r>
+        <w:t xml:space="preserve">Truck prompt ablation</w:t>
+      </w:r>
+    </w:p>
+    <w:bookmarkEnd w:id="159"/>
+    <w:bookmarkStart w:id="163" w:name="synthetic-ordering-ablation"/>
+    <w:p>
+      <w:pPr>
+        <w:pStyle w:val="Heading4"/>
+      </w:pPr>
+      <w:r>
+        <w:t xml:space="preserve">Synthetic ordering ablation</w:t>
+      </w:r>
+    </w:p>
+    <w:p>
+      <w:pPr>
+        <w:pStyle w:val="CaptionedFigure"/>
+      </w:pPr>
+      <w:r>
+        <w:drawing>
+          <wp:inline>
+            <wp:extent cx="5334000" cy="2227384"/>
+            <wp:effectExtent b="0" l="0" r="0" t="0"/>
+            <wp:docPr descr="Synthetic ordering ablation" title="" id="161" name="Picture"/>
+            <a:graphic>
+              <a:graphicData uri="http://schemas.openxmlformats.org/drawingml/2006/picture">
+                <pic:pic>
+                  <pic:nvPicPr>
+                    <pic:cNvPr descr="../figures/synthetic_ordering_ablation.png" id="162" name="Picture"/>
+                    <pic:cNvPicPr>
+                      <a:picLocks noChangeArrowheads="1" noChangeAspect="1"/>
+                    </pic:cNvPicPr>
+                  </pic:nvPicPr>
+                  <pic:blipFill>
+                    <a:blip r:embed="rId160"/>
+                    <a:stretch>
+                      <a:fillRect/>
+                    </a:stretch>
+                  </pic:blipFill>
+                  <pic:spPr bwMode="auto">
+                    <a:xfrm>
+                      <a:off x="0" y="0"/>
+                      <a:ext cx="5334000" cy="2227384"/>
+                    </a:xfrm>
+                    <a:prstGeom prst="rect">
+                      <a:avLst/>
+                    </a:prstGeom>
+                    <a:noFill/>
+                    <a:ln w="9525">
+                      <a:noFill/>
+                      <a:headEnd/>
+                      <a:tailEnd/>
+                    </a:ln>
+                  </pic:spPr>
+                </pic:pic>
+              </a:graphicData>
+            </a:graphic>
+          </wp:inline>
+        </w:drawing>
+      </w:r>
+    </w:p>
+    <w:p>
+      <w:pPr>
+        <w:pStyle w:val="ImageCaption"/>
+      </w:pPr>
+      <w:r>
+        <w:t xml:space="preserve">Synthetic ordering ablation</w:t>
+      </w:r>
+    </w:p>
+    <w:bookmarkEnd w:id="163"/>
+    <w:bookmarkStart w:id="167" w:name="qualitative-gallery"/>
+    <w:p>
+      <w:pPr>
+        <w:pStyle w:val="Heading4"/>
+      </w:pPr>
+      <w:r>
+        <w:t xml:space="preserve">Qualitative gallery</w:t>
+      </w:r>
+    </w:p>
+    <w:p>
+      <w:pPr>
+        <w:pStyle w:val="CaptionedFigure"/>
+      </w:pPr>
+      <w:r>
+        <w:drawing>
+          <wp:inline>
+            <wp:extent cx="5334000" cy="4522304"/>
+            <wp:effectExtent b="0" l="0" r="0" t="0"/>
+            <wp:docPr descr="Qualitative gallery" title="" id="165" name="Picture"/>
+            <a:graphic>
+              <a:graphicData uri="http://schemas.openxmlformats.org/drawingml/2006/picture">
+                <pic:pic>
+                  <pic:nvPicPr>
+                    <pic:cNvPr descr="../figures/qualitative_gallery.png" id="166" name="Picture"/>
+                    <pic:cNvPicPr>
+                      <a:picLocks noChangeArrowheads="1" noChangeAspect="1"/>
+                    </pic:cNvPicPr>
+                  </pic:nvPicPr>
+                  <pic:blipFill>
+                    <a:blip r:embed="rId164"/>
+                    <a:stretch>
+                      <a:fillRect/>
+                    </a:stretch>
+                  </pic:blipFill>
+                  <pic:spPr bwMode="auto">
+                    <a:xfrm>
+                      <a:off x="0" y="0"/>
+                      <a:ext cx="5334000" cy="4522304"/>
+                    </a:xfrm>
+                    <a:prstGeom prst="rect">
+                      <a:avLst/>
+                    </a:prstGeom>
+                    <a:noFill/>
+                    <a:ln w="9525">
+                      <a:noFill/>
+                      <a:headEnd/>
+                      <a:tailEnd/>
+                    </a:ln>
+                  </pic:spPr>
+                </pic:pic>
+              </a:graphicData>
+            </a:graphic>
+          </wp:inline>
+        </w:drawing>
+      </w:r>
+    </w:p>
+    <w:p>
+      <w:pPr>
+        <w:pStyle w:val="ImageCaption"/>
+      </w:pPr>
+      <w:r>
+        <w:t xml:space="preserve">Qualitative gallery</w:t>
+      </w:r>
+    </w:p>
+    <w:bookmarkEnd w:id="167"/>
+    <w:bookmarkStart w:id="171" w:name="public-segmentation-benchmark"/>
+    <w:p>
+      <w:pPr>
+        <w:pStyle w:val="Heading4"/>
+      </w:pPr>
+      <w:r>
+        <w:t xml:space="preserve">Public segmentation benchmark</w:t>
+      </w:r>
+    </w:p>
+    <w:p>
+      <w:pPr>
+        <w:pStyle w:val="CaptionedFigure"/>
+      </w:pPr>
+      <w:r>
+        <w:drawing>
+          <wp:inline>
+            <wp:extent cx="5334000" cy="2227384"/>
+            <wp:effectExtent b="0" l="0" r="0" t="0"/>
+            <wp:docPr descr="Public benchmark comparison" title="" id="169" name="Picture"/>
+            <a:graphic>
+              <a:graphicData uri="http://schemas.openxmlformats.org/drawingml/2006/picture">
+                <pic:pic>
+                  <pic:nvPicPr>
+                    <pic:cNvPr descr="../figures/public_benchmark_comparison.png" id="170" name="Picture"/>
+                    <pic:cNvPicPr>
+                      <a:picLocks noChangeArrowheads="1" noChangeAspect="1"/>
+                    </pic:cNvPicPr>
+                  </pic:nvPicPr>
+                  <pic:blipFill>
+                    <a:blip r:embed="rId168"/>
+                    <a:stretch>
+                      <a:fillRect/>
+                    </a:stretch>
+                  </pic:blipFill>
+                  <pic:spPr bwMode="auto">
+                    <a:xfrm>
+                      <a:off x="0" y="0"/>
+                      <a:ext cx="5334000" cy="2227384"/>
+                    </a:xfrm>
+                    <a:prstGeom prst="rect">
+                      <a:avLst/>
+                    </a:prstGeom>
+                    <a:noFill/>
+                    <a:ln w="9525">
+                      <a:noFill/>
+                      <a:headEnd/>
+                      <a:tailEnd/>
+                    </a:ln>
+                  </pic:spPr>
+                </pic:pic>
+              </a:graphicData>
+            </a:graphic>
+          </wp:inline>
+        </w:drawing>
+      </w:r>
+    </w:p>
+    <w:p>
+      <w:pPr>
+        <w:pStyle w:val="ImageCaption"/>
+      </w:pPr>
+      <w:r>
+        <w:t xml:space="preserve">Public benchmark comparison</w:t>
+      </w:r>
+    </w:p>
+    <w:bookmarkEnd w:id="171"/>
+    <w:bookmarkStart w:id="175" w:name="public-depth-benchmark"/>
+    <w:p>
+      <w:pPr>
+        <w:pStyle w:val="Heading4"/>
+      </w:pPr>
+      <w:r>
+        <w:t xml:space="preserve">Public depth benchmark</w:t>
+      </w:r>
+    </w:p>
+    <w:p>
+      <w:pPr>
+        <w:pStyle w:val="CaptionedFigure"/>
+      </w:pPr>
+      <w:r>
+        <w:drawing>
+          <wp:inline>
+            <wp:extent cx="5334000" cy="3253153"/>
+            <wp:effectExtent b="0" l="0" r="0" t="0"/>
+            <wp:docPr descr="Public depth comparison" title="" id="173" name="Picture"/>
+            <a:graphic>
+              <a:graphicData uri="http://schemas.openxmlformats.org/drawingml/2006/picture">
+                <pic:pic>
+                  <pic:nvPicPr>
+                    <pic:cNvPr descr="../figures/public_depth_comparison.png" id="174" name="Picture"/>
+                    <pic:cNvPicPr>
+                      <a:picLocks noChangeArrowheads="1" noChangeAspect="1"/>
+                    </pic:cNvPicPr>
+                  </pic:nvPicPr>
+                  <pic:blipFill>
+                    <a:blip r:embed="rId172"/>
+                    <a:stretch>
+                      <a:fillRect/>
+                    </a:stretch>
+                  </pic:blipFill>
+                  <pic:spPr bwMode="auto">
+                    <a:xfrm>
+                      <a:off x="0" y="0"/>
+                      <a:ext cx="5334000" cy="3253153"/>
+                    </a:xfrm>
+                    <a:prstGeom prst="rect">
+                      <a:avLst/>
+                    </a:prstGeom>
+                    <a:noFill/>
+                    <a:ln w="9525">
+                      <a:noFill/>
+                      <a:headEnd/>
+                      <a:tailEnd/>
+                    </a:ln>
+                  </pic:spPr>
+                </pic:pic>
+              </a:graphicData>
+            </a:graphic>
+          </wp:inline>
+        </w:drawing>
+      </w:r>
+    </w:p>
+    <w:p>
+      <w:pPr>
+        <w:pStyle w:val="ImageCaption"/>
+      </w:pPr>
+      <w:r>
+        <w:t xml:space="preserve">Public depth comparison</w:t>
+      </w:r>
+    </w:p>
+    <w:bookmarkEnd w:id="175"/>
+    <w:bookmarkEnd w:id="176"/>
+    <w:bookmarkStart w:id="183" w:name="main-measured-summary"/>
+    <w:p>
+      <w:pPr>
+        <w:pStyle w:val="Heading3"/>
+      </w:pPr>
+      <w:r>
         <w:t xml:space="preserve">Main measured summary</w:t>
       </w:r>
     </w:p>
@@ -11059,7 +11547,7 @@
         <w:t xml:space="preserve">= the same imported four-layer stack exported in graph order.</w:t>
       </w:r>
     </w:p>
-    <w:bookmarkStart w:id="148" w:name="five-image-qwen-raw-versus-hybrid-review"/>
+    <w:bookmarkStart w:id="177" w:name="five-image-qwen-raw-versus-hybrid-review"/>
     <w:p>
       <w:pPr>
         <w:pStyle w:val="Heading4"/>
@@ -11306,8 +11794,8 @@
         </w:tc>
       </w:tr>
     </w:tbl>
-    <w:bookmarkEnd w:id="148"/>
-    <w:bookmarkStart w:id="149" w:name="associated-effect-demo"/>
+    <w:bookmarkEnd w:id="177"/>
+    <w:bookmarkStart w:id="178" w:name="associated-effect-demo"/>
     <w:p>
       <w:pPr>
         <w:pStyle w:val="Heading4"/>
@@ -11430,8 +11918,8 @@
         </w:tc>
       </w:tr>
     </w:tbl>
-    <w:bookmarkEnd w:id="149"/>
-    <w:bookmarkStart w:id="150" w:name="X0e9e3f984752b954aaab98655e513f4cd780034"/>
+    <w:bookmarkEnd w:id="178"/>
+    <w:bookmarkStart w:id="179" w:name="X0e9e3f984752b954aaab98655e513f4cd780034"/>
     <w:p>
       <w:pPr>
         <w:pStyle w:val="Heading4"/>
@@ -11831,8 +12319,8 @@
         </w:tc>
       </w:tr>
     </w:tbl>
-    <w:bookmarkEnd w:id="150"/>
-    <w:bookmarkStart w:id="151" w:name="five-image-editability-suite"/>
+    <w:bookmarkEnd w:id="179"/>
+    <w:bookmarkStart w:id="180" w:name="five-image-editability-suite"/>
     <w:p>
       <w:pPr>
         <w:pStyle w:val="Heading4"/>
@@ -12477,8 +12965,8 @@
         </w:tc>
       </w:tr>
     </w:tbl>
-    <w:bookmarkEnd w:id="151"/>
-    <w:bookmarkStart w:id="152" w:name="promptable-extraction-benchmark-1"/>
+    <w:bookmarkEnd w:id="180"/>
+    <w:bookmarkStart w:id="181" w:name="promptable-extraction-benchmark-1"/>
     <w:p>
       <w:pPr>
         <w:pStyle w:val="Heading4"/>
@@ -12870,8 +13358,8 @@
         </w:tc>
       </w:tr>
     </w:tbl>
-    <w:bookmarkEnd w:id="152"/>
-    <w:bookmarkStart w:id="153" w:name="transparent-benchmark"/>
+    <w:bookmarkEnd w:id="181"/>
+    <w:bookmarkStart w:id="182" w:name="transparent-benchmark"/>
     <w:p>
       <w:pPr>
         <w:pStyle w:val="Heading4"/>
@@ -13044,9 +13532,9 @@
         </w:tc>
       </w:tr>
     </w:tbl>
-    <w:bookmarkEnd w:id="153"/>
-    <w:bookmarkEnd w:id="154"/>
-    <w:bookmarkStart w:id="155" w:name="interpretation"/>
+    <w:bookmarkEnd w:id="182"/>
+    <w:bookmarkEnd w:id="183"/>
+    <w:bookmarkStart w:id="184" w:name="interpretation"/>
     <w:p>
       <w:pPr>
         <w:pStyle w:val="Heading3"/>
@@ -13223,9 +13711,9 @@
         <w:t xml:space="preserve">The intrinsic export path is present as a Retinex-style stretch module. The new intrinsic demo figure should be read as evidence of exported appearance factors for recolouring-style edits, not as a standalone intrinsic benchmark.</w:t>
       </w:r>
     </w:p>
-    <w:bookmarkEnd w:id="155"/>
-    <w:bookmarkEnd w:id="156"/>
-    <w:bookmarkStart w:id="157" w:name="discussion"/>
+    <w:bookmarkEnd w:id="184"/>
+    <w:bookmarkEnd w:id="185"/>
+    <w:bookmarkStart w:id="186" w:name="discussion"/>
     <w:p>
       <w:pPr>
         <w:pStyle w:val="Heading1"/>
@@ -13242,8 +13730,8 @@
         <w:t xml:space="preserve">The current results do not support the claim that LayerForge-X universally exceeds generative decomposers on raw pixel fidelity. The defensible claim is narrower and more important: native, generative, and recursive decompositions are normalized into a single editable graph representation with auditable metrics and exportable structure. Qwen remains the appropriate generative RGBA baseline, while LayerForge-X is most compelling as a graph-aware, benchmarkable, editability-oriented complement to that frontier.</w:t>
       </w:r>
     </w:p>
-    <w:bookmarkEnd w:id="157"/>
-    <w:bookmarkStart w:id="158" w:name="limitations"/>
+    <w:bookmarkEnd w:id="186"/>
+    <w:bookmarkStart w:id="187" w:name="limitations"/>
     <w:p>
       <w:pPr>
         <w:pStyle w:val="Heading1"/>
@@ -13368,8 +13856,8 @@
         <w:t xml:space="preserve">transparent-layer recovery that is still approximate rather than generative.</w:t>
       </w:r>
     </w:p>
-    <w:bookmarkEnd w:id="158"/>
-    <w:bookmarkStart w:id="159" w:name="conclusion"/>
+    <w:bookmarkEnd w:id="187"/>
+    <w:bookmarkStart w:id="188" w:name="conclusion"/>
     <w:p>
       <w:pPr>
         <w:pStyle w:val="Heading1"/>
@@ -13386,8 +13874,8 @@
         <w:t xml:space="preserve">LayerForge-X is best interpreted as a self-evaluating layer-representation system rather than a simple decomposition script. It produces native graph layers, enriches frontier RGBA layers, runs recursive peeling, measures editability, benchmarks prompt extraction, approximates transparent recovery, and exports a canonical DALG manifest. That combination defines the central project contribution.</w:t>
       </w:r>
     </w:p>
-    <w:bookmarkEnd w:id="159"/>
-    <w:bookmarkStart w:id="160" w:name="references"/>
+    <w:bookmarkEnd w:id="188"/>
+    <w:bookmarkStart w:id="189" w:name="references"/>
     <w:p>
       <w:pPr>
         <w:pStyle w:val="Heading1"/>
@@ -13804,8 +14292,8 @@
         <w:t xml:space="preserve">arXiv preprint, 2025.</w:t>
       </w:r>
     </w:p>
-    <w:bookmarkEnd w:id="160"/>
-    <w:bookmarkStart w:id="172" w:name="appendix-a-artifact-map"/>
+    <w:bookmarkEnd w:id="189"/>
+    <w:bookmarkStart w:id="201" w:name="appendix-a-artifact-map"/>
     <w:p>
       <w:pPr>
         <w:pStyle w:val="Heading1"/>
@@ -13830,7 +14318,7 @@
           <w:numId w:val="1019"/>
         </w:numPr>
       </w:pPr>
-      <w:hyperlink r:id="rId161">
+      <w:hyperlink r:id="rId190">
         <w:r>
           <w:rPr>
             <w:rStyle w:val="Hyperlink"/>
@@ -13847,7 +14335,7 @@
           <w:numId w:val="1019"/>
         </w:numPr>
       </w:pPr>
-      <w:hyperlink r:id="rId162">
+      <w:hyperlink r:id="rId191">
         <w:r>
           <w:rPr>
             <w:rStyle w:val="Hyperlink"/>
@@ -13864,7 +14352,7 @@
           <w:numId w:val="1019"/>
         </w:numPr>
       </w:pPr>
-      <w:hyperlink r:id="rId163">
+      <w:hyperlink r:id="rId192">
         <w:r>
           <w:rPr>
             <w:rStyle w:val="Hyperlink"/>
@@ -13881,7 +14369,7 @@
           <w:numId w:val="1019"/>
         </w:numPr>
       </w:pPr>
-      <w:hyperlink r:id="rId164">
+      <w:hyperlink r:id="rId193">
         <w:r>
           <w:rPr>
             <w:rStyle w:val="Hyperlink"/>
@@ -13898,7 +14386,7 @@
           <w:numId w:val="1019"/>
         </w:numPr>
       </w:pPr>
-      <w:hyperlink r:id="rId165">
+      <w:hyperlink r:id="rId194">
         <w:r>
           <w:rPr>
             <w:rStyle w:val="Hyperlink"/>
@@ -13915,7 +14403,7 @@
           <w:numId w:val="1019"/>
         </w:numPr>
       </w:pPr>
-      <w:hyperlink r:id="rId166">
+      <w:hyperlink r:id="rId195">
         <w:r>
           <w:rPr>
             <w:rStyle w:val="Hyperlink"/>
@@ -13932,7 +14420,7 @@
           <w:numId w:val="1019"/>
         </w:numPr>
       </w:pPr>
-      <w:hyperlink r:id="rId167">
+      <w:hyperlink r:id="rId196">
         <w:r>
           <w:rPr>
             <w:rStyle w:val="Hyperlink"/>
@@ -13949,7 +14437,7 @@
           <w:numId w:val="1019"/>
         </w:numPr>
       </w:pPr>
-      <w:hyperlink r:id="rId168">
+      <w:hyperlink r:id="rId197">
         <w:r>
           <w:rPr>
             <w:rStyle w:val="Hyperlink"/>
@@ -13966,7 +14454,7 @@
           <w:numId w:val="1019"/>
         </w:numPr>
       </w:pPr>
-      <w:hyperlink r:id="rId169">
+      <w:hyperlink r:id="rId198">
         <w:r>
           <w:rPr>
             <w:rStyle w:val="Hyperlink"/>
@@ -13983,7 +14471,7 @@
           <w:numId w:val="1019"/>
         </w:numPr>
       </w:pPr>
-      <w:hyperlink r:id="rId170">
+      <w:hyperlink r:id="rId199">
         <w:r>
           <w:rPr>
             <w:rStyle w:val="Hyperlink"/>
@@ -14000,7 +14488,7 @@
           <w:numId w:val="1019"/>
         </w:numPr>
       </w:pPr>
-      <w:hyperlink r:id="rId171">
+      <w:hyperlink r:id="rId200">
         <w:r>
           <w:rPr>
             <w:rStyle w:val="Hyperlink"/>
@@ -14009,8 +14497,8 @@
         </w:r>
       </w:hyperlink>
     </w:p>
-    <w:bookmarkEnd w:id="172"/>
-    <w:bookmarkStart w:id="188" w:name="appendix-b-extended-tables-and-ablations"/>
+    <w:bookmarkEnd w:id="201"/>
+    <w:bookmarkStart w:id="217" w:name="appendix-b-extended-tables-and-ablations"/>
     <w:p>
       <w:pPr>
         <w:pStyle w:val="Heading1"/>
@@ -14027,7 +14515,7 @@
         <w:t xml:space="preserve">This appendix collects the extended quantitative tables, measured ablations, and failure-taxonomy material that support the main report.</w:t>
       </w:r>
     </w:p>
-    <w:bookmarkStart w:id="173" w:name="b.1-completed-runs-snapshot"/>
+    <w:bookmarkStart w:id="202" w:name="b.1-completed-runs-snapshot"/>
     <w:p>
       <w:pPr>
         <w:pStyle w:val="Heading2"/>
@@ -14444,8 +14932,8 @@
         <w:t xml:space="preserve">system rather than further tuning of the deterministic baseline.</w:t>
       </w:r>
     </w:p>
-    <w:bookmarkEnd w:id="173"/>
-    <w:bookmarkStart w:id="174" w:name="b.2-frontier-candidate-bank-review"/>
+    <w:bookmarkEnd w:id="202"/>
+    <w:bookmarkStart w:id="203" w:name="b.2-frontier-candidate-bank-review"/>
     <w:p>
       <w:pPr>
         <w:pStyle w:val="Heading2"/>
@@ -14943,8 +15431,8 @@
         <w:t xml:space="preserve">remains the compact generative baseline, but it is no longer the strongest editable representation once structure and editability are scored explicitly.</w:t>
       </w:r>
     </w:p>
-    <w:bookmarkEnd w:id="174"/>
-    <w:bookmarkStart w:id="175" w:name="b.3-editability-suite"/>
+    <w:bookmarkEnd w:id="203"/>
+    <w:bookmarkStart w:id="204" w:name="b.3-editability-suite"/>
     <w:p>
       <w:pPr>
         <w:pStyle w:val="Heading2"/>
@@ -15662,8 +16150,8 @@
         <w:t xml:space="preserve">the hybrid rows currently post the strongest edit-success scores because imported generative stacks combined with explicit LayerForge graph metadata remain easy to move, recolor, and remove cleanly.</w:t>
       </w:r>
     </w:p>
-    <w:bookmarkEnd w:id="175"/>
-    <w:bookmarkStart w:id="176" w:name="b.3a-qwen-layer-count-sweep"/>
+    <w:bookmarkEnd w:id="204"/>
+    <w:bookmarkStart w:id="205" w:name="b.3a-qwen-layer-count-sweep"/>
     <w:p>
       <w:pPr>
         <w:pStyle w:val="Heading2"/>
@@ -16304,8 +16792,8 @@
         <w:t xml:space="preserve">eight-layer runs fall back to the selected external visual stack when graph order is materially worse.</w:t>
       </w:r>
     </w:p>
-    <w:bookmarkEnd w:id="176"/>
-    <w:bookmarkStart w:id="177" w:name="b.4-promptable-extraction-benchmark"/>
+    <w:bookmarkEnd w:id="205"/>
+    <w:bookmarkStart w:id="206" w:name="b.4-promptable-extraction-benchmark"/>
     <w:p>
       <w:pPr>
         <w:pStyle w:val="Heading2"/>
@@ -16780,8 +17268,8 @@
         <w:t xml:space="preserve">point-only and box-only prompts now use geometry-derived semantic fallback only when the first selected layer misses the cue, so the remaining limitation is repeated text labels without geometry rather than geometry-only routing.</w:t>
       </w:r>
     </w:p>
-    <w:bookmarkEnd w:id="177"/>
-    <w:bookmarkStart w:id="178" w:name="b.5-transparent-benchmark"/>
+    <w:bookmarkEnd w:id="206"/>
+    <w:bookmarkStart w:id="207" w:name="b.5-transparent-benchmark"/>
     <w:p>
       <w:pPr>
         <w:pStyle w:val="Heading2"/>
@@ -17033,8 +17521,8 @@
         <w:t xml:space="preserve">the prototype is strongest on flare-like overlays and weakest on the semi-transparent panel variant.</w:t>
       </w:r>
     </w:p>
-    <w:bookmarkEnd w:id="178"/>
-    <w:bookmarkStart w:id="181" w:name="b.6-main-ablation-matrix"/>
+    <w:bookmarkEnd w:id="207"/>
+    <w:bookmarkStart w:id="210" w:name="b.6-main-ablation-matrix"/>
     <w:p>
       <w:pPr>
         <w:pStyle w:val="Heading2"/>
@@ -17043,7 +17531,7 @@
         <w:t xml:space="preserve">B.6 Main ablation matrix</w:t>
       </w:r>
     </w:p>
-    <w:bookmarkStart w:id="179" w:name="b.6.1-core-ladder"/>
+    <w:bookmarkStart w:id="208" w:name="b.6.1-core-ladder"/>
     <w:p>
       <w:pPr>
         <w:pStyle w:val="Heading3"/>
@@ -17547,8 +18035,8 @@
         </w:tc>
       </w:tr>
     </w:tbl>
-    <w:bookmarkEnd w:id="179"/>
-    <w:bookmarkStart w:id="180" w:name="b.6.2-full-system-extensions"/>
+    <w:bookmarkEnd w:id="208"/>
+    <w:bookmarkStart w:id="209" w:name="b.6.2-full-system-extensions"/>
     <w:p>
       <w:pPr>
         <w:pStyle w:val="Heading3"/>
@@ -17848,9 +18336,9 @@
         </w:tc>
       </w:tr>
     </w:tbl>
-    <w:bookmarkEnd w:id="180"/>
-    <w:bookmarkEnd w:id="181"/>
-    <w:bookmarkStart w:id="184" w:name="b.7-literature-comparison"/>
+    <w:bookmarkEnd w:id="209"/>
+    <w:bookmarkEnd w:id="210"/>
+    <w:bookmarkStart w:id="213" w:name="b.7-literature-comparison"/>
     <w:p>
       <w:pPr>
         <w:pStyle w:val="Heading2"/>
@@ -17859,7 +18347,7 @@
         <w:t xml:space="preserve">B.7 Literature comparison</w:t>
       </w:r>
     </w:p>
-    <w:bookmarkStart w:id="182" w:name="b.7.1-representation-oriented-baselines"/>
+    <w:bookmarkStart w:id="211" w:name="b.7.1-representation-oriented-baselines"/>
     <w:p>
       <w:pPr>
         <w:pStyle w:val="Heading3"/>
@@ -18246,8 +18734,8 @@
         </w:tc>
       </w:tr>
     </w:tbl>
-    <w:bookmarkEnd w:id="182"/>
-    <w:bookmarkStart w:id="183" w:name="b.7.2-layered-editing-baselines"/>
+    <w:bookmarkEnd w:id="211"/>
+    <w:bookmarkStart w:id="212" w:name="b.7.2-layered-editing-baselines"/>
     <w:p>
       <w:pPr>
         <w:pStyle w:val="Heading3"/>
@@ -18635,9 +19123,9 @@
         </w:tc>
       </w:tr>
     </w:tbl>
-    <w:bookmarkEnd w:id="183"/>
-    <w:bookmarkEnd w:id="184"/>
-    <w:bookmarkStart w:id="185" w:name="b.8-dataset-coverage"/>
+    <w:bookmarkEnd w:id="212"/>
+    <w:bookmarkEnd w:id="213"/>
+    <w:bookmarkStart w:id="214" w:name="b.8-dataset-coverage"/>
     <w:p>
       <w:pPr>
         <w:pStyle w:val="Heading2"/>
@@ -19077,8 +19565,8 @@
         </w:tc>
       </w:tr>
     </w:tbl>
-    <w:bookmarkEnd w:id="185"/>
-    <w:bookmarkStart w:id="186" w:name="b.9-failure-taxonomy"/>
+    <w:bookmarkEnd w:id="214"/>
+    <w:bookmarkStart w:id="215" w:name="b.9-failure-taxonomy"/>
     <w:p>
       <w:pPr>
         <w:pStyle w:val="Heading2"/>
@@ -19564,8 +20052,8 @@
         </w:tc>
       </w:tr>
     </w:tbl>
-    <w:bookmarkEnd w:id="186"/>
-    <w:bookmarkStart w:id="187" w:name="b.10-intrinsic-export-snapshot"/>
+    <w:bookmarkEnd w:id="215"/>
+    <w:bookmarkStart w:id="216" w:name="b.10-intrinsic-export-snapshot"/>
     <w:p>
       <w:pPr>
         <w:pStyle w:val="Heading2"/>
@@ -19803,9 +20291,9 @@
         <w:t xml:space="preserve">.</w:t>
       </w:r>
     </w:p>
-    <w:bookmarkEnd w:id="187"/>
-    <w:bookmarkEnd w:id="188"/>
-    <w:bookmarkStart w:id="189" w:name="appendix-c-command-log"/>
+    <w:bookmarkEnd w:id="216"/>
+    <w:bookmarkEnd w:id="217"/>
+    <w:bookmarkStart w:id="218" w:name="appendix-c-command-log"/>
     <w:p>
       <w:pPr>
         <w:pStyle w:val="Heading1"/>
@@ -19824,7 +20312,7 @@
       <w:r>
         <w:t xml:space="preserve"> </w:t>
       </w:r>
-      <w:hyperlink r:id="rId165">
+      <w:hyperlink r:id="rId194">
         <w:r>
           <w:rPr>
             <w:rStyle w:val="Hyperlink"/>
@@ -19942,8 +20430,8 @@
         <w:t xml:space="preserve">Those commands connect the final report outputs to the compact JSON summaries and generated figures that are stored in the report-artifact set.</w:t>
       </w:r>
     </w:p>
-    <w:bookmarkEnd w:id="189"/>
-    <w:bookmarkStart w:id="190" w:name="appendix-d-extra-literature-notes"/>
+    <w:bookmarkEnd w:id="218"/>
+    <w:bookmarkStart w:id="219" w:name="appendix-d-extra-literature-notes"/>
     <w:p>
       <w:pPr>
         <w:pStyle w:val="Heading1"/>
@@ -20055,7 +20543,7 @@
         <w:t xml:space="preserve">, but the report body and the references section are the intended citation surface for submission.</w:t>
       </w:r>
     </w:p>
-    <w:bookmarkEnd w:id="190"/>
+    <w:bookmarkEnd w:id="219"/>
     <w:sectPr/>
   </w:body>
 </w:document>

</xml_diff>

<commit_message>
docs: modernize report figures
</commit_message>
<xml_diff>
--- a/docs/final_report_pack/LayerForge_X_Final_Report_2026_04_22.docx
+++ b/docs/final_report_pack/LayerForge_X_Final_Report_2026_04_22.docx
@@ -10672,7 +10672,7 @@
       <w:r>
         <w:drawing>
           <wp:inline>
-            <wp:extent cx="5334000" cy="2637692"/>
+            <wp:extent cx="5334000" cy="3048000"/>
             <wp:effectExtent b="0" l="0" r="0" t="0"/>
             <wp:docPr descr="Frontier review" title="" id="128" name="Picture"/>
             <a:graphic>
@@ -10693,7 +10693,7 @@
                   <pic:spPr bwMode="auto">
                     <a:xfrm>
                       <a:off x="0" y="0"/>
-                      <a:ext cx="5334000" cy="2637692"/>
+                      <a:ext cx="5334000" cy="3048000"/>
                     </a:xfrm>
                     <a:prstGeom prst="rect">
                       <a:avLst/>

</xml_diff>